<commit_message>
Add data attributes, constraints and system characteristics to requirements
</commit_message>
<xml_diff>
--- a/docs/requirements/technical_requirements.docx
+++ b/docs/requirements/technical_requirements.docx
@@ -468,6 +468,1199 @@
         <w:pStyle w:val="Heading1"/>
       </w:pPr>
       <w:r>
+        <w:t>Атрибуты данных</w:t>
+      </w:r>
+    </w:p>
+    <w:p>
+      <w:pPr>
+        <w:pStyle w:val="Heading2"/>
+        <w:ind w:left="360"/>
+      </w:pPr>
+      <w:r>
+        <w:t>Сущность «Категория»</w:t>
+      </w:r>
+    </w:p>
+    <w:p>
+      <w:pPr>
+        <w:jc w:val="both"/>
+      </w:pPr>
+      <w:r>
+        <w:t>Обязательность ниже относится к сохранённой записи. Системные поля заполняет приложение; пользователь вводит название и необязательное описание.</w:t>
+      </w:r>
+    </w:p>
+    <w:tbl>
+      <w:tblPr>
+        <w:tblStyle w:val="TableGrid"/>
+        <w:tblW w:type="auto" w:w="0"/>
+        <w:tblLayout w:type="fixed"/>
+        <w:tblLook w:firstColumn="1" w:firstRow="1" w:lastColumn="0" w:lastRow="0" w:noHBand="0" w:noVBand="1" w:val="04A0"/>
+      </w:tblPr>
+      <w:tblGrid>
+        <w:gridCol w:w="2381"/>
+        <w:gridCol w:w="1984"/>
+        <w:gridCol w:w="4661"/>
+      </w:tblGrid>
+      <w:tr>
+        <w:trPr>
+          <w:cantSplit/>
+          <w:tblHeader/>
+        </w:trPr>
+        <w:tc>
+          <w:tcPr>
+            <w:tcW w:type="dxa" w:w="2381"/>
+            <w:vAlign w:val="center"/>
+          </w:tcPr>
+          <w:p>
+            <w:pPr>
+              <w:keepNext/>
+              <w:spacing w:line="240" w:lineRule="auto" w:before="0" w:after="60"/>
+              <w:jc w:val="left"/>
+            </w:pPr>
+            <w:r>
+              <w:rPr>
+                <w:rFonts w:ascii="Times New Roman" w:hAnsi="Times New Roman"/>
+                <w:b/>
+                <w:sz w:val="24"/>
+              </w:rPr>
+              <w:t>Атрибут</w:t>
+            </w:r>
+          </w:p>
+        </w:tc>
+        <w:tc>
+          <w:tcPr>
+            <w:tcW w:type="dxa" w:w="1984"/>
+            <w:vAlign w:val="center"/>
+          </w:tcPr>
+          <w:p>
+            <w:pPr>
+              <w:keepNext/>
+              <w:spacing w:line="240" w:lineRule="auto" w:before="0" w:after="60"/>
+              <w:jc w:val="left"/>
+            </w:pPr>
+            <w:r>
+              <w:rPr>
+                <w:rFonts w:ascii="Times New Roman" w:hAnsi="Times New Roman"/>
+                <w:b/>
+                <w:sz w:val="24"/>
+              </w:rPr>
+              <w:t>Тип и обязательность</w:t>
+            </w:r>
+          </w:p>
+        </w:tc>
+        <w:tc>
+          <w:tcPr>
+            <w:tcW w:type="dxa" w:w="4661"/>
+            <w:vAlign w:val="center"/>
+          </w:tcPr>
+          <w:p>
+            <w:pPr>
+              <w:keepNext/>
+              <w:spacing w:line="240" w:lineRule="auto" w:before="0" w:after="60"/>
+              <w:jc w:val="left"/>
+            </w:pPr>
+            <w:r>
+              <w:rPr>
+                <w:rFonts w:ascii="Times New Roman" w:hAnsi="Times New Roman"/>
+                <w:b/>
+                <w:sz w:val="24"/>
+              </w:rPr>
+              <w:t>Назначение и правила</w:t>
+            </w:r>
+          </w:p>
+        </w:tc>
+      </w:tr>
+      <w:tr>
+        <w:trPr>
+          <w:cantSplit/>
+        </w:trPr>
+        <w:tc>
+          <w:tcPr>
+            <w:tcW w:type="dxa" w:w="2381"/>
+            <w:vAlign w:val="center"/>
+          </w:tcPr>
+          <w:p>
+            <w:pPr>
+              <w:keepNext w:val="0"/>
+              <w:spacing w:line="240" w:lineRule="auto" w:before="0" w:after="60"/>
+              <w:jc w:val="left"/>
+            </w:pPr>
+            <w:r>
+              <w:rPr>
+                <w:rFonts w:ascii="Times New Roman" w:hAnsi="Times New Roman"/>
+                <w:b/>
+                <w:sz w:val="24"/>
+              </w:rPr>
+              <w:t>id</w:t>
+            </w:r>
+          </w:p>
+        </w:tc>
+        <w:tc>
+          <w:tcPr>
+            <w:tcW w:type="dxa" w:w="1984"/>
+            <w:vAlign w:val="center"/>
+          </w:tcPr>
+          <w:p>
+            <w:pPr>
+              <w:keepNext w:val="0"/>
+              <w:spacing w:line="240" w:lineRule="auto" w:before="0" w:after="60"/>
+              <w:jc w:val="left"/>
+            </w:pPr>
+            <w:r>
+              <w:rPr>
+                <w:rFonts w:ascii="Times New Roman" w:hAnsi="Times New Roman"/>
+                <w:b w:val="0"/>
+                <w:sz w:val="24"/>
+              </w:rPr>
+              <w:t>Целое; обязательный, системный</w:t>
+            </w:r>
+          </w:p>
+        </w:tc>
+        <w:tc>
+          <w:tcPr>
+            <w:tcW w:type="dxa" w:w="4661"/>
+            <w:vAlign w:val="center"/>
+          </w:tcPr>
+          <w:p>
+            <w:pPr>
+              <w:keepNext w:val="0"/>
+              <w:spacing w:line="240" w:lineRule="auto" w:before="0" w:after="60"/>
+              <w:jc w:val="left"/>
+            </w:pPr>
+            <w:r>
+              <w:rPr>
+                <w:rFonts w:ascii="Times New Roman" w:hAnsi="Times New Roman"/>
+                <w:b w:val="0"/>
+                <w:sz w:val="24"/>
+              </w:rPr>
+              <w:t>Первичный ключ. Создаётся базой и используется в связях и адресах. Через API не редактируется.</w:t>
+            </w:r>
+          </w:p>
+        </w:tc>
+      </w:tr>
+      <w:tr>
+        <w:trPr>
+          <w:cantSplit/>
+        </w:trPr>
+        <w:tc>
+          <w:tcPr>
+            <w:tcW w:type="dxa" w:w="2381"/>
+            <w:vAlign w:val="center"/>
+          </w:tcPr>
+          <w:p>
+            <w:pPr>
+              <w:keepNext w:val="0"/>
+              <w:spacing w:line="240" w:lineRule="auto" w:before="0" w:after="60"/>
+              <w:jc w:val="left"/>
+            </w:pPr>
+            <w:r>
+              <w:rPr>
+                <w:rFonts w:ascii="Times New Roman" w:hAnsi="Times New Roman"/>
+                <w:b/>
+                <w:sz w:val="24"/>
+              </w:rPr>
+              <w:t>name</w:t>
+            </w:r>
+          </w:p>
+        </w:tc>
+        <w:tc>
+          <w:tcPr>
+            <w:tcW w:type="dxa" w:w="1984"/>
+            <w:vAlign w:val="center"/>
+          </w:tcPr>
+          <w:p>
+            <w:pPr>
+              <w:keepNext w:val="0"/>
+              <w:spacing w:line="240" w:lineRule="auto" w:before="0" w:after="60"/>
+              <w:jc w:val="left"/>
+            </w:pPr>
+            <w:r>
+              <w:rPr>
+                <w:rFonts w:ascii="Times New Roman" w:hAnsi="Times New Roman"/>
+                <w:b w:val="0"/>
+                <w:sz w:val="24"/>
+              </w:rPr>
+              <w:t>Строка; обязательный</w:t>
+            </w:r>
+          </w:p>
+        </w:tc>
+        <w:tc>
+          <w:tcPr>
+            <w:tcW w:type="dxa" w:w="4661"/>
+            <w:vAlign w:val="center"/>
+          </w:tcPr>
+          <w:p>
+            <w:pPr>
+              <w:keepNext w:val="0"/>
+              <w:spacing w:line="240" w:lineRule="auto" w:before="0" w:after="60"/>
+              <w:jc w:val="left"/>
+            </w:pPr>
+            <w:r>
+              <w:rPr>
+                <w:rFonts w:ascii="Times New Roman" w:hAnsi="Times New Roman"/>
+                <w:b w:val="0"/>
+                <w:sz w:val="24"/>
+              </w:rPr>
+              <w:t>Название категории: 1–100 символов после удаления крайних пробелов.</w:t>
+            </w:r>
+          </w:p>
+        </w:tc>
+      </w:tr>
+      <w:tr>
+        <w:trPr>
+          <w:cantSplit/>
+        </w:trPr>
+        <w:tc>
+          <w:tcPr>
+            <w:tcW w:type="dxa" w:w="2381"/>
+            <w:vAlign w:val="center"/>
+          </w:tcPr>
+          <w:p>
+            <w:pPr>
+              <w:keepNext w:val="0"/>
+              <w:spacing w:line="240" w:lineRule="auto" w:before="0" w:after="60"/>
+              <w:jc w:val="left"/>
+            </w:pPr>
+            <w:r>
+              <w:rPr>
+                <w:rFonts w:ascii="Times New Roman" w:hAnsi="Times New Roman"/>
+                <w:b/>
+                <w:sz w:val="24"/>
+              </w:rPr>
+              <w:t>name_normalized</w:t>
+            </w:r>
+          </w:p>
+        </w:tc>
+        <w:tc>
+          <w:tcPr>
+            <w:tcW w:type="dxa" w:w="1984"/>
+            <w:vAlign w:val="center"/>
+          </w:tcPr>
+          <w:p>
+            <w:pPr>
+              <w:keepNext w:val="0"/>
+              <w:spacing w:line="240" w:lineRule="auto" w:before="0" w:after="60"/>
+              <w:jc w:val="left"/>
+            </w:pPr>
+            <w:r>
+              <w:rPr>
+                <w:rFonts w:ascii="Times New Roman" w:hAnsi="Times New Roman"/>
+                <w:b w:val="0"/>
+                <w:sz w:val="24"/>
+              </w:rPr>
+              <w:t>Текст; обязательный, служебный</w:t>
+            </w:r>
+          </w:p>
+        </w:tc>
+        <w:tc>
+          <w:tcPr>
+            <w:tcW w:type="dxa" w:w="4661"/>
+            <w:vAlign w:val="center"/>
+          </w:tcPr>
+          <w:p>
+            <w:pPr>
+              <w:keepNext w:val="0"/>
+              <w:spacing w:line="240" w:lineRule="auto" w:before="0" w:after="60"/>
+              <w:jc w:val="left"/>
+            </w:pPr>
+            <w:r>
+              <w:rPr>
+                <w:rFonts w:ascii="Times New Roman" w:hAnsi="Times New Roman"/>
+                <w:b w:val="0"/>
+                <w:sz w:val="24"/>
+              </w:rPr>
+              <w:t>Нормализованное название для сравнения. Непустое и уникальное; обновляется при переименовании.</w:t>
+            </w:r>
+          </w:p>
+        </w:tc>
+      </w:tr>
+      <w:tr>
+        <w:trPr>
+          <w:cantSplit/>
+        </w:trPr>
+        <w:tc>
+          <w:tcPr>
+            <w:tcW w:type="dxa" w:w="2381"/>
+            <w:vAlign w:val="center"/>
+          </w:tcPr>
+          <w:p>
+            <w:pPr>
+              <w:keepNext w:val="0"/>
+              <w:spacing w:line="240" w:lineRule="auto" w:before="0" w:after="60"/>
+              <w:jc w:val="left"/>
+            </w:pPr>
+            <w:r>
+              <w:rPr>
+                <w:rFonts w:ascii="Times New Roman" w:hAnsi="Times New Roman"/>
+                <w:b/>
+                <w:sz w:val="24"/>
+              </w:rPr>
+              <w:t>description</w:t>
+            </w:r>
+          </w:p>
+        </w:tc>
+        <w:tc>
+          <w:tcPr>
+            <w:tcW w:type="dxa" w:w="1984"/>
+            <w:vAlign w:val="center"/>
+          </w:tcPr>
+          <w:p>
+            <w:pPr>
+              <w:keepNext w:val="0"/>
+              <w:spacing w:line="240" w:lineRule="auto" w:before="0" w:after="60"/>
+              <w:jc w:val="left"/>
+            </w:pPr>
+            <w:r>
+              <w:rPr>
+                <w:rFonts w:ascii="Times New Roman" w:hAnsi="Times New Roman"/>
+                <w:b w:val="0"/>
+                <w:sz w:val="24"/>
+              </w:rPr>
+              <w:t>Текст или NULL; необязательный</w:t>
+            </w:r>
+          </w:p>
+        </w:tc>
+        <w:tc>
+          <w:tcPr>
+            <w:tcW w:type="dxa" w:w="4661"/>
+            <w:vAlign w:val="center"/>
+          </w:tcPr>
+          <w:p>
+            <w:pPr>
+              <w:keepNext w:val="0"/>
+              <w:spacing w:line="240" w:lineRule="auto" w:before="0" w:after="60"/>
+              <w:jc w:val="left"/>
+            </w:pPr>
+            <w:r>
+              <w:rPr>
+                <w:rFonts w:ascii="Times New Roman" w:hAnsi="Times New Roman"/>
+                <w:b w:val="0"/>
+                <w:sz w:val="24"/>
+              </w:rPr>
+              <w:t>Описание категории, до 2000 символов. Пустой текст после удаления крайних пробелов сохраняется как NULL.</w:t>
+            </w:r>
+          </w:p>
+        </w:tc>
+      </w:tr>
+    </w:tbl>
+    <w:p>
+      <w:pPr>
+        <w:spacing w:after="0"/>
+      </w:pPr>
+    </w:p>
+    <w:p>
+      <w:pPr>
+        <w:pStyle w:val="Heading2"/>
+        <w:ind w:left="360"/>
+      </w:pPr>
+      <w:r>
+        <w:t>Сущность «Товар»</w:t>
+      </w:r>
+    </w:p>
+    <w:tbl>
+      <w:tblPr>
+        <w:tblStyle w:val="TableGrid"/>
+        <w:tblW w:type="auto" w:w="0"/>
+        <w:tblLayout w:type="fixed"/>
+        <w:tblLook w:firstColumn="1" w:firstRow="1" w:lastColumn="0" w:lastRow="0" w:noHBand="0" w:noVBand="1" w:val="04A0"/>
+      </w:tblPr>
+      <w:tblGrid>
+        <w:gridCol w:w="2381"/>
+        <w:gridCol w:w="1984"/>
+        <w:gridCol w:w="4661"/>
+      </w:tblGrid>
+      <w:tr>
+        <w:trPr>
+          <w:cantSplit/>
+          <w:tblHeader/>
+        </w:trPr>
+        <w:tc>
+          <w:tcPr>
+            <w:tcW w:type="dxa" w:w="2381"/>
+            <w:vAlign w:val="center"/>
+          </w:tcPr>
+          <w:p>
+            <w:pPr>
+              <w:keepNext/>
+              <w:spacing w:line="240" w:lineRule="auto" w:before="0" w:after="60"/>
+              <w:jc w:val="left"/>
+            </w:pPr>
+            <w:r>
+              <w:rPr>
+                <w:rFonts w:ascii="Times New Roman" w:hAnsi="Times New Roman"/>
+                <w:b/>
+                <w:sz w:val="24"/>
+              </w:rPr>
+              <w:t>Атрибут</w:t>
+            </w:r>
+          </w:p>
+        </w:tc>
+        <w:tc>
+          <w:tcPr>
+            <w:tcW w:type="dxa" w:w="1984"/>
+            <w:vAlign w:val="center"/>
+          </w:tcPr>
+          <w:p>
+            <w:pPr>
+              <w:keepNext/>
+              <w:spacing w:line="240" w:lineRule="auto" w:before="0" w:after="60"/>
+              <w:jc w:val="left"/>
+            </w:pPr>
+            <w:r>
+              <w:rPr>
+                <w:rFonts w:ascii="Times New Roman" w:hAnsi="Times New Roman"/>
+                <w:b/>
+                <w:sz w:val="24"/>
+              </w:rPr>
+              <w:t>Тип и обязательность</w:t>
+            </w:r>
+          </w:p>
+        </w:tc>
+        <w:tc>
+          <w:tcPr>
+            <w:tcW w:type="dxa" w:w="4661"/>
+            <w:vAlign w:val="center"/>
+          </w:tcPr>
+          <w:p>
+            <w:pPr>
+              <w:keepNext/>
+              <w:spacing w:line="240" w:lineRule="auto" w:before="0" w:after="60"/>
+              <w:jc w:val="left"/>
+            </w:pPr>
+            <w:r>
+              <w:rPr>
+                <w:rFonts w:ascii="Times New Roman" w:hAnsi="Times New Roman"/>
+                <w:b/>
+                <w:sz w:val="24"/>
+              </w:rPr>
+              <w:t>Назначение и правила</w:t>
+            </w:r>
+          </w:p>
+        </w:tc>
+      </w:tr>
+      <w:tr>
+        <w:trPr>
+          <w:cantSplit/>
+        </w:trPr>
+        <w:tc>
+          <w:tcPr>
+            <w:tcW w:type="dxa" w:w="2381"/>
+            <w:vAlign w:val="center"/>
+          </w:tcPr>
+          <w:p>
+            <w:pPr>
+              <w:keepNext w:val="0"/>
+              <w:spacing w:line="240" w:lineRule="auto" w:before="0" w:after="60"/>
+              <w:jc w:val="left"/>
+            </w:pPr>
+            <w:r>
+              <w:rPr>
+                <w:rFonts w:ascii="Times New Roman" w:hAnsi="Times New Roman"/>
+                <w:b/>
+                <w:sz w:val="24"/>
+              </w:rPr>
+              <w:t>id</w:t>
+            </w:r>
+          </w:p>
+        </w:tc>
+        <w:tc>
+          <w:tcPr>
+            <w:tcW w:type="dxa" w:w="1984"/>
+            <w:vAlign w:val="center"/>
+          </w:tcPr>
+          <w:p>
+            <w:pPr>
+              <w:keepNext w:val="0"/>
+              <w:spacing w:line="240" w:lineRule="auto" w:before="0" w:after="60"/>
+              <w:jc w:val="left"/>
+            </w:pPr>
+            <w:r>
+              <w:rPr>
+                <w:rFonts w:ascii="Times New Roman" w:hAnsi="Times New Roman"/>
+                <w:b w:val="0"/>
+                <w:sz w:val="24"/>
+              </w:rPr>
+              <w:t>Целое; обязательный, системный</w:t>
+            </w:r>
+          </w:p>
+        </w:tc>
+        <w:tc>
+          <w:tcPr>
+            <w:tcW w:type="dxa" w:w="4661"/>
+            <w:vAlign w:val="center"/>
+          </w:tcPr>
+          <w:p>
+            <w:pPr>
+              <w:keepNext w:val="0"/>
+              <w:spacing w:line="240" w:lineRule="auto" w:before="0" w:after="60"/>
+              <w:jc w:val="left"/>
+            </w:pPr>
+            <w:r>
+              <w:rPr>
+                <w:rFonts w:ascii="Times New Roman" w:hAnsi="Times New Roman"/>
+                <w:b w:val="0"/>
+                <w:sz w:val="24"/>
+              </w:rPr>
+              <w:t>Первичный ключ. Назначается базой; при редактировании товара сохраняется.</w:t>
+            </w:r>
+          </w:p>
+        </w:tc>
+      </w:tr>
+      <w:tr>
+        <w:trPr>
+          <w:cantSplit/>
+        </w:trPr>
+        <w:tc>
+          <w:tcPr>
+            <w:tcW w:type="dxa" w:w="2381"/>
+            <w:vAlign w:val="center"/>
+          </w:tcPr>
+          <w:p>
+            <w:pPr>
+              <w:keepNext w:val="0"/>
+              <w:spacing w:line="240" w:lineRule="auto" w:before="0" w:after="60"/>
+              <w:jc w:val="left"/>
+            </w:pPr>
+            <w:r>
+              <w:rPr>
+                <w:rFonts w:ascii="Times New Roman" w:hAnsi="Times New Roman"/>
+                <w:b/>
+                <w:sz w:val="24"/>
+              </w:rPr>
+              <w:t>name</w:t>
+            </w:r>
+          </w:p>
+        </w:tc>
+        <w:tc>
+          <w:tcPr>
+            <w:tcW w:type="dxa" w:w="1984"/>
+            <w:vAlign w:val="center"/>
+          </w:tcPr>
+          <w:p>
+            <w:pPr>
+              <w:keepNext w:val="0"/>
+              <w:spacing w:line="240" w:lineRule="auto" w:before="0" w:after="60"/>
+              <w:jc w:val="left"/>
+            </w:pPr>
+            <w:r>
+              <w:rPr>
+                <w:rFonts w:ascii="Times New Roman" w:hAnsi="Times New Roman"/>
+                <w:b w:val="0"/>
+                <w:sz w:val="24"/>
+              </w:rPr>
+              <w:t>Строка; обязательный</w:t>
+            </w:r>
+          </w:p>
+        </w:tc>
+        <w:tc>
+          <w:tcPr>
+            <w:tcW w:type="dxa" w:w="4661"/>
+            <w:vAlign w:val="center"/>
+          </w:tcPr>
+          <w:p>
+            <w:pPr>
+              <w:keepNext w:val="0"/>
+              <w:spacing w:line="240" w:lineRule="auto" w:before="0" w:after="60"/>
+              <w:jc w:val="left"/>
+            </w:pPr>
+            <w:r>
+              <w:rPr>
+                <w:rFonts w:ascii="Times New Roman" w:hAnsi="Times New Roman"/>
+                <w:b w:val="0"/>
+                <w:sz w:val="24"/>
+              </w:rPr>
+              <w:t>Название товара: 1–200 символов после удаления крайних пробелов. Совпадения названий разрешены.</w:t>
+            </w:r>
+          </w:p>
+        </w:tc>
+      </w:tr>
+      <w:tr>
+        <w:trPr>
+          <w:cantSplit/>
+        </w:trPr>
+        <w:tc>
+          <w:tcPr>
+            <w:tcW w:type="dxa" w:w="2381"/>
+            <w:vAlign w:val="center"/>
+          </w:tcPr>
+          <w:p>
+            <w:pPr>
+              <w:keepNext w:val="0"/>
+              <w:spacing w:line="240" w:lineRule="auto" w:before="0" w:after="60"/>
+              <w:jc w:val="left"/>
+            </w:pPr>
+            <w:r>
+              <w:rPr>
+                <w:rFonts w:ascii="Times New Roman" w:hAnsi="Times New Roman"/>
+                <w:b/>
+                <w:sz w:val="24"/>
+              </w:rPr>
+              <w:t>name_normalized</w:t>
+            </w:r>
+          </w:p>
+        </w:tc>
+        <w:tc>
+          <w:tcPr>
+            <w:tcW w:type="dxa" w:w="1984"/>
+            <w:vAlign w:val="center"/>
+          </w:tcPr>
+          <w:p>
+            <w:pPr>
+              <w:keepNext w:val="0"/>
+              <w:spacing w:line="240" w:lineRule="auto" w:before="0" w:after="60"/>
+              <w:jc w:val="left"/>
+            </w:pPr>
+            <w:r>
+              <w:rPr>
+                <w:rFonts w:ascii="Times New Roman" w:hAnsi="Times New Roman"/>
+                <w:b w:val="0"/>
+                <w:sz w:val="24"/>
+              </w:rPr>
+              <w:t>Текст; обязательный, служебный</w:t>
+            </w:r>
+          </w:p>
+        </w:tc>
+        <w:tc>
+          <w:tcPr>
+            <w:tcW w:type="dxa" w:w="4661"/>
+            <w:vAlign w:val="center"/>
+          </w:tcPr>
+          <w:p>
+            <w:pPr>
+              <w:keepNext w:val="0"/>
+              <w:spacing w:line="240" w:lineRule="auto" w:before="0" w:after="60"/>
+              <w:jc w:val="left"/>
+            </w:pPr>
+            <w:r>
+              <w:rPr>
+                <w:rFonts w:ascii="Times New Roman" w:hAnsi="Times New Roman"/>
+                <w:b w:val="0"/>
+                <w:sz w:val="24"/>
+              </w:rPr>
+              <w:t>Нормализованное непустое название для поиска без учёта регистра.</w:t>
+            </w:r>
+          </w:p>
+        </w:tc>
+      </w:tr>
+      <w:tr>
+        <w:trPr>
+          <w:cantSplit/>
+        </w:trPr>
+        <w:tc>
+          <w:tcPr>
+            <w:tcW w:type="dxa" w:w="2381"/>
+            <w:vAlign w:val="center"/>
+          </w:tcPr>
+          <w:p>
+            <w:pPr>
+              <w:keepNext w:val="0"/>
+              <w:spacing w:line="240" w:lineRule="auto" w:before="0" w:after="60"/>
+              <w:jc w:val="left"/>
+            </w:pPr>
+            <w:r>
+              <w:rPr>
+                <w:rFonts w:ascii="Times New Roman" w:hAnsi="Times New Roman"/>
+                <w:b/>
+                <w:sz w:val="24"/>
+              </w:rPr>
+              <w:t>sku</w:t>
+            </w:r>
+          </w:p>
+        </w:tc>
+        <w:tc>
+          <w:tcPr>
+            <w:tcW w:type="dxa" w:w="1984"/>
+            <w:vAlign w:val="center"/>
+          </w:tcPr>
+          <w:p>
+            <w:pPr>
+              <w:keepNext w:val="0"/>
+              <w:spacing w:line="240" w:lineRule="auto" w:before="0" w:after="60"/>
+              <w:jc w:val="left"/>
+            </w:pPr>
+            <w:r>
+              <w:rPr>
+                <w:rFonts w:ascii="Times New Roman" w:hAnsi="Times New Roman"/>
+                <w:b w:val="0"/>
+                <w:sz w:val="24"/>
+              </w:rPr>
+              <w:t>Строка; обязательный</w:t>
+            </w:r>
+          </w:p>
+        </w:tc>
+        <w:tc>
+          <w:tcPr>
+            <w:tcW w:type="dxa" w:w="4661"/>
+            <w:vAlign w:val="center"/>
+          </w:tcPr>
+          <w:p>
+            <w:pPr>
+              <w:keepNext w:val="0"/>
+              <w:spacing w:line="240" w:lineRule="auto" w:before="0" w:after="60"/>
+              <w:jc w:val="left"/>
+            </w:pPr>
+            <w:r>
+              <w:rPr>
+                <w:rFonts w:ascii="Times New Roman" w:hAnsi="Times New Roman"/>
+                <w:b w:val="0"/>
+                <w:sz w:val="24"/>
+              </w:rPr>
+              <w:t>Уникальный артикул: 1–64 латинские буквы, цифры, дефисы или подчёркивания. Хранится в верхнем регистре.</w:t>
+            </w:r>
+          </w:p>
+        </w:tc>
+      </w:tr>
+      <w:tr>
+        <w:trPr>
+          <w:cantSplit/>
+        </w:trPr>
+        <w:tc>
+          <w:tcPr>
+            <w:tcW w:type="dxa" w:w="2381"/>
+            <w:vAlign w:val="center"/>
+          </w:tcPr>
+          <w:p>
+            <w:pPr>
+              <w:keepNext w:val="0"/>
+              <w:spacing w:line="240" w:lineRule="auto" w:before="0" w:after="60"/>
+              <w:jc w:val="left"/>
+            </w:pPr>
+            <w:r>
+              <w:rPr>
+                <w:rFonts w:ascii="Times New Roman" w:hAnsi="Times New Roman"/>
+                <w:b/>
+                <w:sz w:val="24"/>
+              </w:rPr>
+              <w:t>description</w:t>
+            </w:r>
+          </w:p>
+        </w:tc>
+        <w:tc>
+          <w:tcPr>
+            <w:tcW w:type="dxa" w:w="1984"/>
+            <w:vAlign w:val="center"/>
+          </w:tcPr>
+          <w:p>
+            <w:pPr>
+              <w:keepNext w:val="0"/>
+              <w:spacing w:line="240" w:lineRule="auto" w:before="0" w:after="60"/>
+              <w:jc w:val="left"/>
+            </w:pPr>
+            <w:r>
+              <w:rPr>
+                <w:rFonts w:ascii="Times New Roman" w:hAnsi="Times New Roman"/>
+                <w:b w:val="0"/>
+                <w:sz w:val="24"/>
+              </w:rPr>
+              <w:t>Текст или NULL; необязательный</w:t>
+            </w:r>
+          </w:p>
+        </w:tc>
+        <w:tc>
+          <w:tcPr>
+            <w:tcW w:type="dxa" w:w="4661"/>
+            <w:vAlign w:val="center"/>
+          </w:tcPr>
+          <w:p>
+            <w:pPr>
+              <w:keepNext w:val="0"/>
+              <w:spacing w:line="240" w:lineRule="auto" w:before="0" w:after="60"/>
+              <w:jc w:val="left"/>
+            </w:pPr>
+            <w:r>
+              <w:rPr>
+                <w:rFonts w:ascii="Times New Roman" w:hAnsi="Times New Roman"/>
+                <w:b w:val="0"/>
+                <w:sz w:val="24"/>
+              </w:rPr>
+              <w:t>Описание товара, до 2000 символов. Пустое значение сохраняется как NULL.</w:t>
+            </w:r>
+          </w:p>
+        </w:tc>
+      </w:tr>
+      <w:tr>
+        <w:trPr>
+          <w:cantSplit/>
+        </w:trPr>
+        <w:tc>
+          <w:tcPr>
+            <w:tcW w:type="dxa" w:w="2381"/>
+            <w:vAlign w:val="center"/>
+          </w:tcPr>
+          <w:p>
+            <w:pPr>
+              <w:keepNext w:val="0"/>
+              <w:spacing w:line="240" w:lineRule="auto" w:before="0" w:after="60"/>
+              <w:jc w:val="left"/>
+            </w:pPr>
+            <w:r>
+              <w:rPr>
+                <w:rFonts w:ascii="Times New Roman" w:hAnsi="Times New Roman"/>
+                <w:b/>
+                <w:sz w:val="24"/>
+              </w:rPr>
+              <w:t>category_id</w:t>
+            </w:r>
+          </w:p>
+        </w:tc>
+        <w:tc>
+          <w:tcPr>
+            <w:tcW w:type="dxa" w:w="1984"/>
+            <w:vAlign w:val="center"/>
+          </w:tcPr>
+          <w:p>
+            <w:pPr>
+              <w:keepNext w:val="0"/>
+              <w:spacing w:line="240" w:lineRule="auto" w:before="0" w:after="60"/>
+              <w:jc w:val="left"/>
+            </w:pPr>
+            <w:r>
+              <w:rPr>
+                <w:rFonts w:ascii="Times New Roman" w:hAnsi="Times New Roman"/>
+                <w:b w:val="0"/>
+                <w:sz w:val="24"/>
+              </w:rPr>
+              <w:t>Целое; обязательный</w:t>
+            </w:r>
+          </w:p>
+        </w:tc>
+        <w:tc>
+          <w:tcPr>
+            <w:tcW w:type="dxa" w:w="4661"/>
+            <w:vAlign w:val="center"/>
+          </w:tcPr>
+          <w:p>
+            <w:pPr>
+              <w:keepNext w:val="0"/>
+              <w:spacing w:line="240" w:lineRule="auto" w:before="0" w:after="60"/>
+              <w:jc w:val="left"/>
+            </w:pPr>
+            <w:r>
+              <w:rPr>
+                <w:rFonts w:ascii="Times New Roman" w:hAnsi="Times New Roman"/>
+                <w:b w:val="0"/>
+                <w:sz w:val="24"/>
+              </w:rPr>
+              <w:t>Внешний ключ на categories.id. Должен указывать на существующую категорию.</w:t>
+            </w:r>
+          </w:p>
+        </w:tc>
+      </w:tr>
+      <w:tr>
+        <w:trPr>
+          <w:cantSplit/>
+        </w:trPr>
+        <w:tc>
+          <w:tcPr>
+            <w:tcW w:type="dxa" w:w="2381"/>
+            <w:vAlign w:val="center"/>
+          </w:tcPr>
+          <w:p>
+            <w:pPr>
+              <w:keepNext w:val="0"/>
+              <w:spacing w:line="240" w:lineRule="auto" w:before="0" w:after="60"/>
+              <w:jc w:val="left"/>
+            </w:pPr>
+            <w:r>
+              <w:rPr>
+                <w:rFonts w:ascii="Times New Roman" w:hAnsi="Times New Roman"/>
+                <w:b/>
+                <w:sz w:val="24"/>
+              </w:rPr>
+              <w:t>price_kopecks</w:t>
+            </w:r>
+          </w:p>
+        </w:tc>
+        <w:tc>
+          <w:tcPr>
+            <w:tcW w:type="dxa" w:w="1984"/>
+            <w:vAlign w:val="center"/>
+          </w:tcPr>
+          <w:p>
+            <w:pPr>
+              <w:keepNext w:val="0"/>
+              <w:spacing w:line="240" w:lineRule="auto" w:before="0" w:after="60"/>
+              <w:jc w:val="left"/>
+            </w:pPr>
+            <w:r>
+              <w:rPr>
+                <w:rFonts w:ascii="Times New Roman" w:hAnsi="Times New Roman"/>
+                <w:b w:val="0"/>
+                <w:sz w:val="24"/>
+              </w:rPr>
+              <w:t>Целое; обязательный</w:t>
+            </w:r>
+          </w:p>
+        </w:tc>
+        <w:tc>
+          <w:tcPr>
+            <w:tcW w:type="dxa" w:w="4661"/>
+            <w:vAlign w:val="center"/>
+          </w:tcPr>
+          <w:p>
+            <w:pPr>
+              <w:keepNext w:val="0"/>
+              <w:spacing w:line="240" w:lineRule="auto" w:before="0" w:after="60"/>
+              <w:jc w:val="left"/>
+            </w:pPr>
+            <w:r>
+              <w:rPr>
+                <w:rFonts w:ascii="Times New Roman" w:hAnsi="Times New Roman"/>
+                <w:b w:val="0"/>
+                <w:sz w:val="24"/>
+              </w:rPr>
+              <w:t>Цена в копейках от 0 до 9223372036854775807. Внутреннее представление базы.</w:t>
+            </w:r>
+          </w:p>
+        </w:tc>
+      </w:tr>
+      <w:tr>
+        <w:trPr>
+          <w:cantSplit/>
+        </w:trPr>
+        <w:tc>
+          <w:tcPr>
+            <w:tcW w:type="dxa" w:w="2381"/>
+            <w:vAlign w:val="center"/>
+          </w:tcPr>
+          <w:p>
+            <w:pPr>
+              <w:keepNext w:val="0"/>
+              <w:spacing w:line="240" w:lineRule="auto" w:before="0" w:after="60"/>
+              <w:jc w:val="left"/>
+            </w:pPr>
+            <w:r>
+              <w:rPr>
+                <w:rFonts w:ascii="Times New Roman" w:hAnsi="Times New Roman"/>
+                <w:b/>
+                <w:sz w:val="24"/>
+              </w:rPr>
+              <w:t>quantity</w:t>
+            </w:r>
+          </w:p>
+        </w:tc>
+        <w:tc>
+          <w:tcPr>
+            <w:tcW w:type="dxa" w:w="1984"/>
+            <w:vAlign w:val="center"/>
+          </w:tcPr>
+          <w:p>
+            <w:pPr>
+              <w:keepNext w:val="0"/>
+              <w:spacing w:line="240" w:lineRule="auto" w:before="0" w:after="60"/>
+              <w:jc w:val="left"/>
+            </w:pPr>
+            <w:r>
+              <w:rPr>
+                <w:rFonts w:ascii="Times New Roman" w:hAnsi="Times New Roman"/>
+                <w:b w:val="0"/>
+                <w:sz w:val="24"/>
+              </w:rPr>
+              <w:t>Целое; обязательный</w:t>
+            </w:r>
+          </w:p>
+        </w:tc>
+        <w:tc>
+          <w:tcPr>
+            <w:tcW w:type="dxa" w:w="4661"/>
+            <w:vAlign w:val="center"/>
+          </w:tcPr>
+          <w:p>
+            <w:pPr>
+              <w:keepNext w:val="0"/>
+              <w:spacing w:line="240" w:lineRule="auto" w:before="0" w:after="60"/>
+              <w:jc w:val="left"/>
+            </w:pPr>
+            <w:r>
+              <w:rPr>
+                <w:rFonts w:ascii="Times New Roman" w:hAnsi="Times New Roman"/>
+                <w:b w:val="0"/>
+                <w:sz w:val="24"/>
+              </w:rPr>
+              <w:t>Текущий остаток от 0 до 9223372036854775807. В модели значение по умолчанию равно 0.</w:t>
+            </w:r>
+          </w:p>
+        </w:tc>
+      </w:tr>
+      <w:tr>
+        <w:trPr>
+          <w:cantSplit/>
+        </w:trPr>
+        <w:tc>
+          <w:tcPr>
+            <w:tcW w:type="dxa" w:w="2381"/>
+            <w:vAlign w:val="center"/>
+          </w:tcPr>
+          <w:p>
+            <w:pPr>
+              <w:keepNext w:val="0"/>
+              <w:spacing w:line="240" w:lineRule="auto" w:before="0" w:after="60"/>
+              <w:jc w:val="left"/>
+            </w:pPr>
+            <w:r>
+              <w:rPr>
+                <w:rFonts w:ascii="Times New Roman" w:hAnsi="Times New Roman"/>
+                <w:b/>
+                <w:sz w:val="24"/>
+              </w:rPr>
+              <w:t>created_at</w:t>
+            </w:r>
+          </w:p>
+        </w:tc>
+        <w:tc>
+          <w:tcPr>
+            <w:tcW w:type="dxa" w:w="1984"/>
+            <w:vAlign w:val="center"/>
+          </w:tcPr>
+          <w:p>
+            <w:pPr>
+              <w:keepNext w:val="0"/>
+              <w:spacing w:line="240" w:lineRule="auto" w:before="0" w:after="60"/>
+              <w:jc w:val="left"/>
+            </w:pPr>
+            <w:r>
+              <w:rPr>
+                <w:rFonts w:ascii="Times New Roman" w:hAnsi="Times New Roman"/>
+                <w:b w:val="0"/>
+                <w:sz w:val="24"/>
+              </w:rPr>
+              <w:t>Дата и время; обязательный, системный</w:t>
+            </w:r>
+          </w:p>
+        </w:tc>
+        <w:tc>
+          <w:tcPr>
+            <w:tcW w:type="dxa" w:w="4661"/>
+            <w:vAlign w:val="center"/>
+          </w:tcPr>
+          <w:p>
+            <w:pPr>
+              <w:keepNext w:val="0"/>
+              <w:spacing w:line="240" w:lineRule="auto" w:before="0" w:after="60"/>
+              <w:jc w:val="left"/>
+            </w:pPr>
+            <w:r>
+              <w:rPr>
+                <w:rFonts w:ascii="Times New Roman" w:hAnsi="Times New Roman"/>
+                <w:b w:val="0"/>
+                <w:sz w:val="24"/>
+              </w:rPr>
+              <w:t>Время создания в UTC. Заполняется автоматически и сохраняется при редактировании.</w:t>
+            </w:r>
+          </w:p>
+        </w:tc>
+      </w:tr>
+      <w:tr>
+        <w:trPr>
+          <w:cantSplit/>
+        </w:trPr>
+        <w:tc>
+          <w:tcPr>
+            <w:tcW w:type="dxa" w:w="2381"/>
+            <w:vAlign w:val="center"/>
+          </w:tcPr>
+          <w:p>
+            <w:pPr>
+              <w:keepNext w:val="0"/>
+              <w:spacing w:line="240" w:lineRule="auto" w:before="0" w:after="60"/>
+              <w:jc w:val="left"/>
+            </w:pPr>
+            <w:r>
+              <w:rPr>
+                <w:rFonts w:ascii="Times New Roman" w:hAnsi="Times New Roman"/>
+                <w:b/>
+                <w:sz w:val="24"/>
+              </w:rPr>
+              <w:t>updated_at</w:t>
+            </w:r>
+          </w:p>
+        </w:tc>
+        <w:tc>
+          <w:tcPr>
+            <w:tcW w:type="dxa" w:w="1984"/>
+            <w:vAlign w:val="center"/>
+          </w:tcPr>
+          <w:p>
+            <w:pPr>
+              <w:keepNext w:val="0"/>
+              <w:spacing w:line="240" w:lineRule="auto" w:before="0" w:after="60"/>
+              <w:jc w:val="left"/>
+            </w:pPr>
+            <w:r>
+              <w:rPr>
+                <w:rFonts w:ascii="Times New Roman" w:hAnsi="Times New Roman"/>
+                <w:b w:val="0"/>
+                <w:sz w:val="24"/>
+              </w:rPr>
+              <w:t>Дата и время; обязательный, системный</w:t>
+            </w:r>
+          </w:p>
+        </w:tc>
+        <w:tc>
+          <w:tcPr>
+            <w:tcW w:type="dxa" w:w="4661"/>
+            <w:vAlign w:val="center"/>
+          </w:tcPr>
+          <w:p>
+            <w:pPr>
+              <w:keepNext w:val="0"/>
+              <w:spacing w:line="240" w:lineRule="auto" w:before="0" w:after="60"/>
+              <w:jc w:val="left"/>
+            </w:pPr>
+            <w:r>
+              <w:rPr>
+                <w:rFonts w:ascii="Times New Roman" w:hAnsi="Times New Roman"/>
+                <w:b w:val="0"/>
+                <w:sz w:val="24"/>
+              </w:rPr>
+              <w:t>Время последнего изменения в UTC. Обновляется моделью при изменении записи.</w:t>
+            </w:r>
+          </w:p>
+        </w:tc>
+      </w:tr>
+    </w:tbl>
+    <w:p>
+      <w:pPr>
+        <w:spacing w:after="0"/>
+      </w:pPr>
+    </w:p>
+    <w:p>
+      <w:pPr>
+        <w:pStyle w:val="Heading2"/>
+        <w:ind w:left="360"/>
+      </w:pPr>
+      <w:r>
+        <w:t>Представление данных в API</w:t>
+      </w:r>
+    </w:p>
+    <w:p>
+      <w:pPr>
+        <w:jc w:val="both"/>
+      </w:pPr>
+      <w:r>
+        <w:t>В запросе создания и полного изменения товара обязательны name, sku, category_id, price и quantity. Описание необязательно. Наличие значения по умолчанию quantity в модели не отменяет обязательность этого поля в JSON-запросе.</w:t>
+      </w:r>
+    </w:p>
+    <w:p>
+      <w:pPr>
+        <w:jc w:val="both"/>
+      </w:pPr>
+      <w:r>
+        <w:t>Цена передаётся полем price как строка рублей, например «49.90», и преобразуется сервером в price_kopecks. В ответе дополнительно возвращается category_name — название связанной категории. Это поле не хранится отдельным столбцом товара.</w:t>
+      </w:r>
+    </w:p>
+    <w:p>
+      <w:pPr>
+        <w:jc w:val="both"/>
+      </w:pPr>
+      <w:r>
+        <w:t>Поля id, name_normalized, price_kopecks, created_at и updated_at не принимаются как редактируемые поля. Время в JSON обозначается как UTC; SQLite хранит дату и время без встроенного часового пояса по соглашению приложения.</w:t>
+      </w:r>
+    </w:p>
+    <w:p>
+      <w:pPr>
+        <w:pStyle w:val="Heading1"/>
+      </w:pPr>
+      <w:r>
         <w:t>Бизнес-правила</w:t>
       </w:r>
     </w:p>
@@ -656,6 +1849,1121 @@
         <w:pStyle w:val="Heading1"/>
       </w:pPr>
       <w:r>
+        <w:t>Ограничения данных и реализации</w:t>
+      </w:r>
+    </w:p>
+    <w:tbl>
+      <w:tblPr>
+        <w:tblStyle w:val="TableGrid"/>
+        <w:tblW w:type="auto" w:w="0"/>
+        <w:tblLayout w:type="fixed"/>
+        <w:tblLook w:firstColumn="1" w:firstRow="1" w:lastColumn="0" w:lastRow="0" w:noHBand="0" w:noVBand="1" w:val="04A0"/>
+      </w:tblPr>
+      <w:tblGrid>
+        <w:gridCol w:w="1134"/>
+        <w:gridCol w:w="2268"/>
+        <w:gridCol w:w="5624"/>
+      </w:tblGrid>
+      <w:tr>
+        <w:trPr>
+          <w:cantSplit/>
+          <w:tblHeader/>
+        </w:trPr>
+        <w:tc>
+          <w:tcPr>
+            <w:tcW w:type="dxa" w:w="1134"/>
+            <w:vAlign w:val="center"/>
+          </w:tcPr>
+          <w:p>
+            <w:pPr>
+              <w:keepNext/>
+              <w:spacing w:line="240" w:lineRule="auto" w:before="0" w:after="60"/>
+              <w:jc w:val="left"/>
+            </w:pPr>
+            <w:r>
+              <w:rPr>
+                <w:rFonts w:ascii="Times New Roman" w:hAnsi="Times New Roman"/>
+                <w:b/>
+                <w:sz w:val="24"/>
+              </w:rPr>
+              <w:t>Код</w:t>
+            </w:r>
+          </w:p>
+        </w:tc>
+        <w:tc>
+          <w:tcPr>
+            <w:tcW w:type="dxa" w:w="2268"/>
+            <w:vAlign w:val="center"/>
+          </w:tcPr>
+          <w:p>
+            <w:pPr>
+              <w:keepNext/>
+              <w:spacing w:line="240" w:lineRule="auto" w:before="0" w:after="60"/>
+              <w:jc w:val="left"/>
+            </w:pPr>
+            <w:r>
+              <w:rPr>
+                <w:rFonts w:ascii="Times New Roman" w:hAnsi="Times New Roman"/>
+                <w:b/>
+                <w:sz w:val="24"/>
+              </w:rPr>
+              <w:t>Объект или параметр</w:t>
+            </w:r>
+          </w:p>
+        </w:tc>
+        <w:tc>
+          <w:tcPr>
+            <w:tcW w:type="dxa" w:w="5624"/>
+            <w:vAlign w:val="center"/>
+          </w:tcPr>
+          <w:p>
+            <w:pPr>
+              <w:keepNext/>
+              <w:spacing w:line="240" w:lineRule="auto" w:before="0" w:after="60"/>
+              <w:jc w:val="left"/>
+            </w:pPr>
+            <w:r>
+              <w:rPr>
+                <w:rFonts w:ascii="Times New Roman" w:hAnsi="Times New Roman"/>
+                <w:b/>
+                <w:sz w:val="24"/>
+              </w:rPr>
+              <w:t>Ограничение</w:t>
+            </w:r>
+          </w:p>
+        </w:tc>
+      </w:tr>
+      <w:tr>
+        <w:trPr>
+          <w:cantSplit/>
+        </w:trPr>
+        <w:tc>
+          <w:tcPr>
+            <w:tcW w:type="dxa" w:w="1134"/>
+            <w:vAlign w:val="center"/>
+          </w:tcPr>
+          <w:p>
+            <w:pPr>
+              <w:keepNext w:val="0"/>
+              <w:spacing w:line="240" w:lineRule="auto" w:before="0" w:after="60"/>
+              <w:jc w:val="left"/>
+            </w:pPr>
+            <w:r>
+              <w:rPr>
+                <w:rFonts w:ascii="Times New Roman" w:hAnsi="Times New Roman"/>
+                <w:b/>
+                <w:sz w:val="24"/>
+              </w:rPr>
+              <w:t>ОГР-1</w:t>
+            </w:r>
+          </w:p>
+        </w:tc>
+        <w:tc>
+          <w:tcPr>
+            <w:tcW w:type="dxa" w:w="2268"/>
+            <w:vAlign w:val="center"/>
+          </w:tcPr>
+          <w:p>
+            <w:pPr>
+              <w:keepNext w:val="0"/>
+              <w:spacing w:line="240" w:lineRule="auto" w:before="0" w:after="60"/>
+              <w:jc w:val="left"/>
+            </w:pPr>
+            <w:r>
+              <w:rPr>
+                <w:rFonts w:ascii="Times New Roman" w:hAnsi="Times New Roman"/>
+                <w:b w:val="0"/>
+                <w:sz w:val="24"/>
+              </w:rPr>
+              <w:t>Названия</w:t>
+            </w:r>
+          </w:p>
+        </w:tc>
+        <w:tc>
+          <w:tcPr>
+            <w:tcW w:type="dxa" w:w="5624"/>
+            <w:vAlign w:val="center"/>
+          </w:tcPr>
+          <w:p>
+            <w:pPr>
+              <w:keepNext w:val="0"/>
+              <w:spacing w:line="240" w:lineRule="auto" w:before="0" w:after="60"/>
+              <w:jc w:val="left"/>
+            </w:pPr>
+            <w:r>
+              <w:rPr>
+                <w:rFonts w:ascii="Times New Roman" w:hAnsi="Times New Roman"/>
+                <w:b w:val="0"/>
+                <w:sz w:val="24"/>
+              </w:rPr>
+              <w:t>Категория: 1–100 символов; товар: 1–200. Пустые строки и строки только из пробелов отклоняются.</w:t>
+            </w:r>
+          </w:p>
+        </w:tc>
+      </w:tr>
+      <w:tr>
+        <w:trPr>
+          <w:cantSplit/>
+        </w:trPr>
+        <w:tc>
+          <w:tcPr>
+            <w:tcW w:type="dxa" w:w="1134"/>
+            <w:vAlign w:val="center"/>
+          </w:tcPr>
+          <w:p>
+            <w:pPr>
+              <w:keepNext w:val="0"/>
+              <w:spacing w:line="240" w:lineRule="auto" w:before="0" w:after="60"/>
+              <w:jc w:val="left"/>
+            </w:pPr>
+            <w:r>
+              <w:rPr>
+                <w:rFonts w:ascii="Times New Roman" w:hAnsi="Times New Roman"/>
+                <w:b/>
+                <w:sz w:val="24"/>
+              </w:rPr>
+              <w:t>ОГР-2</w:t>
+            </w:r>
+          </w:p>
+        </w:tc>
+        <w:tc>
+          <w:tcPr>
+            <w:tcW w:type="dxa" w:w="2268"/>
+            <w:vAlign w:val="center"/>
+          </w:tcPr>
+          <w:p>
+            <w:pPr>
+              <w:keepNext w:val="0"/>
+              <w:spacing w:line="240" w:lineRule="auto" w:before="0" w:after="60"/>
+              <w:jc w:val="left"/>
+            </w:pPr>
+            <w:r>
+              <w:rPr>
+                <w:rFonts w:ascii="Times New Roman" w:hAnsi="Times New Roman"/>
+                <w:b w:val="0"/>
+                <w:sz w:val="24"/>
+              </w:rPr>
+              <w:t>Описания</w:t>
+            </w:r>
+          </w:p>
+        </w:tc>
+        <w:tc>
+          <w:tcPr>
+            <w:tcW w:type="dxa" w:w="5624"/>
+            <w:vAlign w:val="center"/>
+          </w:tcPr>
+          <w:p>
+            <w:pPr>
+              <w:keepNext w:val="0"/>
+              <w:spacing w:line="240" w:lineRule="auto" w:before="0" w:after="60"/>
+              <w:jc w:val="left"/>
+            </w:pPr>
+            <w:r>
+              <w:rPr>
+                <w:rFonts w:ascii="Times New Roman" w:hAnsi="Times New Roman"/>
+                <w:b w:val="0"/>
+                <w:sz w:val="24"/>
+              </w:rPr>
+              <w:t>Не более 2000 символов; отсутствие описания допустимо.</w:t>
+            </w:r>
+          </w:p>
+        </w:tc>
+      </w:tr>
+      <w:tr>
+        <w:trPr>
+          <w:cantSplit/>
+        </w:trPr>
+        <w:tc>
+          <w:tcPr>
+            <w:tcW w:type="dxa" w:w="1134"/>
+            <w:vAlign w:val="center"/>
+          </w:tcPr>
+          <w:p>
+            <w:pPr>
+              <w:keepNext w:val="0"/>
+              <w:spacing w:line="240" w:lineRule="auto" w:before="0" w:after="60"/>
+              <w:jc w:val="left"/>
+            </w:pPr>
+            <w:r>
+              <w:rPr>
+                <w:rFonts w:ascii="Times New Roman" w:hAnsi="Times New Roman"/>
+                <w:b/>
+                <w:sz w:val="24"/>
+              </w:rPr>
+              <w:t>ОГР-3</w:t>
+            </w:r>
+          </w:p>
+        </w:tc>
+        <w:tc>
+          <w:tcPr>
+            <w:tcW w:type="dxa" w:w="2268"/>
+            <w:vAlign w:val="center"/>
+          </w:tcPr>
+          <w:p>
+            <w:pPr>
+              <w:keepNext w:val="0"/>
+              <w:spacing w:line="240" w:lineRule="auto" w:before="0" w:after="60"/>
+              <w:jc w:val="left"/>
+            </w:pPr>
+            <w:r>
+              <w:rPr>
+                <w:rFonts w:ascii="Times New Roman" w:hAnsi="Times New Roman"/>
+                <w:b w:val="0"/>
+                <w:sz w:val="24"/>
+              </w:rPr>
+              <w:t>Артикул</w:t>
+            </w:r>
+          </w:p>
+        </w:tc>
+        <w:tc>
+          <w:tcPr>
+            <w:tcW w:type="dxa" w:w="5624"/>
+            <w:vAlign w:val="center"/>
+          </w:tcPr>
+          <w:p>
+            <w:pPr>
+              <w:keepNext w:val="0"/>
+              <w:spacing w:line="240" w:lineRule="auto" w:before="0" w:after="60"/>
+              <w:jc w:val="left"/>
+            </w:pPr>
+            <w:r>
+              <w:rPr>
+                <w:rFonts w:ascii="Times New Roman" w:hAnsi="Times New Roman"/>
+                <w:b w:val="0"/>
+                <w:sz w:val="24"/>
+              </w:rPr>
+              <w:t>Только латинские буквы A–Z, a–z, цифры 0–9, дефис и подчёркивание; длина 1–64. Уникальность проверяется после перевода букв в верхний регистр.</w:t>
+            </w:r>
+          </w:p>
+        </w:tc>
+      </w:tr>
+      <w:tr>
+        <w:trPr>
+          <w:cantSplit/>
+        </w:trPr>
+        <w:tc>
+          <w:tcPr>
+            <w:tcW w:type="dxa" w:w="1134"/>
+            <w:vAlign w:val="center"/>
+          </w:tcPr>
+          <w:p>
+            <w:pPr>
+              <w:keepNext w:val="0"/>
+              <w:spacing w:line="240" w:lineRule="auto" w:before="0" w:after="60"/>
+              <w:jc w:val="left"/>
+            </w:pPr>
+            <w:r>
+              <w:rPr>
+                <w:rFonts w:ascii="Times New Roman" w:hAnsi="Times New Roman"/>
+                <w:b/>
+                <w:sz w:val="24"/>
+              </w:rPr>
+              <w:t>ОГР-4</w:t>
+            </w:r>
+          </w:p>
+        </w:tc>
+        <w:tc>
+          <w:tcPr>
+            <w:tcW w:type="dxa" w:w="2268"/>
+            <w:vAlign w:val="center"/>
+          </w:tcPr>
+          <w:p>
+            <w:pPr>
+              <w:keepNext w:val="0"/>
+              <w:spacing w:line="240" w:lineRule="auto" w:before="0" w:after="60"/>
+              <w:jc w:val="left"/>
+            </w:pPr>
+            <w:r>
+              <w:rPr>
+                <w:rFonts w:ascii="Times New Roman" w:hAnsi="Times New Roman"/>
+                <w:b w:val="0"/>
+                <w:sz w:val="24"/>
+              </w:rPr>
+              <w:t>Имя категории</w:t>
+            </w:r>
+          </w:p>
+        </w:tc>
+        <w:tc>
+          <w:tcPr>
+            <w:tcW w:type="dxa" w:w="5624"/>
+            <w:vAlign w:val="center"/>
+          </w:tcPr>
+          <w:p>
+            <w:pPr>
+              <w:keepNext w:val="0"/>
+              <w:spacing w:line="240" w:lineRule="auto" w:before="0" w:after="60"/>
+              <w:jc w:val="left"/>
+            </w:pPr>
+            <w:r>
+              <w:rPr>
+                <w:rFonts w:ascii="Times New Roman" w:hAnsi="Times New Roman"/>
+                <w:b w:val="0"/>
+                <w:sz w:val="24"/>
+              </w:rPr>
+              <w:t>Уникальность по NFKC, удалению крайних пробелов и casefold. Исходное написание сохраняется для показа.</w:t>
+            </w:r>
+          </w:p>
+        </w:tc>
+      </w:tr>
+      <w:tr>
+        <w:trPr>
+          <w:cantSplit/>
+        </w:trPr>
+        <w:tc>
+          <w:tcPr>
+            <w:tcW w:type="dxa" w:w="1134"/>
+            <w:vAlign w:val="center"/>
+          </w:tcPr>
+          <w:p>
+            <w:pPr>
+              <w:keepNext w:val="0"/>
+              <w:spacing w:line="240" w:lineRule="auto" w:before="0" w:after="60"/>
+              <w:jc w:val="left"/>
+            </w:pPr>
+            <w:r>
+              <w:rPr>
+                <w:rFonts w:ascii="Times New Roman" w:hAnsi="Times New Roman"/>
+                <w:b/>
+                <w:sz w:val="24"/>
+              </w:rPr>
+              <w:t>ОГР-5</w:t>
+            </w:r>
+          </w:p>
+        </w:tc>
+        <w:tc>
+          <w:tcPr>
+            <w:tcW w:type="dxa" w:w="2268"/>
+            <w:vAlign w:val="center"/>
+          </w:tcPr>
+          <w:p>
+            <w:pPr>
+              <w:keepNext w:val="0"/>
+              <w:spacing w:line="240" w:lineRule="auto" w:before="0" w:after="60"/>
+              <w:jc w:val="left"/>
+            </w:pPr>
+            <w:r>
+              <w:rPr>
+                <w:rFonts w:ascii="Times New Roman" w:hAnsi="Times New Roman"/>
+                <w:b w:val="0"/>
+                <w:sz w:val="24"/>
+              </w:rPr>
+              <w:t>Цена и остаток в базе</w:t>
+            </w:r>
+          </w:p>
+        </w:tc>
+        <w:tc>
+          <w:tcPr>
+            <w:tcW w:type="dxa" w:w="5624"/>
+            <w:vAlign w:val="center"/>
+          </w:tcPr>
+          <w:p>
+            <w:pPr>
+              <w:keepNext w:val="0"/>
+              <w:spacing w:line="240" w:lineRule="auto" w:before="0" w:after="60"/>
+              <w:jc w:val="left"/>
+            </w:pPr>
+            <w:r>
+              <w:rPr>
+                <w:rFonts w:ascii="Times New Roman" w:hAnsi="Times New Roman"/>
+                <w:b w:val="0"/>
+                <w:sz w:val="24"/>
+              </w:rPr>
+              <w:t>Целые значения от 0 до 2^63 − 1 включительно. Логические, дробные и выходящие за диапазон значения отклоняются схемами и валидаторами приложения.</w:t>
+            </w:r>
+          </w:p>
+        </w:tc>
+      </w:tr>
+      <w:tr>
+        <w:trPr>
+          <w:cantSplit/>
+        </w:trPr>
+        <w:tc>
+          <w:tcPr>
+            <w:tcW w:type="dxa" w:w="1134"/>
+            <w:vAlign w:val="center"/>
+          </w:tcPr>
+          <w:p>
+            <w:pPr>
+              <w:keepNext w:val="0"/>
+              <w:spacing w:line="240" w:lineRule="auto" w:before="0" w:after="60"/>
+              <w:jc w:val="left"/>
+            </w:pPr>
+            <w:r>
+              <w:rPr>
+                <w:rFonts w:ascii="Times New Roman" w:hAnsi="Times New Roman"/>
+                <w:b/>
+                <w:sz w:val="24"/>
+              </w:rPr>
+              <w:t>ОГР-6</w:t>
+            </w:r>
+          </w:p>
+        </w:tc>
+        <w:tc>
+          <w:tcPr>
+            <w:tcW w:type="dxa" w:w="2268"/>
+            <w:vAlign w:val="center"/>
+          </w:tcPr>
+          <w:p>
+            <w:pPr>
+              <w:keepNext w:val="0"/>
+              <w:spacing w:line="240" w:lineRule="auto" w:before="0" w:after="60"/>
+              <w:jc w:val="left"/>
+            </w:pPr>
+            <w:r>
+              <w:rPr>
+                <w:rFonts w:ascii="Times New Roman" w:hAnsi="Times New Roman"/>
+                <w:b w:val="0"/>
+                <w:sz w:val="24"/>
+              </w:rPr>
+              <w:t>Цена в запросе</w:t>
+            </w:r>
+          </w:p>
+        </w:tc>
+        <w:tc>
+          <w:tcPr>
+            <w:tcW w:type="dxa" w:w="5624"/>
+            <w:vAlign w:val="center"/>
+          </w:tcPr>
+          <w:p>
+            <w:pPr>
+              <w:keepNext w:val="0"/>
+              <w:spacing w:line="240" w:lineRule="auto" w:before="0" w:after="60"/>
+              <w:jc w:val="left"/>
+            </w:pPr>
+            <w:r>
+              <w:rPr>
+                <w:rFonts w:ascii="Times New Roman" w:hAnsi="Times New Roman"/>
+                <w:b w:val="0"/>
+                <w:sz w:val="24"/>
+              </w:rPr>
+              <w:t>Строка длиной до 32 символов: цифры и необязательный десятичный разделитель с 1–2 дробными знаками. Максимум — 92233720368547758.07 рубля. Экспонента, NaN, бесконечность, отрицательные значения и скрытое округление не допускаются.</w:t>
+            </w:r>
+          </w:p>
+        </w:tc>
+      </w:tr>
+      <w:tr>
+        <w:trPr>
+          <w:cantSplit/>
+        </w:trPr>
+        <w:tc>
+          <w:tcPr>
+            <w:tcW w:type="dxa" w:w="1134"/>
+            <w:vAlign w:val="center"/>
+          </w:tcPr>
+          <w:p>
+            <w:pPr>
+              <w:keepNext w:val="0"/>
+              <w:spacing w:line="240" w:lineRule="auto" w:before="0" w:after="60"/>
+              <w:jc w:val="left"/>
+            </w:pPr>
+            <w:r>
+              <w:rPr>
+                <w:rFonts w:ascii="Times New Roman" w:hAnsi="Times New Roman"/>
+                <w:b/>
+                <w:sz w:val="24"/>
+              </w:rPr>
+              <w:t>ОГР-7</w:t>
+            </w:r>
+          </w:p>
+        </w:tc>
+        <w:tc>
+          <w:tcPr>
+            <w:tcW w:type="dxa" w:w="2268"/>
+            <w:vAlign w:val="center"/>
+          </w:tcPr>
+          <w:p>
+            <w:pPr>
+              <w:keepNext w:val="0"/>
+              <w:spacing w:line="240" w:lineRule="auto" w:before="0" w:after="60"/>
+              <w:jc w:val="left"/>
+            </w:pPr>
+            <w:r>
+              <w:rPr>
+                <w:rFonts w:ascii="Times New Roman" w:hAnsi="Times New Roman"/>
+                <w:b w:val="0"/>
+                <w:sz w:val="24"/>
+              </w:rPr>
+              <w:t>Идентификатор категории во вводе</w:t>
+            </w:r>
+          </w:p>
+        </w:tc>
+        <w:tc>
+          <w:tcPr>
+            <w:tcW w:type="dxa" w:w="5624"/>
+            <w:vAlign w:val="center"/>
+          </w:tcPr>
+          <w:p>
+            <w:pPr>
+              <w:keepNext w:val="0"/>
+              <w:spacing w:line="240" w:lineRule="auto" w:before="0" w:after="60"/>
+              <w:jc w:val="left"/>
+            </w:pPr>
+            <w:r>
+              <w:rPr>
+                <w:rFonts w:ascii="Times New Roman" w:hAnsi="Times New Roman"/>
+                <w:b w:val="0"/>
+                <w:sz w:val="24"/>
+              </w:rPr>
+              <w:t>Строгое целое JSON-число от 1 до 9223372036854775807. Допустимый по формату, но отсутствующий идентификатор даёт 404.</w:t>
+            </w:r>
+          </w:p>
+        </w:tc>
+      </w:tr>
+      <w:tr>
+        <w:trPr>
+          <w:cantSplit/>
+        </w:trPr>
+        <w:tc>
+          <w:tcPr>
+            <w:tcW w:type="dxa" w:w="1134"/>
+            <w:vAlign w:val="center"/>
+          </w:tcPr>
+          <w:p>
+            <w:pPr>
+              <w:keepNext w:val="0"/>
+              <w:spacing w:line="240" w:lineRule="auto" w:before="0" w:after="60"/>
+              <w:jc w:val="left"/>
+            </w:pPr>
+            <w:r>
+              <w:rPr>
+                <w:rFonts w:ascii="Times New Roman" w:hAnsi="Times New Roman"/>
+                <w:b/>
+                <w:sz w:val="24"/>
+              </w:rPr>
+              <w:t>ОГР-8</w:t>
+            </w:r>
+          </w:p>
+        </w:tc>
+        <w:tc>
+          <w:tcPr>
+            <w:tcW w:type="dxa" w:w="2268"/>
+            <w:vAlign w:val="center"/>
+          </w:tcPr>
+          <w:p>
+            <w:pPr>
+              <w:keepNext w:val="0"/>
+              <w:spacing w:line="240" w:lineRule="auto" w:before="0" w:after="60"/>
+              <w:jc w:val="left"/>
+            </w:pPr>
+            <w:r>
+              <w:rPr>
+                <w:rFonts w:ascii="Times New Roman" w:hAnsi="Times New Roman"/>
+                <w:b w:val="0"/>
+                <w:sz w:val="24"/>
+              </w:rPr>
+              <w:t>Поиск и цена отбора</w:t>
+            </w:r>
+          </w:p>
+        </w:tc>
+        <w:tc>
+          <w:tcPr>
+            <w:tcW w:type="dxa" w:w="5624"/>
+            <w:vAlign w:val="center"/>
+          </w:tcPr>
+          <w:p>
+            <w:pPr>
+              <w:keepNext w:val="0"/>
+              <w:spacing w:line="240" w:lineRule="auto" w:before="0" w:after="60"/>
+              <w:jc w:val="left"/>
+            </w:pPr>
+            <w:r>
+              <w:rPr>
+                <w:rFonts w:ascii="Times New Roman" w:hAnsi="Times New Roman"/>
+                <w:b w:val="0"/>
+                <w:sz w:val="24"/>
+              </w:rPr>
+              <w:t>Строка поиска — до 200 символов. Каждая ценовая граница — до 32 символов, с правилами разбора цены; нижняя не превышает верхнюю.</w:t>
+            </w:r>
+          </w:p>
+        </w:tc>
+      </w:tr>
+      <w:tr>
+        <w:trPr>
+          <w:cantSplit/>
+        </w:trPr>
+        <w:tc>
+          <w:tcPr>
+            <w:tcW w:type="dxa" w:w="1134"/>
+            <w:vAlign w:val="center"/>
+          </w:tcPr>
+          <w:p>
+            <w:pPr>
+              <w:keepNext w:val="0"/>
+              <w:spacing w:line="240" w:lineRule="auto" w:before="0" w:after="60"/>
+              <w:jc w:val="left"/>
+            </w:pPr>
+            <w:r>
+              <w:rPr>
+                <w:rFonts w:ascii="Times New Roman" w:hAnsi="Times New Roman"/>
+                <w:b/>
+                <w:sz w:val="24"/>
+              </w:rPr>
+              <w:t>ОГР-9</w:t>
+            </w:r>
+          </w:p>
+        </w:tc>
+        <w:tc>
+          <w:tcPr>
+            <w:tcW w:type="dxa" w:w="2268"/>
+            <w:vAlign w:val="center"/>
+          </w:tcPr>
+          <w:p>
+            <w:pPr>
+              <w:keepNext w:val="0"/>
+              <w:spacing w:line="240" w:lineRule="auto" w:before="0" w:after="60"/>
+              <w:jc w:val="left"/>
+            </w:pPr>
+            <w:r>
+              <w:rPr>
+                <w:rFonts w:ascii="Times New Roman" w:hAnsi="Times New Roman"/>
+                <w:b w:val="0"/>
+                <w:sz w:val="24"/>
+              </w:rPr>
+              <w:t>Пагинация</w:t>
+            </w:r>
+          </w:p>
+        </w:tc>
+        <w:tc>
+          <w:tcPr>
+            <w:tcW w:type="dxa" w:w="5624"/>
+            <w:vAlign w:val="center"/>
+          </w:tcPr>
+          <w:p>
+            <w:pPr>
+              <w:keepNext w:val="0"/>
+              <w:spacing w:line="240" w:lineRule="auto" w:before="0" w:after="60"/>
+              <w:jc w:val="left"/>
+            </w:pPr>
+            <w:r>
+              <w:rPr>
+                <w:rFonts w:ascii="Times New Roman" w:hAnsi="Times New Roman"/>
+                <w:b w:val="0"/>
+                <w:sz w:val="24"/>
+              </w:rPr>
+              <w:t>Номер страницы от 1 до 922337203685477580. Размер страницы фиксирован: 10 товаров.</w:t>
+            </w:r>
+          </w:p>
+        </w:tc>
+      </w:tr>
+      <w:tr>
+        <w:trPr>
+          <w:cantSplit/>
+        </w:trPr>
+        <w:tc>
+          <w:tcPr>
+            <w:tcW w:type="dxa" w:w="1134"/>
+            <w:vAlign w:val="center"/>
+          </w:tcPr>
+          <w:p>
+            <w:pPr>
+              <w:keepNext w:val="0"/>
+              <w:spacing w:line="240" w:lineRule="auto" w:before="0" w:after="60"/>
+              <w:jc w:val="left"/>
+            </w:pPr>
+            <w:r>
+              <w:rPr>
+                <w:rFonts w:ascii="Times New Roman" w:hAnsi="Times New Roman"/>
+                <w:b/>
+                <w:sz w:val="24"/>
+              </w:rPr>
+              <w:t>ОГР-10</w:t>
+            </w:r>
+          </w:p>
+        </w:tc>
+        <w:tc>
+          <w:tcPr>
+            <w:tcW w:type="dxa" w:w="2268"/>
+            <w:vAlign w:val="center"/>
+          </w:tcPr>
+          <w:p>
+            <w:pPr>
+              <w:keepNext w:val="0"/>
+              <w:spacing w:line="240" w:lineRule="auto" w:before="0" w:after="60"/>
+              <w:jc w:val="left"/>
+            </w:pPr>
+            <w:r>
+              <w:rPr>
+                <w:rFonts w:ascii="Times New Roman" w:hAnsi="Times New Roman"/>
+                <w:b w:val="0"/>
+                <w:sz w:val="24"/>
+              </w:rPr>
+              <w:t>Сортировка</w:t>
+            </w:r>
+          </w:p>
+        </w:tc>
+        <w:tc>
+          <w:tcPr>
+            <w:tcW w:type="dxa" w:w="5624"/>
+            <w:vAlign w:val="center"/>
+          </w:tcPr>
+          <w:p>
+            <w:pPr>
+              <w:keepNext w:val="0"/>
+              <w:spacing w:line="240" w:lineRule="auto" w:before="0" w:after="60"/>
+              <w:jc w:val="left"/>
+            </w:pPr>
+            <w:r>
+              <w:rPr>
+                <w:rFonts w:ascii="Times New Roman" w:hAnsi="Times New Roman"/>
+                <w:b w:val="0"/>
+                <w:sz w:val="24"/>
+              </w:rPr>
+              <w:t>Разрешены только name_asc, name_desc, price_asc, price_desc и updated_desc. При равенстве значений используется id.</w:t>
+            </w:r>
+          </w:p>
+        </w:tc>
+      </w:tr>
+      <w:tr>
+        <w:trPr>
+          <w:cantSplit/>
+        </w:trPr>
+        <w:tc>
+          <w:tcPr>
+            <w:tcW w:type="dxa" w:w="1134"/>
+            <w:vAlign w:val="center"/>
+          </w:tcPr>
+          <w:p>
+            <w:pPr>
+              <w:keepNext w:val="0"/>
+              <w:spacing w:line="240" w:lineRule="auto" w:before="0" w:after="60"/>
+              <w:jc w:val="left"/>
+            </w:pPr>
+            <w:r>
+              <w:rPr>
+                <w:rFonts w:ascii="Times New Roman" w:hAnsi="Times New Roman"/>
+                <w:b/>
+                <w:sz w:val="24"/>
+              </w:rPr>
+              <w:t>ОГР-11</w:t>
+            </w:r>
+          </w:p>
+        </w:tc>
+        <w:tc>
+          <w:tcPr>
+            <w:tcW w:type="dxa" w:w="2268"/>
+            <w:vAlign w:val="center"/>
+          </w:tcPr>
+          <w:p>
+            <w:pPr>
+              <w:keepNext w:val="0"/>
+              <w:spacing w:line="240" w:lineRule="auto" w:before="0" w:after="60"/>
+              <w:jc w:val="left"/>
+            </w:pPr>
+            <w:r>
+              <w:rPr>
+                <w:rFonts w:ascii="Times New Roman" w:hAnsi="Times New Roman"/>
+                <w:b w:val="0"/>
+                <w:sz w:val="24"/>
+              </w:rPr>
+              <w:t>Связи и удаление</w:t>
+            </w:r>
+          </w:p>
+        </w:tc>
+        <w:tc>
+          <w:tcPr>
+            <w:tcW w:type="dxa" w:w="5624"/>
+            <w:vAlign w:val="center"/>
+          </w:tcPr>
+          <w:p>
+            <w:pPr>
+              <w:keepNext w:val="0"/>
+              <w:spacing w:line="240" w:lineRule="auto" w:before="0" w:after="60"/>
+              <w:jc w:val="left"/>
+            </w:pPr>
+            <w:r>
+              <w:rPr>
+                <w:rFonts w:ascii="Times New Roman" w:hAnsi="Times New Roman"/>
+                <w:b w:val="0"/>
+                <w:sz w:val="24"/>
+              </w:rPr>
+              <w:t>Один товар относится к одной категории. Внешний ключ RESTRICT запрещает удаление занятой категории; каскадное удаление её товаров не применяется.</w:t>
+            </w:r>
+          </w:p>
+        </w:tc>
+      </w:tr>
+      <w:tr>
+        <w:trPr>
+          <w:cantSplit/>
+        </w:trPr>
+        <w:tc>
+          <w:tcPr>
+            <w:tcW w:type="dxa" w:w="1134"/>
+            <w:vAlign w:val="center"/>
+          </w:tcPr>
+          <w:p>
+            <w:pPr>
+              <w:keepNext w:val="0"/>
+              <w:spacing w:line="240" w:lineRule="auto" w:before="0" w:after="60"/>
+              <w:jc w:val="left"/>
+            </w:pPr>
+            <w:r>
+              <w:rPr>
+                <w:rFonts w:ascii="Times New Roman" w:hAnsi="Times New Roman"/>
+                <w:b/>
+                <w:sz w:val="24"/>
+              </w:rPr>
+              <w:t>ОГР-12</w:t>
+            </w:r>
+          </w:p>
+        </w:tc>
+        <w:tc>
+          <w:tcPr>
+            <w:tcW w:type="dxa" w:w="2268"/>
+            <w:vAlign w:val="center"/>
+          </w:tcPr>
+          <w:p>
+            <w:pPr>
+              <w:keepNext w:val="0"/>
+              <w:spacing w:line="240" w:lineRule="auto" w:before="0" w:after="60"/>
+              <w:jc w:val="left"/>
+            </w:pPr>
+            <w:r>
+              <w:rPr>
+                <w:rFonts w:ascii="Times New Roman" w:hAnsi="Times New Roman"/>
+                <w:b w:val="0"/>
+                <w:sz w:val="24"/>
+              </w:rPr>
+              <w:t>Состав запросов</w:t>
+            </w:r>
+          </w:p>
+        </w:tc>
+        <w:tc>
+          <w:tcPr>
+            <w:tcW w:type="dxa" w:w="5624"/>
+            <w:vAlign w:val="center"/>
+          </w:tcPr>
+          <w:p>
+            <w:pPr>
+              <w:keepNext w:val="0"/>
+              <w:spacing w:line="240" w:lineRule="auto" w:before="0" w:after="60"/>
+              <w:jc w:val="left"/>
+            </w:pPr>
+            <w:r>
+              <w:rPr>
+                <w:rFonts w:ascii="Times New Roman" w:hAnsi="Times New Roman"/>
+                <w:b w:val="0"/>
+                <w:sz w:val="24"/>
+              </w:rPr>
+              <w:t>Лишние поля отклоняются. quantity и category_id в JSON принимаются строгими целыми числами; строки, логические и дробные значения не подменяют эти типы.</w:t>
+            </w:r>
+          </w:p>
+        </w:tc>
+      </w:tr>
+      <w:tr>
+        <w:trPr>
+          <w:cantSplit/>
+        </w:trPr>
+        <w:tc>
+          <w:tcPr>
+            <w:tcW w:type="dxa" w:w="1134"/>
+            <w:vAlign w:val="center"/>
+          </w:tcPr>
+          <w:p>
+            <w:pPr>
+              <w:keepNext w:val="0"/>
+              <w:spacing w:line="240" w:lineRule="auto" w:before="0" w:after="60"/>
+              <w:jc w:val="left"/>
+            </w:pPr>
+            <w:r>
+              <w:rPr>
+                <w:rFonts w:ascii="Times New Roman" w:hAnsi="Times New Roman"/>
+                <w:b/>
+                <w:sz w:val="24"/>
+              </w:rPr>
+              <w:t>ОГР-13</w:t>
+            </w:r>
+          </w:p>
+        </w:tc>
+        <w:tc>
+          <w:tcPr>
+            <w:tcW w:type="dxa" w:w="2268"/>
+            <w:vAlign w:val="center"/>
+          </w:tcPr>
+          <w:p>
+            <w:pPr>
+              <w:keepNext w:val="0"/>
+              <w:spacing w:line="240" w:lineRule="auto" w:before="0" w:after="60"/>
+              <w:jc w:val="left"/>
+            </w:pPr>
+            <w:r>
+              <w:rPr>
+                <w:rFonts w:ascii="Times New Roman" w:hAnsi="Times New Roman"/>
+                <w:b w:val="0"/>
+                <w:sz w:val="24"/>
+              </w:rPr>
+              <w:t>Изменение записи</w:t>
+            </w:r>
+          </w:p>
+        </w:tc>
+        <w:tc>
+          <w:tcPr>
+            <w:tcW w:type="dxa" w:w="5624"/>
+            <w:vAlign w:val="center"/>
+          </w:tcPr>
+          <w:p>
+            <w:pPr>
+              <w:keepNext w:val="0"/>
+              <w:spacing w:line="240" w:lineRule="auto" w:before="0" w:after="60"/>
+              <w:jc w:val="left"/>
+            </w:pPr>
+            <w:r>
+              <w:rPr>
+                <w:rFonts w:ascii="Times New Roman" w:hAnsi="Times New Roman"/>
+                <w:b w:val="0"/>
+                <w:sz w:val="24"/>
+              </w:rPr>
+              <w:t>PUT требует полный набор обязательных полей товара. Частичное обновление PATCH не реализовано.</w:t>
+            </w:r>
+          </w:p>
+        </w:tc>
+      </w:tr>
+      <w:tr>
+        <w:trPr>
+          <w:cantSplit/>
+        </w:trPr>
+        <w:tc>
+          <w:tcPr>
+            <w:tcW w:type="dxa" w:w="1134"/>
+            <w:vAlign w:val="center"/>
+          </w:tcPr>
+          <w:p>
+            <w:pPr>
+              <w:keepNext w:val="0"/>
+              <w:spacing w:line="240" w:lineRule="auto" w:before="0" w:after="60"/>
+              <w:jc w:val="left"/>
+            </w:pPr>
+            <w:r>
+              <w:rPr>
+                <w:rFonts w:ascii="Times New Roman" w:hAnsi="Times New Roman"/>
+                <w:b/>
+                <w:sz w:val="24"/>
+              </w:rPr>
+              <w:t>ОГР-14</w:t>
+            </w:r>
+          </w:p>
+        </w:tc>
+        <w:tc>
+          <w:tcPr>
+            <w:tcW w:type="dxa" w:w="2268"/>
+            <w:vAlign w:val="center"/>
+          </w:tcPr>
+          <w:p>
+            <w:pPr>
+              <w:keepNext w:val="0"/>
+              <w:spacing w:line="240" w:lineRule="auto" w:before="0" w:after="60"/>
+              <w:jc w:val="left"/>
+            </w:pPr>
+            <w:r>
+              <w:rPr>
+                <w:rFonts w:ascii="Times New Roman" w:hAnsi="Times New Roman"/>
+                <w:b w:val="0"/>
+                <w:sz w:val="24"/>
+              </w:rPr>
+              <w:t>Объём модуля</w:t>
+            </w:r>
+          </w:p>
+        </w:tc>
+        <w:tc>
+          <w:tcPr>
+            <w:tcW w:type="dxa" w:w="5624"/>
+            <w:vAlign w:val="center"/>
+          </w:tcPr>
+          <w:p>
+            <w:pPr>
+              <w:keepNext w:val="0"/>
+              <w:spacing w:line="240" w:lineRule="auto" w:before="0" w:after="60"/>
+              <w:jc w:val="left"/>
+            </w:pPr>
+            <w:r>
+              <w:rPr>
+                <w:rFonts w:ascii="Times New Roman" w:hAnsi="Times New Roman"/>
+                <w:b w:val="0"/>
+                <w:sz w:val="24"/>
+              </w:rPr>
+              <w:t>Локальный каталог одного менеджера. Авторизации, ролей, заказов, оплаты, доставки, иерархии категорий и журнала складских операций нет.</w:t>
+            </w:r>
+          </w:p>
+        </w:tc>
+      </w:tr>
+      <w:tr>
+        <w:trPr>
+          <w:cantSplit/>
+        </w:trPr>
+        <w:tc>
+          <w:tcPr>
+            <w:tcW w:type="dxa" w:w="1134"/>
+            <w:vAlign w:val="center"/>
+          </w:tcPr>
+          <w:p>
+            <w:pPr>
+              <w:keepNext w:val="0"/>
+              <w:spacing w:line="240" w:lineRule="auto" w:before="0" w:after="60"/>
+              <w:jc w:val="left"/>
+            </w:pPr>
+            <w:r>
+              <w:rPr>
+                <w:rFonts w:ascii="Times New Roman" w:hAnsi="Times New Roman"/>
+                <w:b/>
+                <w:sz w:val="24"/>
+              </w:rPr>
+              <w:t>ОГР-15</w:t>
+            </w:r>
+          </w:p>
+        </w:tc>
+        <w:tc>
+          <w:tcPr>
+            <w:tcW w:type="dxa" w:w="2268"/>
+            <w:vAlign w:val="center"/>
+          </w:tcPr>
+          <w:p>
+            <w:pPr>
+              <w:keepNext w:val="0"/>
+              <w:spacing w:line="240" w:lineRule="auto" w:before="0" w:after="60"/>
+              <w:jc w:val="left"/>
+            </w:pPr>
+            <w:r>
+              <w:rPr>
+                <w:rFonts w:ascii="Times New Roman" w:hAnsi="Times New Roman"/>
+                <w:b w:val="0"/>
+                <w:sz w:val="24"/>
+              </w:rPr>
+              <w:t>Развитие схемы</w:t>
+            </w:r>
+          </w:p>
+        </w:tc>
+        <w:tc>
+          <w:tcPr>
+            <w:tcW w:type="dxa" w:w="5624"/>
+            <w:vAlign w:val="center"/>
+          </w:tcPr>
+          <w:p>
+            <w:pPr>
+              <w:keepNext w:val="0"/>
+              <w:spacing w:line="240" w:lineRule="auto" w:before="0" w:after="60"/>
+              <w:jc w:val="left"/>
+            </w:pPr>
+            <w:r>
+              <w:rPr>
+                <w:rFonts w:ascii="Times New Roman" w:hAnsi="Times New Roman"/>
+                <w:b w:val="0"/>
+                <w:sz w:val="24"/>
+              </w:rPr>
+              <w:t>Создание таблиц при запуске не изменяет существующую схему. Автоматические миграции не реализованы.</w:t>
+            </w:r>
+          </w:p>
+        </w:tc>
+      </w:tr>
+    </w:tbl>
+    <w:p>
+      <w:pPr>
+        <w:spacing w:after="0"/>
+      </w:pPr>
+    </w:p>
+    <w:p>
+      <w:pPr>
+        <w:pStyle w:val="Heading1"/>
+      </w:pPr>
+      <w:r>
         <w:t>Нефункциональные и технические требования</w:t>
       </w:r>
     </w:p>
@@ -778,6 +3086,1061 @@
       <w:r>
         <w:t>Проверки базы, API, HTML и загрузчика должны выполняться на отдельных временных базах, не изменяя рабочий каталог. Команды установки, запуска и проверки должны быть приведены в README.</w:t>
       </w:r>
+    </w:p>
+    <w:p>
+      <w:pPr>
+        <w:pStyle w:val="Heading1"/>
+      </w:pPr>
+      <w:r>
+        <w:t>Системные характеристики</w:t>
+      </w:r>
+    </w:p>
+    <w:p>
+      <w:pPr>
+        <w:jc w:val="both"/>
+      </w:pPr>
+      <w:r>
+        <w:t>Характеристики относятся к реализованной учебной версии. Они определяют состав среды и режим работы; измеренные показатели производительности не заявляются.</w:t>
+      </w:r>
+    </w:p>
+    <w:tbl>
+      <w:tblPr>
+        <w:tblStyle w:val="TableGrid"/>
+        <w:tblW w:type="auto" w:w="0"/>
+        <w:tblLayout w:type="fixed"/>
+        <w:tblLook w:firstColumn="1" w:firstRow="1" w:lastColumn="0" w:lastRow="0" w:noHBand="0" w:noVBand="1" w:val="04A0"/>
+      </w:tblPr>
+      <w:tblGrid>
+        <w:gridCol w:w="1134"/>
+        <w:gridCol w:w="2268"/>
+        <w:gridCol w:w="5624"/>
+      </w:tblGrid>
+      <w:tr>
+        <w:trPr>
+          <w:cantSplit/>
+          <w:tblHeader/>
+        </w:trPr>
+        <w:tc>
+          <w:tcPr>
+            <w:tcW w:type="dxa" w:w="1134"/>
+            <w:vAlign w:val="center"/>
+          </w:tcPr>
+          <w:p>
+            <w:pPr>
+              <w:keepNext/>
+              <w:spacing w:line="240" w:lineRule="auto" w:before="0" w:after="60"/>
+              <w:jc w:val="left"/>
+            </w:pPr>
+            <w:r>
+              <w:rPr>
+                <w:rFonts w:ascii="Times New Roman" w:hAnsi="Times New Roman"/>
+                <w:b/>
+                <w:sz w:val="24"/>
+              </w:rPr>
+              <w:t>Код</w:t>
+            </w:r>
+          </w:p>
+        </w:tc>
+        <w:tc>
+          <w:tcPr>
+            <w:tcW w:type="dxa" w:w="2268"/>
+            <w:vAlign w:val="center"/>
+          </w:tcPr>
+          <w:p>
+            <w:pPr>
+              <w:keepNext/>
+              <w:spacing w:line="240" w:lineRule="auto" w:before="0" w:after="60"/>
+              <w:jc w:val="left"/>
+            </w:pPr>
+            <w:r>
+              <w:rPr>
+                <w:rFonts w:ascii="Times New Roman" w:hAnsi="Times New Roman"/>
+                <w:b/>
+                <w:sz w:val="24"/>
+              </w:rPr>
+              <w:t>Характеристика</w:t>
+            </w:r>
+          </w:p>
+        </w:tc>
+        <w:tc>
+          <w:tcPr>
+            <w:tcW w:type="dxa" w:w="5624"/>
+            <w:vAlign w:val="center"/>
+          </w:tcPr>
+          <w:p>
+            <w:pPr>
+              <w:keepNext/>
+              <w:spacing w:line="240" w:lineRule="auto" w:before="0" w:after="60"/>
+              <w:jc w:val="left"/>
+            </w:pPr>
+            <w:r>
+              <w:rPr>
+                <w:rFonts w:ascii="Times New Roman" w:hAnsi="Times New Roman"/>
+                <w:b/>
+                <w:sz w:val="24"/>
+              </w:rPr>
+              <w:t>Значение</w:t>
+            </w:r>
+          </w:p>
+        </w:tc>
+      </w:tr>
+      <w:tr>
+        <w:trPr>
+          <w:cantSplit/>
+        </w:trPr>
+        <w:tc>
+          <w:tcPr>
+            <w:tcW w:type="dxa" w:w="1134"/>
+            <w:vAlign w:val="center"/>
+          </w:tcPr>
+          <w:p>
+            <w:pPr>
+              <w:keepNext w:val="0"/>
+              <w:spacing w:line="240" w:lineRule="auto" w:before="0" w:after="60"/>
+              <w:jc w:val="left"/>
+            </w:pPr>
+            <w:r>
+              <w:rPr>
+                <w:rFonts w:ascii="Times New Roman" w:hAnsi="Times New Roman"/>
+                <w:b/>
+                <w:sz w:val="24"/>
+              </w:rPr>
+              <w:t>СХ-1</w:t>
+            </w:r>
+          </w:p>
+        </w:tc>
+        <w:tc>
+          <w:tcPr>
+            <w:tcW w:type="dxa" w:w="2268"/>
+            <w:vAlign w:val="center"/>
+          </w:tcPr>
+          <w:p>
+            <w:pPr>
+              <w:keepNext w:val="0"/>
+              <w:spacing w:line="240" w:lineRule="auto" w:before="0" w:after="60"/>
+              <w:jc w:val="left"/>
+            </w:pPr>
+            <w:r>
+              <w:rPr>
+                <w:rFonts w:ascii="Times New Roman" w:hAnsi="Times New Roman"/>
+                <w:b w:val="0"/>
+                <w:sz w:val="24"/>
+              </w:rPr>
+              <w:t>Архитектура и режим</w:t>
+            </w:r>
+          </w:p>
+        </w:tc>
+        <w:tc>
+          <w:tcPr>
+            <w:tcW w:type="dxa" w:w="5624"/>
+            <w:vAlign w:val="center"/>
+          </w:tcPr>
+          <w:p>
+            <w:pPr>
+              <w:keepNext w:val="0"/>
+              <w:spacing w:line="240" w:lineRule="auto" w:before="0" w:after="60"/>
+              <w:jc w:val="left"/>
+            </w:pPr>
+            <w:r>
+              <w:rPr>
+                <w:rFonts w:ascii="Times New Roman" w:hAnsi="Times New Roman"/>
+                <w:b w:val="0"/>
+                <w:sz w:val="24"/>
+              </w:rPr>
+              <w:t>Веб-приложение с серверным формированием HTML и JSON API. Локальная работа одного менеджера с общей SQLite-базой.</w:t>
+            </w:r>
+          </w:p>
+        </w:tc>
+      </w:tr>
+      <w:tr>
+        <w:trPr>
+          <w:cantSplit/>
+        </w:trPr>
+        <w:tc>
+          <w:tcPr>
+            <w:tcW w:type="dxa" w:w="1134"/>
+            <w:vAlign w:val="center"/>
+          </w:tcPr>
+          <w:p>
+            <w:pPr>
+              <w:keepNext w:val="0"/>
+              <w:spacing w:line="240" w:lineRule="auto" w:before="0" w:after="60"/>
+              <w:jc w:val="left"/>
+            </w:pPr>
+            <w:r>
+              <w:rPr>
+                <w:rFonts w:ascii="Times New Roman" w:hAnsi="Times New Roman"/>
+                <w:b/>
+                <w:sz w:val="24"/>
+              </w:rPr>
+              <w:t>СХ-2</w:t>
+            </w:r>
+          </w:p>
+        </w:tc>
+        <w:tc>
+          <w:tcPr>
+            <w:tcW w:type="dxa" w:w="2268"/>
+            <w:vAlign w:val="center"/>
+          </w:tcPr>
+          <w:p>
+            <w:pPr>
+              <w:keepNext w:val="0"/>
+              <w:spacing w:line="240" w:lineRule="auto" w:before="0" w:after="60"/>
+              <w:jc w:val="left"/>
+            </w:pPr>
+            <w:r>
+              <w:rPr>
+                <w:rFonts w:ascii="Times New Roman" w:hAnsi="Times New Roman"/>
+                <w:b w:val="0"/>
+                <w:sz w:val="24"/>
+              </w:rPr>
+              <w:t>Операционные системы</w:t>
+            </w:r>
+          </w:p>
+        </w:tc>
+        <w:tc>
+          <w:tcPr>
+            <w:tcW w:type="dxa" w:w="5624"/>
+            <w:vAlign w:val="center"/>
+          </w:tcPr>
+          <w:p>
+            <w:pPr>
+              <w:keepNext w:val="0"/>
+              <w:spacing w:line="240" w:lineRule="auto" w:before="0" w:after="60"/>
+              <w:jc w:val="left"/>
+            </w:pPr>
+            <w:r>
+              <w:rPr>
+                <w:rFonts w:ascii="Times New Roman" w:hAnsi="Times New Roman"/>
+                <w:b w:val="0"/>
+                <w:sz w:val="24"/>
+              </w:rPr>
+              <w:t>macOS для локальной разработки и демонстрации; Linux для среды разработки и автоматических проверок. Проверка Windows не выполнялась.</w:t>
+            </w:r>
+          </w:p>
+        </w:tc>
+      </w:tr>
+      <w:tr>
+        <w:trPr>
+          <w:cantSplit/>
+        </w:trPr>
+        <w:tc>
+          <w:tcPr>
+            <w:tcW w:type="dxa" w:w="1134"/>
+            <w:vAlign w:val="center"/>
+          </w:tcPr>
+          <w:p>
+            <w:pPr>
+              <w:keepNext w:val="0"/>
+              <w:spacing w:line="240" w:lineRule="auto" w:before="0" w:after="60"/>
+              <w:jc w:val="left"/>
+            </w:pPr>
+            <w:r>
+              <w:rPr>
+                <w:rFonts w:ascii="Times New Roman" w:hAnsi="Times New Roman"/>
+                <w:b/>
+                <w:sz w:val="24"/>
+              </w:rPr>
+              <w:t>СХ-3</w:t>
+            </w:r>
+          </w:p>
+        </w:tc>
+        <w:tc>
+          <w:tcPr>
+            <w:tcW w:type="dxa" w:w="2268"/>
+            <w:vAlign w:val="center"/>
+          </w:tcPr>
+          <w:p>
+            <w:pPr>
+              <w:keepNext w:val="0"/>
+              <w:spacing w:line="240" w:lineRule="auto" w:before="0" w:after="60"/>
+              <w:jc w:val="left"/>
+            </w:pPr>
+            <w:r>
+              <w:rPr>
+                <w:rFonts w:ascii="Times New Roman" w:hAnsi="Times New Roman"/>
+                <w:b w:val="0"/>
+                <w:sz w:val="24"/>
+              </w:rPr>
+              <w:t>Исполняющая среда</w:t>
+            </w:r>
+          </w:p>
+        </w:tc>
+        <w:tc>
+          <w:tcPr>
+            <w:tcW w:type="dxa" w:w="5624"/>
+            <w:vAlign w:val="center"/>
+          </w:tcPr>
+          <w:p>
+            <w:pPr>
+              <w:keepNext w:val="0"/>
+              <w:spacing w:line="240" w:lineRule="auto" w:before="0" w:after="60"/>
+              <w:jc w:val="left"/>
+            </w:pPr>
+            <w:r>
+              <w:rPr>
+                <w:rFonts w:ascii="Times New Roman" w:hAnsi="Times New Roman"/>
+                <w:b w:val="0"/>
+                <w:sz w:val="24"/>
+              </w:rPr>
+              <w:t>Python 3.12.x, отдельное виртуальное окружение .venv, установка пакетов из закреплённых файлов зависимостей.</w:t>
+            </w:r>
+          </w:p>
+        </w:tc>
+      </w:tr>
+      <w:tr>
+        <w:trPr>
+          <w:cantSplit/>
+        </w:trPr>
+        <w:tc>
+          <w:tcPr>
+            <w:tcW w:type="dxa" w:w="1134"/>
+            <w:vAlign w:val="center"/>
+          </w:tcPr>
+          <w:p>
+            <w:pPr>
+              <w:keepNext w:val="0"/>
+              <w:spacing w:line="240" w:lineRule="auto" w:before="0" w:after="60"/>
+              <w:jc w:val="left"/>
+            </w:pPr>
+            <w:r>
+              <w:rPr>
+                <w:rFonts w:ascii="Times New Roman" w:hAnsi="Times New Roman"/>
+                <w:b/>
+                <w:sz w:val="24"/>
+              </w:rPr>
+              <w:t>СХ-4</w:t>
+            </w:r>
+          </w:p>
+        </w:tc>
+        <w:tc>
+          <w:tcPr>
+            <w:tcW w:type="dxa" w:w="2268"/>
+            <w:vAlign w:val="center"/>
+          </w:tcPr>
+          <w:p>
+            <w:pPr>
+              <w:keepNext w:val="0"/>
+              <w:spacing w:line="240" w:lineRule="auto" w:before="0" w:after="60"/>
+              <w:jc w:val="left"/>
+            </w:pPr>
+            <w:r>
+              <w:rPr>
+                <w:rFonts w:ascii="Times New Roman" w:hAnsi="Times New Roman"/>
+                <w:b w:val="0"/>
+                <w:sz w:val="24"/>
+              </w:rPr>
+              <w:t>Серверные компоненты</w:t>
+            </w:r>
+          </w:p>
+        </w:tc>
+        <w:tc>
+          <w:tcPr>
+            <w:tcW w:type="dxa" w:w="5624"/>
+            <w:vAlign w:val="center"/>
+          </w:tcPr>
+          <w:p>
+            <w:pPr>
+              <w:keepNext w:val="0"/>
+              <w:spacing w:line="240" w:lineRule="auto" w:before="0" w:after="60"/>
+              <w:jc w:val="left"/>
+            </w:pPr>
+            <w:r>
+              <w:rPr>
+                <w:rFonts w:ascii="Times New Roman" w:hAnsi="Times New Roman"/>
+                <w:b w:val="0"/>
+                <w:sz w:val="24"/>
+              </w:rPr>
+              <w:t>FastAPI 0.154.0, Uvicorn 0.54.0, SQLAlchemy 2.1.5, Pydantic 2.14.1 и Jinja2 3.1.6. Полный состав — requirements.txt.</w:t>
+            </w:r>
+          </w:p>
+        </w:tc>
+      </w:tr>
+      <w:tr>
+        <w:trPr>
+          <w:cantSplit/>
+        </w:trPr>
+        <w:tc>
+          <w:tcPr>
+            <w:tcW w:type="dxa" w:w="1134"/>
+            <w:vAlign w:val="center"/>
+          </w:tcPr>
+          <w:p>
+            <w:pPr>
+              <w:keepNext w:val="0"/>
+              <w:spacing w:line="240" w:lineRule="auto" w:before="0" w:after="60"/>
+              <w:jc w:val="left"/>
+            </w:pPr>
+            <w:r>
+              <w:rPr>
+                <w:rFonts w:ascii="Times New Roman" w:hAnsi="Times New Roman"/>
+                <w:b/>
+                <w:sz w:val="24"/>
+              </w:rPr>
+              <w:t>СХ-5</w:t>
+            </w:r>
+          </w:p>
+        </w:tc>
+        <w:tc>
+          <w:tcPr>
+            <w:tcW w:type="dxa" w:w="2268"/>
+            <w:vAlign w:val="center"/>
+          </w:tcPr>
+          <w:p>
+            <w:pPr>
+              <w:keepNext w:val="0"/>
+              <w:spacing w:line="240" w:lineRule="auto" w:before="0" w:after="60"/>
+              <w:jc w:val="left"/>
+            </w:pPr>
+            <w:r>
+              <w:rPr>
+                <w:rFonts w:ascii="Times New Roman" w:hAnsi="Times New Roman"/>
+                <w:b w:val="0"/>
+                <w:sz w:val="24"/>
+              </w:rPr>
+              <w:t>Хранение</w:t>
+            </w:r>
+          </w:p>
+        </w:tc>
+        <w:tc>
+          <w:tcPr>
+            <w:tcW w:type="dxa" w:w="5624"/>
+            <w:vAlign w:val="center"/>
+          </w:tcPr>
+          <w:p>
+            <w:pPr>
+              <w:keepNext w:val="0"/>
+              <w:spacing w:line="240" w:lineRule="auto" w:before="0" w:after="60"/>
+              <w:jc w:val="left"/>
+            </w:pPr>
+            <w:r>
+              <w:rPr>
+                <w:rFonts w:ascii="Times New Roman" w:hAnsi="Times New Roman"/>
+                <w:b w:val="0"/>
+                <w:sz w:val="24"/>
+              </w:rPr>
+              <w:t>SQLite через драйвер sqlite3 среды Python. Рабочий файл — data/catalog.db относительно проекта. Отдельный сервер СУБД не требуется.</w:t>
+            </w:r>
+          </w:p>
+        </w:tc>
+      </w:tr>
+      <w:tr>
+        <w:trPr>
+          <w:cantSplit/>
+        </w:trPr>
+        <w:tc>
+          <w:tcPr>
+            <w:tcW w:type="dxa" w:w="1134"/>
+            <w:vAlign w:val="center"/>
+          </w:tcPr>
+          <w:p>
+            <w:pPr>
+              <w:keepNext w:val="0"/>
+              <w:spacing w:line="240" w:lineRule="auto" w:before="0" w:after="60"/>
+              <w:jc w:val="left"/>
+            </w:pPr>
+            <w:r>
+              <w:rPr>
+                <w:rFonts w:ascii="Times New Roman" w:hAnsi="Times New Roman"/>
+                <w:b/>
+                <w:sz w:val="24"/>
+              </w:rPr>
+              <w:t>СХ-6</w:t>
+            </w:r>
+          </w:p>
+        </w:tc>
+        <w:tc>
+          <w:tcPr>
+            <w:tcW w:type="dxa" w:w="2268"/>
+            <w:vAlign w:val="center"/>
+          </w:tcPr>
+          <w:p>
+            <w:pPr>
+              <w:keepNext w:val="0"/>
+              <w:spacing w:line="240" w:lineRule="auto" w:before="0" w:after="60"/>
+              <w:jc w:val="left"/>
+            </w:pPr>
+            <w:r>
+              <w:rPr>
+                <w:rFonts w:ascii="Times New Roman" w:hAnsi="Times New Roman"/>
+                <w:b w:val="0"/>
+                <w:sz w:val="24"/>
+              </w:rPr>
+              <w:t>Сетевой доступ</w:t>
+            </w:r>
+          </w:p>
+        </w:tc>
+        <w:tc>
+          <w:tcPr>
+            <w:tcW w:type="dxa" w:w="5624"/>
+            <w:vAlign w:val="center"/>
+          </w:tcPr>
+          <w:p>
+            <w:pPr>
+              <w:keepNext w:val="0"/>
+              <w:spacing w:line="240" w:lineRule="auto" w:before="0" w:after="60"/>
+              <w:jc w:val="left"/>
+            </w:pPr>
+            <w:r>
+              <w:rPr>
+                <w:rFonts w:ascii="Times New Roman" w:hAnsi="Times New Roman"/>
+                <w:b w:val="0"/>
+                <w:sz w:val="24"/>
+              </w:rPr>
+              <w:t>Обычный локальный запуск: HTTP, адрес 127.0.0.1, порт 8000. При конфликте портов порт задаётся параметром Uvicorn. Публикация в интернете не настроена.</w:t>
+            </w:r>
+          </w:p>
+        </w:tc>
+      </w:tr>
+      <w:tr>
+        <w:trPr>
+          <w:cantSplit/>
+        </w:trPr>
+        <w:tc>
+          <w:tcPr>
+            <w:tcW w:type="dxa" w:w="1134"/>
+            <w:vAlign w:val="center"/>
+          </w:tcPr>
+          <w:p>
+            <w:pPr>
+              <w:keepNext w:val="0"/>
+              <w:spacing w:line="240" w:lineRule="auto" w:before="0" w:after="60"/>
+              <w:jc w:val="left"/>
+            </w:pPr>
+            <w:r>
+              <w:rPr>
+                <w:rFonts w:ascii="Times New Roman" w:hAnsi="Times New Roman"/>
+                <w:b/>
+                <w:sz w:val="24"/>
+              </w:rPr>
+              <w:t>СХ-7</w:t>
+            </w:r>
+          </w:p>
+        </w:tc>
+        <w:tc>
+          <w:tcPr>
+            <w:tcW w:type="dxa" w:w="2268"/>
+            <w:vAlign w:val="center"/>
+          </w:tcPr>
+          <w:p>
+            <w:pPr>
+              <w:keepNext w:val="0"/>
+              <w:spacing w:line="240" w:lineRule="auto" w:before="0" w:after="60"/>
+              <w:jc w:val="left"/>
+            </w:pPr>
+            <w:r>
+              <w:rPr>
+                <w:rFonts w:ascii="Times New Roman" w:hAnsi="Times New Roman"/>
+                <w:b w:val="0"/>
+                <w:sz w:val="24"/>
+              </w:rPr>
+              <w:t>Интерфейс пользователя</w:t>
+            </w:r>
+          </w:p>
+        </w:tc>
+        <w:tc>
+          <w:tcPr>
+            <w:tcW w:type="dxa" w:w="5624"/>
+            <w:vAlign w:val="center"/>
+          </w:tcPr>
+          <w:p>
+            <w:pPr>
+              <w:keepNext w:val="0"/>
+              <w:spacing w:line="240" w:lineRule="auto" w:before="0" w:after="60"/>
+              <w:jc w:val="left"/>
+            </w:pPr>
+            <w:r>
+              <w:rPr>
+                <w:rFonts w:ascii="Times New Roman" w:hAnsi="Times New Roman"/>
+                <w:b w:val="0"/>
+                <w:sz w:val="24"/>
+              </w:rPr>
+              <w:t>Русский язык, кодировка UTF-8, браузерные HTML-формы, CSS и небольшой JavaScript для местного времени дат. Основные операции не зависят от JavaScript.</w:t>
+            </w:r>
+          </w:p>
+        </w:tc>
+      </w:tr>
+      <w:tr>
+        <w:trPr>
+          <w:cantSplit/>
+        </w:trPr>
+        <w:tc>
+          <w:tcPr>
+            <w:tcW w:type="dxa" w:w="1134"/>
+            <w:vAlign w:val="center"/>
+          </w:tcPr>
+          <w:p>
+            <w:pPr>
+              <w:keepNext w:val="0"/>
+              <w:spacing w:line="240" w:lineRule="auto" w:before="0" w:after="60"/>
+              <w:jc w:val="left"/>
+            </w:pPr>
+            <w:r>
+              <w:rPr>
+                <w:rFonts w:ascii="Times New Roman" w:hAnsi="Times New Roman"/>
+                <w:b/>
+                <w:sz w:val="24"/>
+              </w:rPr>
+              <w:t>СХ-8</w:t>
+            </w:r>
+          </w:p>
+        </w:tc>
+        <w:tc>
+          <w:tcPr>
+            <w:tcW w:type="dxa" w:w="2268"/>
+            <w:vAlign w:val="center"/>
+          </w:tcPr>
+          <w:p>
+            <w:pPr>
+              <w:keepNext w:val="0"/>
+              <w:spacing w:line="240" w:lineRule="auto" w:before="0" w:after="60"/>
+              <w:jc w:val="left"/>
+            </w:pPr>
+            <w:r>
+              <w:rPr>
+                <w:rFonts w:ascii="Times New Roman" w:hAnsi="Times New Roman"/>
+                <w:b w:val="0"/>
+                <w:sz w:val="24"/>
+              </w:rPr>
+              <w:t>Программный интерфейс</w:t>
+            </w:r>
+          </w:p>
+        </w:tc>
+        <w:tc>
+          <w:tcPr>
+            <w:tcW w:type="dxa" w:w="5624"/>
+            <w:vAlign w:val="center"/>
+          </w:tcPr>
+          <w:p>
+            <w:pPr>
+              <w:keepNext w:val="0"/>
+              <w:spacing w:line="240" w:lineRule="auto" w:before="0" w:after="60"/>
+              <w:jc w:val="left"/>
+            </w:pPr>
+            <w:r>
+              <w:rPr>
+                <w:rFonts w:ascii="Times New Roman" w:hAnsi="Times New Roman"/>
+                <w:b w:val="0"/>
+                <w:sz w:val="24"/>
+              </w:rPr>
+              <w:t>JSON API с префиксом /api, схема /openapi.json и документация /docs. Цена передаётся строкой рублей, даты — с обозначением UTC.</w:t>
+            </w:r>
+          </w:p>
+        </w:tc>
+      </w:tr>
+      <w:tr>
+        <w:trPr>
+          <w:cantSplit/>
+        </w:trPr>
+        <w:tc>
+          <w:tcPr>
+            <w:tcW w:type="dxa" w:w="1134"/>
+            <w:vAlign w:val="center"/>
+          </w:tcPr>
+          <w:p>
+            <w:pPr>
+              <w:keepNext w:val="0"/>
+              <w:spacing w:line="240" w:lineRule="auto" w:before="0" w:after="60"/>
+              <w:jc w:val="left"/>
+            </w:pPr>
+            <w:r>
+              <w:rPr>
+                <w:rFonts w:ascii="Times New Roman" w:hAnsi="Times New Roman"/>
+                <w:b/>
+                <w:sz w:val="24"/>
+              </w:rPr>
+              <w:t>СХ-9</w:t>
+            </w:r>
+          </w:p>
+        </w:tc>
+        <w:tc>
+          <w:tcPr>
+            <w:tcW w:type="dxa" w:w="2268"/>
+            <w:vAlign w:val="center"/>
+          </w:tcPr>
+          <w:p>
+            <w:pPr>
+              <w:keepNext w:val="0"/>
+              <w:spacing w:line="240" w:lineRule="auto" w:before="0" w:after="60"/>
+              <w:jc w:val="left"/>
+            </w:pPr>
+            <w:r>
+              <w:rPr>
+                <w:rFonts w:ascii="Times New Roman" w:hAnsi="Times New Roman"/>
+                <w:b w:val="0"/>
+                <w:sz w:val="24"/>
+              </w:rPr>
+              <w:t>Интернет при работе</w:t>
+            </w:r>
+          </w:p>
+        </w:tc>
+        <w:tc>
+          <w:tcPr>
+            <w:tcW w:type="dxa" w:w="5624"/>
+            <w:vAlign w:val="center"/>
+          </w:tcPr>
+          <w:p>
+            <w:pPr>
+              <w:keepNext w:val="0"/>
+              <w:spacing w:line="240" w:lineRule="auto" w:before="0" w:after="60"/>
+              <w:jc w:val="left"/>
+            </w:pPr>
+            <w:r>
+              <w:rPr>
+                <w:rFonts w:ascii="Times New Roman" w:hAnsi="Times New Roman"/>
+                <w:b w:val="0"/>
+                <w:sz w:val="24"/>
+              </w:rPr>
+              <w:t>Нужен для первоначальной загрузки пакетов. Страницы каталога используют локальные CSS и JavaScript; интерфейс Swagger загружает свои файлы из внешнего CDN.</w:t>
+            </w:r>
+          </w:p>
+        </w:tc>
+      </w:tr>
+      <w:tr>
+        <w:trPr>
+          <w:cantSplit/>
+        </w:trPr>
+        <w:tc>
+          <w:tcPr>
+            <w:tcW w:type="dxa" w:w="1134"/>
+            <w:vAlign w:val="center"/>
+          </w:tcPr>
+          <w:p>
+            <w:pPr>
+              <w:keepNext w:val="0"/>
+              <w:spacing w:line="240" w:lineRule="auto" w:before="0" w:after="60"/>
+              <w:jc w:val="left"/>
+            </w:pPr>
+            <w:r>
+              <w:rPr>
+                <w:rFonts w:ascii="Times New Roman" w:hAnsi="Times New Roman"/>
+                <w:b/>
+                <w:sz w:val="24"/>
+              </w:rPr>
+              <w:t>СХ-10</w:t>
+            </w:r>
+          </w:p>
+        </w:tc>
+        <w:tc>
+          <w:tcPr>
+            <w:tcW w:type="dxa" w:w="2268"/>
+            <w:vAlign w:val="center"/>
+          </w:tcPr>
+          <w:p>
+            <w:pPr>
+              <w:keepNext w:val="0"/>
+              <w:spacing w:line="240" w:lineRule="auto" w:before="0" w:after="60"/>
+              <w:jc w:val="left"/>
+            </w:pPr>
+            <w:r>
+              <w:rPr>
+                <w:rFonts w:ascii="Times New Roman" w:hAnsi="Times New Roman"/>
+                <w:b w:val="0"/>
+                <w:sz w:val="24"/>
+              </w:rPr>
+              <w:t>Обработка данных</w:t>
+            </w:r>
+          </w:p>
+        </w:tc>
+        <w:tc>
+          <w:tcPr>
+            <w:tcW w:type="dxa" w:w="5624"/>
+            <w:vAlign w:val="center"/>
+          </w:tcPr>
+          <w:p>
+            <w:pPr>
+              <w:keepNext w:val="0"/>
+              <w:spacing w:line="240" w:lineRule="auto" w:before="0" w:after="60"/>
+              <w:jc w:val="left"/>
+            </w:pPr>
+            <w:r>
+              <w:rPr>
+                <w:rFonts w:ascii="Times New Roman" w:hAnsi="Times New Roman"/>
+                <w:b w:val="0"/>
+                <w:sz w:val="24"/>
+              </w:rPr>
+              <w:t>Сессия SQLAlchemy выдаётся на запрос. Запись фиксируется транзакцией; при ошибке целостности выполняется rollback. Для SQLite-соединений включаются внешние ключи.</w:t>
+            </w:r>
+          </w:p>
+        </w:tc>
+      </w:tr>
+      <w:tr>
+        <w:trPr>
+          <w:cantSplit/>
+        </w:trPr>
+        <w:tc>
+          <w:tcPr>
+            <w:tcW w:type="dxa" w:w="1134"/>
+            <w:vAlign w:val="center"/>
+          </w:tcPr>
+          <w:p>
+            <w:pPr>
+              <w:keepNext w:val="0"/>
+              <w:spacing w:line="240" w:lineRule="auto" w:before="0" w:after="60"/>
+              <w:jc w:val="left"/>
+            </w:pPr>
+            <w:r>
+              <w:rPr>
+                <w:rFonts w:ascii="Times New Roman" w:hAnsi="Times New Roman"/>
+                <w:b/>
+                <w:sz w:val="24"/>
+              </w:rPr>
+              <w:t>СХ-11</w:t>
+            </w:r>
+          </w:p>
+        </w:tc>
+        <w:tc>
+          <w:tcPr>
+            <w:tcW w:type="dxa" w:w="2268"/>
+            <w:vAlign w:val="center"/>
+          </w:tcPr>
+          <w:p>
+            <w:pPr>
+              <w:keepNext w:val="0"/>
+              <w:spacing w:line="240" w:lineRule="auto" w:before="0" w:after="60"/>
+              <w:jc w:val="left"/>
+            </w:pPr>
+            <w:r>
+              <w:rPr>
+                <w:rFonts w:ascii="Times New Roman" w:hAnsi="Times New Roman"/>
+                <w:b w:val="0"/>
+                <w:sz w:val="24"/>
+              </w:rPr>
+              <w:t>Демонстрационный объём</w:t>
+            </w:r>
+          </w:p>
+        </w:tc>
+        <w:tc>
+          <w:tcPr>
+            <w:tcW w:type="dxa" w:w="5624"/>
+            <w:vAlign w:val="center"/>
+          </w:tcPr>
+          <w:p>
+            <w:pPr>
+              <w:keepNext w:val="0"/>
+              <w:spacing w:line="240" w:lineRule="auto" w:before="0" w:after="60"/>
+              <w:jc w:val="left"/>
+            </w:pPr>
+            <w:r>
+              <w:rPr>
+                <w:rFonts w:ascii="Times New Roman" w:hAnsi="Times New Roman"/>
+                <w:b w:val="0"/>
+                <w:sz w:val="24"/>
+              </w:rPr>
+              <w:t>Подготовлены 1200 товаров в 12 категориях; при выдаче по 10 товаров это 120 страниц. Это состав демонстрационного набора, а не предел ёмкости системы.</w:t>
+            </w:r>
+          </w:p>
+        </w:tc>
+      </w:tr>
+      <w:tr>
+        <w:trPr>
+          <w:cantSplit/>
+        </w:trPr>
+        <w:tc>
+          <w:tcPr>
+            <w:tcW w:type="dxa" w:w="1134"/>
+            <w:vAlign w:val="center"/>
+          </w:tcPr>
+          <w:p>
+            <w:pPr>
+              <w:keepNext w:val="0"/>
+              <w:spacing w:line="240" w:lineRule="auto" w:before="0" w:after="60"/>
+              <w:jc w:val="left"/>
+            </w:pPr>
+            <w:r>
+              <w:rPr>
+                <w:rFonts w:ascii="Times New Roman" w:hAnsi="Times New Roman"/>
+                <w:b/>
+                <w:sz w:val="24"/>
+              </w:rPr>
+              <w:t>СХ-12</w:t>
+            </w:r>
+          </w:p>
+        </w:tc>
+        <w:tc>
+          <w:tcPr>
+            <w:tcW w:type="dxa" w:w="2268"/>
+            <w:vAlign w:val="center"/>
+          </w:tcPr>
+          <w:p>
+            <w:pPr>
+              <w:keepNext w:val="0"/>
+              <w:spacing w:line="240" w:lineRule="auto" w:before="0" w:after="60"/>
+              <w:jc w:val="left"/>
+            </w:pPr>
+            <w:r>
+              <w:rPr>
+                <w:rFonts w:ascii="Times New Roman" w:hAnsi="Times New Roman"/>
+                <w:b w:val="0"/>
+                <w:sz w:val="24"/>
+              </w:rPr>
+              <w:t>Инструменты проверки</w:t>
+            </w:r>
+          </w:p>
+        </w:tc>
+        <w:tc>
+          <w:tcPr>
+            <w:tcW w:type="dxa" w:w="5624"/>
+            <w:vAlign w:val="center"/>
+          </w:tcPr>
+          <w:p>
+            <w:pPr>
+              <w:keepNext w:val="0"/>
+              <w:spacing w:line="240" w:lineRule="auto" w:before="0" w:after="60"/>
+              <w:jc w:val="left"/>
+            </w:pPr>
+            <w:r>
+              <w:rPr>
+                <w:rFonts w:ascii="Times New Roman" w:hAnsi="Times New Roman"/>
+                <w:b w:val="0"/>
+                <w:sz w:val="24"/>
+              </w:rPr>
+              <w:t>pytest и HTTP-клиент для базы, API, HTML и загрузчика. Playwright и Chromium используются отдельно для браузерных сценариев.</w:t>
+            </w:r>
+          </w:p>
+        </w:tc>
+      </w:tr>
+      <w:tr>
+        <w:trPr>
+          <w:cantSplit/>
+        </w:trPr>
+        <w:tc>
+          <w:tcPr>
+            <w:tcW w:type="dxa" w:w="1134"/>
+            <w:vAlign w:val="center"/>
+          </w:tcPr>
+          <w:p>
+            <w:pPr>
+              <w:keepNext w:val="0"/>
+              <w:spacing w:line="240" w:lineRule="auto" w:before="0" w:after="60"/>
+              <w:jc w:val="left"/>
+            </w:pPr>
+            <w:r>
+              <w:rPr>
+                <w:rFonts w:ascii="Times New Roman" w:hAnsi="Times New Roman"/>
+                <w:b/>
+                <w:sz w:val="24"/>
+              </w:rPr>
+              <w:t>СХ-13</w:t>
+            </w:r>
+          </w:p>
+        </w:tc>
+        <w:tc>
+          <w:tcPr>
+            <w:tcW w:type="dxa" w:w="2268"/>
+            <w:vAlign w:val="center"/>
+          </w:tcPr>
+          <w:p>
+            <w:pPr>
+              <w:keepNext w:val="0"/>
+              <w:spacing w:line="240" w:lineRule="auto" w:before="0" w:after="60"/>
+              <w:jc w:val="left"/>
+            </w:pPr>
+            <w:r>
+              <w:rPr>
+                <w:rFonts w:ascii="Times New Roman" w:hAnsi="Times New Roman"/>
+                <w:b w:val="0"/>
+                <w:sz w:val="24"/>
+              </w:rPr>
+              <w:t>Резервирование</w:t>
+            </w:r>
+          </w:p>
+        </w:tc>
+        <w:tc>
+          <w:tcPr>
+            <w:tcW w:type="dxa" w:w="5624"/>
+            <w:vAlign w:val="center"/>
+          </w:tcPr>
+          <w:p>
+            <w:pPr>
+              <w:keepNext w:val="0"/>
+              <w:spacing w:line="240" w:lineRule="auto" w:before="0" w:after="60"/>
+              <w:jc w:val="left"/>
+            </w:pPr>
+            <w:r>
+              <w:rPr>
+                <w:rFonts w:ascii="Times New Roman" w:hAnsi="Times New Roman"/>
+                <w:b w:val="0"/>
+                <w:sz w:val="24"/>
+              </w:rPr>
+              <w:t>Загрузчик примеров создаёт SQLite backup перед изменением существующей базы. Автоматического фонового расписания резервных копий нет.</w:t>
+            </w:r>
+          </w:p>
+        </w:tc>
+      </w:tr>
+      <w:tr>
+        <w:trPr>
+          <w:cantSplit/>
+        </w:trPr>
+        <w:tc>
+          <w:tcPr>
+            <w:tcW w:type="dxa" w:w="1134"/>
+            <w:vAlign w:val="center"/>
+          </w:tcPr>
+          <w:p>
+            <w:pPr>
+              <w:keepNext w:val="0"/>
+              <w:spacing w:line="240" w:lineRule="auto" w:before="0" w:after="60"/>
+              <w:jc w:val="left"/>
+            </w:pPr>
+            <w:r>
+              <w:rPr>
+                <w:rFonts w:ascii="Times New Roman" w:hAnsi="Times New Roman"/>
+                <w:b/>
+                <w:sz w:val="24"/>
+              </w:rPr>
+              <w:t>СХ-14</w:t>
+            </w:r>
+          </w:p>
+        </w:tc>
+        <w:tc>
+          <w:tcPr>
+            <w:tcW w:type="dxa" w:w="2268"/>
+            <w:vAlign w:val="center"/>
+          </w:tcPr>
+          <w:p>
+            <w:pPr>
+              <w:keepNext w:val="0"/>
+              <w:spacing w:line="240" w:lineRule="auto" w:before="0" w:after="60"/>
+              <w:jc w:val="left"/>
+            </w:pPr>
+            <w:r>
+              <w:rPr>
+                <w:rFonts w:ascii="Times New Roman" w:hAnsi="Times New Roman"/>
+                <w:b w:val="0"/>
+                <w:sz w:val="24"/>
+              </w:rPr>
+              <w:t>Аппаратные ресурсы и нагрузка</w:t>
+            </w:r>
+          </w:p>
+        </w:tc>
+        <w:tc>
+          <w:tcPr>
+            <w:tcW w:type="dxa" w:w="5624"/>
+            <w:vAlign w:val="center"/>
+          </w:tcPr>
+          <w:p>
+            <w:pPr>
+              <w:keepNext w:val="0"/>
+              <w:spacing w:line="240" w:lineRule="auto" w:before="0" w:after="60"/>
+              <w:jc w:val="left"/>
+            </w:pPr>
+            <w:r>
+              <w:rPr>
+                <w:rFonts w:ascii="Times New Roman" w:hAnsi="Times New Roman"/>
+                <w:b w:val="0"/>
+                <w:sz w:val="24"/>
+              </w:rPr>
+              <w:t>Нужен компьютер, способный запускать Python 3.12 и браузер, с местом для окружения, базы и резервных копий. Числовые минимумы процессора, ОЗУ и диска, максимальная нагрузка и время отклика измерениями не определены.</w:t>
+            </w:r>
+          </w:p>
+        </w:tc>
+      </w:tr>
+    </w:tbl>
+    <w:p>
+      <w:pPr>
+        <w:spacing w:after="0"/>
+      </w:pPr>
     </w:p>
     <w:sectPr>
       <w:footerReference w:type="default" r:id="rId9"/>

</xml_diff>

<commit_message>
Separate user needs from functional and quality requirements
</commit_message>
<xml_diff>
--- a/docs/requirements/technical_requirements.docx
+++ b/docs/requirements/technical_requirements.docx
@@ -47,7 +47,7 @@
         <w:pStyle w:val="Heading1"/>
       </w:pPr>
       <w:r>
-        <w:t>Функциональные требования</w:t>
+        <w:t>Пользовательские требования</w:t>
       </w:r>
     </w:p>
     <w:p>
@@ -461,6 +461,247 @@
       </w:r>
       <w:r>
         <w:t>получать объяснение запрета удаления занятой категории и переходить к её товарам.</w:t>
+      </w:r>
+    </w:p>
+    <w:p>
+      <w:pPr>
+        <w:pStyle w:val="Heading1"/>
+      </w:pPr>
+      <w:r>
+        <w:t>Функциональные требования</w:t>
+      </w:r>
+    </w:p>
+    <w:p>
+      <w:pPr>
+        <w:jc w:val="both"/>
+      </w:pPr>
+      <w:r>
+        <w:t>Пользовательские требования выше описывают возможности менеджера. Функциональные требования ниже задают действия системы, состав результата и реакцию на ошибочные запросы.</w:t>
+      </w:r>
+    </w:p>
+    <w:p>
+      <w:pPr>
+        <w:keepLines/>
+        <w:jc w:val="both"/>
+      </w:pPr>
+      <w:r>
+        <w:rPr>
+          <w:b/>
+        </w:rPr>
+        <w:t xml:space="preserve">ФТ-1. </w:t>
+      </w:r>
+      <w:r>
+        <w:t>Система должна формировать список товаров с идентификатором, названием, артикулом, категорией, ценой и остатком. JSON-ответ списка должен содержать items, total, page и page_size; HTML-страница — показывать записи, число результатов и навигацию.</w:t>
+      </w:r>
+    </w:p>
+    <w:p>
+      <w:pPr>
+        <w:keepLines/>
+        <w:jc w:val="both"/>
+      </w:pPr>
+      <w:r>
+        <w:rPr>
+          <w:b/>
+        </w:rPr>
+        <w:t xml:space="preserve">ФТ-2. </w:t>
+      </w:r>
+      <w:r>
+        <w:t>По идентификатору товара система должна возвращать его карточку: название, артикул, описание, категорию, цену, остаток и даты создания и изменения. При отсутствии записи система должна возвращать 404 без изменения каталога.</w:t>
+      </w:r>
+    </w:p>
+    <w:p>
+      <w:pPr>
+        <w:keepLines/>
+        <w:jc w:val="both"/>
+      </w:pPr>
+      <w:r>
+        <w:rPr>
+          <w:b/>
+        </w:rPr>
+        <w:t xml:space="preserve">ФТ-3. </w:t>
+      </w:r>
+      <w:r>
+        <w:t>При создании товара система должна проверять обязательные поля, существование категории и уникальность артикула, преобразовывать цену в копейки и сохранять запись с новым идентификатором и датами. JSON API должен возвращать созданный товар с кодом 201; HTML-маршрут — перенаправлять на его карточку с кодом 303.</w:t>
+      </w:r>
+    </w:p>
+    <w:p>
+      <w:pPr>
+        <w:keepLines/>
+        <w:jc w:val="both"/>
+      </w:pPr>
+      <w:r>
+        <w:rPr>
+          <w:b/>
+        </w:rPr>
+        <w:t xml:space="preserve">ФТ-4. </w:t>
+      </w:r>
+      <w:r>
+        <w:t>При полном изменении товара система должна принимать все обязательные редактируемые поля, проверять данные и сохранять изменения в существующей записи. Идентификатор и дата создания должны сохраняться. При конфликте артикула с другим товаром система должна возвращать 409 и сохранять прежние значения.</w:t>
+      </w:r>
+    </w:p>
+    <w:p>
+      <w:pPr>
+        <w:keepLines/>
+        <w:jc w:val="both"/>
+      </w:pPr>
+      <w:r>
+        <w:rPr>
+          <w:b/>
+        </w:rPr>
+        <w:t xml:space="preserve">ФТ-5. </w:t>
+      </w:r>
+      <w:r>
+        <w:t>В HTML-интерфейсе по запросу подтверждения удаления система должна показывать название и артикул товара без изменения базы. Отмена должна возвращать карточку. Только изменяющий запрос должен удалять товар; его категория должна сохраняться. JSON API должен возвращать 204 без тела, HTML-маршрут — перенаправлять в список с кодом 303.</w:t>
+      </w:r>
+    </w:p>
+    <w:p>
+      <w:pPr>
+        <w:keepLines/>
+        <w:jc w:val="both"/>
+      </w:pPr>
+      <w:r>
+        <w:rPr>
+          <w:b/>
+        </w:rPr>
+        <w:t xml:space="preserve">ФТ-6. </w:t>
+      </w:r>
+      <w:r>
+        <w:t>Система должна формировать список категорий с названиями и описаниями, а в HTML-интерфейсе дополнительно показывать число товаров каждой категории. Переход по этому счётчику должен открывать список товаров с выбранным category_id.</w:t>
+      </w:r>
+    </w:p>
+    <w:p>
+      <w:pPr>
+        <w:keepLines/>
+        <w:jc w:val="both"/>
+      </w:pPr>
+      <w:r>
+        <w:rPr>
+          <w:b/>
+        </w:rPr>
+        <w:t xml:space="preserve">ФТ-7. </w:t>
+      </w:r>
+      <w:r>
+        <w:t>При создании категории система должна удалять крайние пробелы, формировать нормализованное имя и проверять его уникальность. При допустимом вводе система должна сохранять категорию; при совпадении нормализованного имени — возвращать 409 без добавления записи.</w:t>
+      </w:r>
+    </w:p>
+    <w:p>
+      <w:pPr>
+        <w:keepLines/>
+        <w:jc w:val="both"/>
+      </w:pPr>
+      <w:r>
+        <w:rPr>
+          <w:b/>
+        </w:rPr>
+        <w:t xml:space="preserve">ФТ-8. </w:t>
+      </w:r>
+      <w:r>
+        <w:t>При изменении категории система должна сохранять её идентификатор и связи с товарами, обновлять название, нормализованное имя и описание. После переименования новые данные категории должны отображаться у связанных товаров. Конфликт имени должен отклоняться без частичного изменения записи.</w:t>
+      </w:r>
+    </w:p>
+    <w:p>
+      <w:pPr>
+        <w:keepLines/>
+        <w:jc w:val="both"/>
+      </w:pPr>
+      <w:r>
+        <w:rPr>
+          <w:b/>
+        </w:rPr>
+        <w:t xml:space="preserve">ФТ-9. </w:t>
+      </w:r>
+      <w:r>
+        <w:t>Перед удалением категории система должна проверять наличие связанных товаров. При наличии товаров изменяющий запрос должен получать 409, категория и товары должны сохраняться; HTML-страница подтверждения должна объяснять запрет и содержать ссылку на эти товары. Пустая категория должна удаляться после подтверждения.</w:t>
+      </w:r>
+    </w:p>
+    <w:p>
+      <w:pPr>
+        <w:keepLines/>
+        <w:jc w:val="both"/>
+      </w:pPr>
+      <w:r>
+        <w:rPr>
+          <w:b/>
+        </w:rPr>
+        <w:t xml:space="preserve">ФТ-10. </w:t>
+      </w:r>
+      <w:r>
+        <w:t>При поиске система должна преобразовывать запрос тем же способом, что и название товара: NFKC, удаление крайних пробелов и casefold. Отбор должен выполняться по вхождению строки в нормализованное название. Символы процента, подчёркивания и косой черты должны восприниматься буквально.</w:t>
+      </w:r>
+    </w:p>
+    <w:p>
+      <w:pPr>
+        <w:keepLines/>
+        <w:jc w:val="both"/>
+      </w:pPr>
+      <w:r>
+        <w:rPr>
+          <w:b/>
+        </w:rPr>
+        <w:t xml:space="preserve">ФТ-11. </w:t>
+      </w:r>
+      <w:r>
+        <w:t>Система должна совместно применять поиск, категорию, включительные границы цены и наличие. Наличие должно означать quantity больше нуля. Неверный диапазон должен отклоняться с кодом 422. После сброса условий система должна возвращать общий список без прежних фильтров.</w:t>
+      </w:r>
+    </w:p>
+    <w:p>
+      <w:pPr>
+        <w:keepLines/>
+        <w:jc w:val="both"/>
+      </w:pPr>
+      <w:r>
+        <w:rPr>
+          <w:b/>
+        </w:rPr>
+        <w:t xml:space="preserve">ФТ-12. </w:t>
+      </w:r>
+      <w:r>
+        <w:t>Система должна выбирать сортировку только из name_asc, name_desc, price_asc, price_desc и updated_desc. При совпадении основного значения записи должны дополнительно упорядочиваться по id по возрастанию. Неизвестное значение сортировки должно возвращать 422.</w:t>
+      </w:r>
+    </w:p>
+    <w:p>
+      <w:pPr>
+        <w:keepLines/>
+        <w:jc w:val="both"/>
+      </w:pPr>
+      <w:r>
+        <w:rPr>
+          <w:b/>
+        </w:rPr>
+        <w:t xml:space="preserve">ФТ-13. </w:t>
+      </w:r>
+      <w:r>
+        <w:t>Система должна считать общее число записей по тем же условиям, что используются для выборки, и возвращать до 10 товаров с соответствующим смещением. HTML-ссылки страниц должны сохранять поиск, фильтры и сортировку. Отправка нового набора фильтров должна начинать просмотр с первой страницы.</w:t>
+      </w:r>
+    </w:p>
+    <w:p>
+      <w:pPr>
+        <w:keepLines/>
+        <w:jc w:val="both"/>
+      </w:pPr>
+      <w:r>
+        <w:rPr>
+          <w:b/>
+        </w:rPr>
+        <w:t xml:space="preserve">ФТ-14. </w:t>
+      </w:r>
+      <w:r>
+        <w:t>При ошибке данных или конфликте в форме создания или редактирования система должна возвращать эту форму с исходным вводом и объяснением. После успешного создания, изменения или удаления система должна показывать соответствующее уведомление. Результат сохранения формы должен открываться отдельным GET после перенаправления 303.</w:t>
+      </w:r>
+    </w:p>
+    <w:p>
+      <w:pPr>
+        <w:keepLines/>
+        <w:jc w:val="both"/>
+      </w:pPr>
+      <w:r>
+        <w:rPr>
+          <w:b/>
+        </w:rPr>
+        <w:t xml:space="preserve">ФТ-15. </w:t>
+      </w:r>
+      <w:r>
+        <w:t>Система должна предоставлять десять операций JSON API для товаров и категорий и описывать их в OpenAPI. Для ошибочных запросов API должен возвращать JSON: 422 при неверном вводе, 404 при отсутствии объекта и 409 при конфликте уникальности или связи. Обращения к HTML и API должны вызывать общие операции каталога.</w:t>
       </w:r>
     </w:p>
     <w:p>
@@ -2964,7 +3205,7 @@
         <w:pStyle w:val="Heading1"/>
       </w:pPr>
       <w:r>
-        <w:t>Нефункциональные и технические требования</w:t>
+        <w:t>Нефункциональные требования</w:t>
       </w:r>
     </w:p>
     <w:p>
@@ -2979,7 +3220,7 @@
         <w:t xml:space="preserve">НФТ-1. </w:t>
       </w:r>
       <w:r>
-        <w:t>Модуль должен работать на Python 3.12 с FastAPI, Jinja2, SQLAlchemy, SQLite и Uvicorn. Версии зависимостей должны быть закреплены в файлах установки проекта.</w:t>
+        <w:t>Совместимость среды: приложение должно работать на Python 3.12 в предусмотренных проектом средах macOS и Linux. Зависимости должны устанавливаться в отдельное виртуальное окружение из закреплённых файлов проекта.</w:t>
       </w:r>
     </w:p>
     <w:p>
@@ -2994,7 +3235,7 @@
         <w:t xml:space="preserve">НФТ-2. </w:t>
       </w:r>
       <w:r>
-        <w:t>Рабочие данные должны храниться в локальном файле SQLite и сохраняться после остановки и повторного запуска сервера. При запуске должны создаваться отсутствующие таблицы без удаления существующих записей.</w:t>
+        <w:t>Сохранность данных: зафиксированные записи обычной SQLite-базы должны сохраняться после штатной остановки и повторного запуска сервера. Отклонённая запись не должна оставлять частично сохранённые изменения.</w:t>
       </w:r>
     </w:p>
     <w:p>
@@ -3009,7 +3250,7 @@
         <w:t xml:space="preserve">НФТ-3. </w:t>
       </w:r>
       <w:r>
-        <w:t>Доступ к каталогу должен предоставляться через HTML-страницы и JSON API с общими правилами обработки данных. Программные операции должны быть описаны в OpenAPI.</w:t>
+        <w:t>Удобство использования: поля форм должны иметь видимые подписи, а ошибки — текстовое объяснение причины отказа. После ошибки корректно заполненные поля не должны очищаться.</w:t>
       </w:r>
     </w:p>
     <w:p>
@@ -3024,7 +3265,7 @@
         <w:t xml:space="preserve">НФТ-4. </w:t>
       </w:r>
       <w:r>
-        <w:t>Основные формы и операции каталога должны работать без JavaScript. Страницы должны использовать локальные стили и адаптироваться к узкому экрану; широкая таблица должна прокручиваться в своём контейнере.</w:t>
+        <w:t>Адаптивность: страницы должны подстраиваться под узкий экран, а широкая таблица — прокручиваться в своём контейнере. Основные формы и операции каталога должны оставаться доступными без JavaScript.</w:t>
       </w:r>
     </w:p>
     <w:p>
@@ -3039,7 +3280,7 @@
         <w:t xml:space="preserve">НФТ-5. </w:t>
       </w:r>
       <w:r>
-        <w:t>Сервер должен повторно проверять данные независимо от проверки в браузере. Пользовательский текст в HTML должен экранироваться, а значения запросов к базе — передаваться параметрами.</w:t>
+        <w:t>Безопасность обработки ввода: сервер не должен полагаться только на проверку браузера. Пользовательский текст в HTML должен экранироваться, а значения запросов к базе — передаваться параметрами.</w:t>
       </w:r>
     </w:p>
     <w:p>
@@ -3054,7 +3295,7 @@
         <w:t xml:space="preserve">НФТ-6. </w:t>
       </w:r>
       <w:r>
-        <w:t>Входные схемы должны отклонять лишние поля и недопустимые типы. JSON API должен возвращать 422 при ошибке ввода, 404 при отсутствии объекта и 409 при конфликте уникальности или связи.</w:t>
+        <w:t>Изолированность проверки: тесты базы, API, HTML и загрузчика должны использовать отдельные временные базы без изменения рабочего каталога. Команды установки, запуска и проверки должны быть приведены в README.</w:t>
       </w:r>
     </w:p>
     <w:p>
@@ -3069,7 +3310,7 @@
         <w:t xml:space="preserve">НФТ-7. </w:t>
       </w:r>
       <w:r>
-        <w:t>После успешной изменяющей HTML-операции сервер должен перенаправлять браузер на страницу результата с кодом 303. Обновление этой страницы не должно повторять сохранение формы.</w:t>
+        <w:t>Сопровождаемость: модели хранения, входные схемы, операции каталога и представления должны быть разделены по модулям. HTML и JSON API должны использовать общий слой операций без дублирования правил записи.</w:t>
       </w:r>
     </w:p>
     <w:p>
@@ -3084,7 +3325,7 @@
         <w:t xml:space="preserve">НФТ-8. </w:t>
       </w:r>
       <w:r>
-        <w:t>Проверки базы, API, HTML и загрузчика должны выполняться на отдельных временных базах, не изменяя рабочий каталог. Команды установки, запуска и проверки должны быть приведены в README.</w:t>
+        <w:t>Доступность локального интерфейса: после установки зависимостей основные страницы каталога должны работать без загрузки стилей и скриптов из внешних CDN. Внешние файлы Swagger допускаются только для интерфейса документации API.</w:t>
       </w:r>
     </w:p>
     <w:p>

</xml_diff>

<commit_message>
Rewrite requirements as a development specification and verify separately
</commit_message>
<xml_diff>
--- a/docs/requirements/technical_requirements.docx
+++ b/docs/requirements/technical_requirements.docx
@@ -36,10 +36,50 @@
     </w:p>
     <w:p>
       <w:pPr>
+        <w:pStyle w:val="Heading1"/>
+      </w:pPr>
+      <w:r>
+        <w:t>Основание и цель разработки</w:t>
+      </w:r>
+    </w:p>
+    <w:p>
+      <w:pPr>
         <w:jc w:val="both"/>
       </w:pPr>
       <w:r>
-        <w:t>Назначение: локальное ведение товаров и категорий интернет-магазина. Пользователь — менеджер каталога. Авторизация, заказы, оплата, доставка и история складских движений в состав модуля не входят.</w:t>
+        <w:t>Основание для разработки — учебное задание на создание модуля управления каталогом товаров интернет-магазина. Документ устанавливает требуемые возможности, правила работы с данными и условия приёмки.</w:t>
+      </w:r>
+    </w:p>
+    <w:p>
+      <w:pPr>
+        <w:jc w:val="both"/>
+      </w:pPr>
+      <w:r>
+        <w:t>Цель — предоставить менеджеру единый инструмент для ведения товаров и категорий, изменения цен и остатков, поиска и отбора ассортимента. Результатом разработки должен стать запускаемый программный модуль с сохраняемой базой данных и веб-интерфейсом.</w:t>
+      </w:r>
+    </w:p>
+    <w:p>
+      <w:pPr>
+        <w:pStyle w:val="Heading1"/>
+      </w:pPr>
+      <w:r>
+        <w:t>Границы системы</w:t>
+      </w:r>
+    </w:p>
+    <w:p>
+      <w:pPr>
+        <w:jc w:val="both"/>
+      </w:pPr>
+      <w:r>
+        <w:t>Модуль должен быть рассчитан на локальную работу одного менеджера. В его состав должны входить товары, категории, цены, текущие остатки и операции с этими данными.</w:t>
+      </w:r>
+    </w:p>
+    <w:p>
+      <w:pPr>
+        <w:jc w:val="both"/>
+      </w:pPr>
+      <w:r>
+        <w:t>Заказы, оплата, доставка, личные кабинеты покупателей, разграничение прав сотрудников, изображения товаров, иерархия категорий и журнал складских движений в первую версию не включаются. Значение остатка должно отражать текущее количество товара, а не историю его поступления и списания.</w:t>
       </w:r>
     </w:p>
     <w:p>
@@ -56,7 +96,7 @@
         <w:ind w:left="360"/>
       </w:pPr>
       <w:r>
-        <w:t>ПТ-1. Менеджер каталога должен иметь возможность работать с товарами:</w:t>
+        <w:t>ПТ-1. Работа менеджера с товарами</w:t>
       </w:r>
     </w:p>
     <w:p>
@@ -72,7 +112,7 @@
         <w:t xml:space="preserve">ПТ-1.1. </w:t>
       </w:r>
       <w:r>
-        <w:t>просматривать список товаров с названием, артикулом, категорией, ценой и текущим остатком;</w:t>
+        <w:t>Менеджер должен видеть ассортимент в виде списка с основными сведениями о каждой позиции.</w:t>
       </w:r>
     </w:p>
     <w:p>
@@ -88,7 +128,7 @@
         <w:t xml:space="preserve">ПТ-1.2. </w:t>
       </w:r>
       <w:r>
-        <w:t>открывать карточку товара с описанием и датами создания и изменения;</w:t>
+        <w:t>Менеджер должен получать подробные сведения о выбранном товаре в отдельной карточке.</w:t>
       </w:r>
     </w:p>
     <w:p>
@@ -104,7 +144,7 @@
         <w:t xml:space="preserve">ПТ-1.3. </w:t>
       </w:r>
       <w:r>
-        <w:t>добавлять товар, указывая название, артикул, категорию, цену, остаток и необязательное описание;</w:t>
+        <w:t>Менеджер должен иметь возможность вносить в каталог новые товарные позиции.</w:t>
       </w:r>
     </w:p>
     <w:p>
@@ -120,7 +160,7 @@
         <w:t xml:space="preserve">ПТ-1.4. </w:t>
       </w:r>
       <w:r>
-        <w:t>изменять сведения о товаре, включая его категорию, цену и остаток;</w:t>
+        <w:t>Менеджер должен иметь возможность исправлять сведения о товаре, его цену, остаток и принадлежность к категории.</w:t>
       </w:r>
     </w:p>
     <w:p>
@@ -136,7 +176,7 @@
         <w:t xml:space="preserve">ПТ-1.5. </w:t>
       </w:r>
       <w:r>
-        <w:t>удалять товар после отдельного подтверждения действия.</w:t>
+        <w:t>Менеджер должен иметь возможность удалять ненужную товарную позицию с подтверждением действия.</w:t>
       </w:r>
     </w:p>
     <w:p>
@@ -145,7 +185,7 @@
         <w:ind w:left="360"/>
       </w:pPr>
       <w:r>
-        <w:t>ПТ-2. Менеджер каталога должен иметь возможность работать с категориями:</w:t>
+        <w:t>ПТ-2. Работа менеджера с категориями</w:t>
       </w:r>
     </w:p>
     <w:p>
@@ -161,7 +201,7 @@
         <w:t xml:space="preserve">ПТ-2.1. </w:t>
       </w:r>
       <w:r>
-        <w:t>просматривать список категорий с количеством товаров в каждой;</w:t>
+        <w:t>Менеджер должен видеть перечень категорий и количество относящихся к ним товаров.</w:t>
       </w:r>
     </w:p>
     <w:p>
@@ -177,7 +217,7 @@
         <w:t xml:space="preserve">ПТ-2.2. </w:t>
       </w:r>
       <w:r>
-        <w:t>создавать категорию, указывая название и необязательное описание;</w:t>
+        <w:t>Менеджер должен иметь возможность добавлять категории для организации ассортимента.</w:t>
       </w:r>
     </w:p>
     <w:p>
@@ -193,7 +233,7 @@
         <w:t xml:space="preserve">ПТ-2.3. </w:t>
       </w:r>
       <w:r>
-        <w:t>изменять название и описание категории;</w:t>
+        <w:t>Менеджер должен иметь возможность переименовывать категории и изменять их описание.</w:t>
       </w:r>
     </w:p>
     <w:p>
@@ -209,7 +249,7 @@
         <w:t xml:space="preserve">ПТ-2.4. </w:t>
       </w:r>
       <w:r>
-        <w:t>переходить из списка категорий к товарам выбранной категории;</w:t>
+        <w:t>Менеджер должен иметь возможность открыть товары определённой категории.</w:t>
       </w:r>
     </w:p>
     <w:p>
@@ -225,7 +265,7 @@
         <w:t xml:space="preserve">ПТ-2.5. </w:t>
       </w:r>
       <w:r>
-        <w:t>удалять категорию, если в ней нет товаров.</w:t>
+        <w:t>Менеджер должен иметь возможность удалить категорию, которая больше не используется.</w:t>
       </w:r>
     </w:p>
     <w:p>
@@ -234,7 +274,7 @@
         <w:ind w:left="360"/>
       </w:pPr>
       <w:r>
-        <w:t>ПТ-3. Менеджер каталога должен иметь возможность искать и отбирать товары:</w:t>
+        <w:t>ПТ-3. Поиск нужных позиций</w:t>
       </w:r>
     </w:p>
     <w:p>
@@ -250,7 +290,7 @@
         <w:t xml:space="preserve">ПТ-3.1. </w:t>
       </w:r>
       <w:r>
-        <w:t>искать товары по части названия без учёта регистра русского текста;</w:t>
+        <w:t>Менеджер должен находить товары по фрагменту названия независимо от регистра русских букв.</w:t>
       </w:r>
     </w:p>
     <w:p>
@@ -266,7 +306,7 @@
         <w:t xml:space="preserve">ПТ-3.2. </w:t>
       </w:r>
       <w:r>
-        <w:t>отбирать товары по категории и диапазону цены;</w:t>
+        <w:t>Менеджер должен отбирать товары по категории и требуемому диапазону цены.</w:t>
       </w:r>
     </w:p>
     <w:p>
@@ -282,7 +322,7 @@
         <w:t xml:space="preserve">ПТ-3.3. </w:t>
       </w:r>
       <w:r>
-        <w:t>показывать только товары с остатком больше нуля;</w:t>
+        <w:t>Менеджер должен иметь возможность отдельно просмотреть товары, имеющиеся в наличии.</w:t>
       </w:r>
     </w:p>
     <w:p>
@@ -298,7 +338,7 @@
         <w:t xml:space="preserve">ПТ-3.4. </w:t>
       </w:r>
       <w:r>
-        <w:t>одновременно применять поиск, фильтры и выбранную сортировку;</w:t>
+        <w:t>Менеджер должен иметь возможность сочетать несколько условий отбора.</w:t>
       </w:r>
     </w:p>
     <w:p>
@@ -314,7 +354,7 @@
         <w:t xml:space="preserve">ПТ-3.5. </w:t>
       </w:r>
       <w:r>
-        <w:t>сбрасывать условия отбора и возвращаться к общему списку товаров.</w:t>
+        <w:t>Менеджер должен иметь возможность убрать выбранные условия и вернуться к полному списку.</w:t>
       </w:r>
     </w:p>
     <w:p>
@@ -323,7 +363,7 @@
         <w:ind w:left="360"/>
       </w:pPr>
       <w:r>
-        <w:t>ПТ-4. Менеджер каталога должен иметь возможность управлять выводом списка:</w:t>
+        <w:t>ПТ-4. Просмотр больших списков</w:t>
       </w:r>
     </w:p>
     <w:p>
@@ -339,7 +379,7 @@
         <w:t xml:space="preserve">ПТ-4.1. </w:t>
       </w:r>
       <w:r>
-        <w:t>сортировать товары по названию или цене по возрастанию и убыванию;</w:t>
+        <w:t>Менеджер должен иметь возможность упорядочивать товары по названию и цене в обоих направлениях.</w:t>
       </w:r>
     </w:p>
     <w:p>
@@ -355,7 +395,7 @@
         <w:t xml:space="preserve">ПТ-4.2. </w:t>
       </w:r>
       <w:r>
-        <w:t>выбирать порядок по времени последнего изменения, начиная с недавних;</w:t>
+        <w:t>Менеджер должен иметь возможность просматривать недавно изменённые позиции в начале списка.</w:t>
       </w:r>
     </w:p>
     <w:p>
@@ -371,7 +411,7 @@
         <w:t xml:space="preserve">ПТ-4.3. </w:t>
       </w:r>
       <w:r>
-        <w:t>просматривать список страницами по 10 товаров и видеть общее число результатов;</w:t>
+        <w:t>Менеджер должен просматривать результаты небольшими страницами и видеть общее число найденных товаров.</w:t>
       </w:r>
     </w:p>
     <w:p>
@@ -387,7 +427,7 @@
         <w:t xml:space="preserve">ПТ-4.4. </w:t>
       </w:r>
       <w:r>
-        <w:t>переходить между страницами с сохранением действующих условий поиска и отбора.</w:t>
+        <w:t>Менеджер должен иметь возможность продолжать просмотр на следующей странице без повторного задания условий.</w:t>
       </w:r>
     </w:p>
     <w:p>
@@ -396,7 +436,7 @@
         <w:ind w:left="360"/>
       </w:pPr>
       <w:r>
-        <w:t>ПТ-5. Менеджер каталога должен получать обратную связь при выполнении операций:</w:t>
+        <w:t>ПТ-5. Контроль результата действий</w:t>
       </w:r>
     </w:p>
     <w:p>
@@ -412,7 +452,7 @@
         <w:t xml:space="preserve">ПТ-5.1. </w:t>
       </w:r>
       <w:r>
-        <w:t>видеть сообщение об успешном создании, изменении или удалении записи;</w:t>
+        <w:t>Менеджер должен получать подтверждение успешного изменения каталога.</w:t>
       </w:r>
     </w:p>
     <w:p>
@@ -428,7 +468,7 @@
         <w:t xml:space="preserve">ПТ-5.2. </w:t>
       </w:r>
       <w:r>
-        <w:t>получать объяснение ошибки ввода или конфликта с сохранением введённых значений формы;</w:t>
+        <w:t>Менеджер должен понимать причину отказа и исправлять ввод без повторного заполнения корректных полей.</w:t>
       </w:r>
     </w:p>
     <w:p>
@@ -444,7 +484,7 @@
         <w:t xml:space="preserve">ПТ-5.3. </w:t>
       </w:r>
       <w:r>
-        <w:t>отменять удаление на странице подтверждения, сохраняя запись;</w:t>
+        <w:t>Менеджер должен иметь возможность отказаться от удаления до его выполнения.</w:t>
       </w:r>
     </w:p>
     <w:p>
@@ -460,7 +500,7 @@
         <w:t xml:space="preserve">ПТ-5.4. </w:t>
       </w:r>
       <w:r>
-        <w:t>получать объяснение запрета удаления занятой категории и переходить к её товарам.</w:t>
+        <w:t>Менеджер должен получать объяснение, если удаление категории запрещено из-за связанных товаров.</w:t>
       </w:r>
     </w:p>
     <w:p>
@@ -469,14 +509,6 @@
       </w:pPr>
       <w:r>
         <w:t>Функциональные требования</w:t>
-      </w:r>
-    </w:p>
-    <w:p>
-      <w:pPr>
-        <w:jc w:val="both"/>
-      </w:pPr>
-      <w:r>
-        <w:t>Пользовательские требования выше описывают возможности менеджера. Функциональные требования ниже задают действия системы, состав результата и реакцию на ошибочные запросы.</w:t>
       </w:r>
     </w:p>
     <w:p>
@@ -491,7 +523,7 @@
         <w:t xml:space="preserve">ФТ-1. </w:t>
       </w:r>
       <w:r>
-        <w:t>Система должна формировать список товаров с идентификатором, названием, артикулом, категорией, ценой и остатком. JSON-ответ списка должен содержать items, total, page и page_size; HTML-страница — показывать записи, число результатов и навигацию.</w:t>
+        <w:t>Система должна формировать список товаров с названием, артикулом, категорией, ценой и остатком. При пустом каталоге система должна сообщать об отсутствии записей и предлагать добавление первой позиции.</w:t>
       </w:r>
     </w:p>
     <w:p>
@@ -506,7 +538,7 @@
         <w:t xml:space="preserve">ФТ-2. </w:t>
       </w:r>
       <w:r>
-        <w:t>По идентификатору товара система должна возвращать его карточку: название, артикул, описание, категорию, цену, остаток и даты создания и изменения. При отсутствии записи система должна возвращать 404 без изменения каталога.</w:t>
+        <w:t>Система должна открывать карточку выбранного товара с основными сведениями, описанием и датами создания и изменения. Если товар не существует, система должна сообщать об этом без изменения данных.</w:t>
       </w:r>
     </w:p>
     <w:p>
@@ -521,7 +553,7 @@
         <w:t xml:space="preserve">ФТ-3. </w:t>
       </w:r>
       <w:r>
-        <w:t>При создании товара система должна проверять обязательные поля, существование категории и уникальность артикула, преобразовывать цену в копейки и сохранять запись с новым идентификатором и датами. JSON API должен возвращать созданный товар с кодом 201; HTML-маршрут — перенаправлять на его карточку с кодом 303.</w:t>
+        <w:t>Система должна принимать сведения о новом товаре, проверять обязательные значения и правила данных, после успешной проверки сохранять товар и предоставлять доступ к его карточке.</w:t>
       </w:r>
     </w:p>
     <w:p>
@@ -536,7 +568,7 @@
         <w:t xml:space="preserve">ФТ-4. </w:t>
       </w:r>
       <w:r>
-        <w:t>При полном изменении товара система должна принимать все обязательные редактируемые поля, проверять данные и сохранять изменения в существующей записи. Идентификатор и дата создания должны сохраняться. При конфликте артикула с другим товаром система должна возвращать 409 и сохранять прежние значения.</w:t>
+        <w:t>Система должна загружать сведения о существующем товаре в форму редактирования и сохранять допустимые изменения в той же записи. При отказе прежние данные должны оставаться доступными.</w:t>
       </w:r>
     </w:p>
     <w:p>
@@ -551,7 +583,7 @@
         <w:t xml:space="preserve">ФТ-5. </w:t>
       </w:r>
       <w:r>
-        <w:t>В HTML-интерфейсе по запросу подтверждения удаления система должна показывать название и артикул товара без изменения базы. Отмена должна возвращать карточку. Только изменяющий запрос должен удалять товар; его категория должна сохраняться. JSON API должен возвращать 204 без тела, HTML-маршрут — перенаправлять в список с кодом 303.</w:t>
+        <w:t>Система должна запрашивать подтверждение удаления с указанием удаляемого товара. Отмена должна сохранять запись; подтверждение должно удалять только выбранный товар и возвращать менеджера к списку.</w:t>
       </w:r>
     </w:p>
     <w:p>
@@ -566,7 +598,7 @@
         <w:t xml:space="preserve">ФТ-6. </w:t>
       </w:r>
       <w:r>
-        <w:t>Система должна формировать список категорий с названиями и описаниями, а в HTML-интерфейсе дополнительно показывать число товаров каждой категории. Переход по этому счётчику должен открывать список товаров с выбранным category_id.</w:t>
+        <w:t>Система должна формировать список категорий с названиями, описаниями и количеством товаров. Из этого списка должен быть доступен переход к товарам выбранной категории.</w:t>
       </w:r>
     </w:p>
     <w:p>
@@ -581,7 +613,7 @@
         <w:t xml:space="preserve">ФТ-7. </w:t>
       </w:r>
       <w:r>
-        <w:t>При создании категории система должна удалять крайние пробелы, формировать нормализованное имя и проверять его уникальность. При допустимом вводе система должна сохранять категорию; при совпадении нормализованного имени — возвращать 409 без добавления записи.</w:t>
+        <w:t>Система должна создавать категорию после проверки заполнения названия и отсутствия эквивалентного имени. Ошибка не должна приводить к созданию дополнительной записи.</w:t>
       </w:r>
     </w:p>
     <w:p>
@@ -596,7 +628,7 @@
         <w:t xml:space="preserve">ФТ-8. </w:t>
       </w:r>
       <w:r>
-        <w:t>При изменении категории система должна сохранять её идентификатор и связи с товарами, обновлять название, нормализованное имя и описание. После переименования новые данные категории должны отображаться у связанных товаров. Конфликт имени должен отклоняться без частичного изменения записи.</w:t>
+        <w:t>Система должна изменять название и описание категории, сохраняя её связь с товарами. Новое название должно отображаться при последующем просмотре связанных товаров.</w:t>
       </w:r>
     </w:p>
     <w:p>
@@ -611,7 +643,7 @@
         <w:t xml:space="preserve">ФТ-9. </w:t>
       </w:r>
       <w:r>
-        <w:t>Перед удалением категории система должна проверять наличие связанных товаров. При наличии товаров изменяющий запрос должен получать 409, категория и товары должны сохраняться; HTML-страница подтверждения должна объяснять запрет и содержать ссылку на эти товары. Пустая категория должна удаляться после подтверждения.</w:t>
+        <w:t>Система должна перед удалением категории проверять, используются ли её данные товарами. Занятую категорию удалять нельзя; система должна объяснять причину и предоставлять переход к связанным товарам.</w:t>
       </w:r>
     </w:p>
     <w:p>
@@ -626,7 +658,7 @@
         <w:t xml:space="preserve">ФТ-10. </w:t>
       </w:r>
       <w:r>
-        <w:t>При поиске система должна преобразовывать запрос тем же способом, что и название товара: NFKC, удаление крайних пробелов и casefold. Отбор должен выполняться по вхождению строки в нормализованное название. Символы процента, подчёркивания и косой черты должны восприниматься буквально.</w:t>
+        <w:t>Система должна находить товары по вхождению введённого фрагмента в название без учёта регистра. Введённые символы должны рассматриваться как текст поиска, а не как команды или специальные шаблоны.</w:t>
       </w:r>
     </w:p>
     <w:p>
@@ -641,7 +673,7 @@
         <w:t xml:space="preserve">ФТ-11. </w:t>
       </w:r>
       <w:r>
-        <w:t>Система должна совместно применять поиск, категорию, включительные границы цены и наличие. Наличие должно означать quantity больше нуля. Неверный диапазон должен отклоняться с кодом 422. После сброса условий система должна возвращать общий список без прежних фильтров.</w:t>
+        <w:t>Система должна применять выбранные условия поиска, категории, цены и наличия совместно. При отсутствии подходящих товаров должна выводиться пустая выдача с возможностью изменить или сбросить условия.</w:t>
       </w:r>
     </w:p>
     <w:p>
@@ -656,7 +688,7 @@
         <w:t xml:space="preserve">ФТ-12. </w:t>
       </w:r>
       <w:r>
-        <w:t>Система должна выбирать сортировку только из name_asc, name_desc, price_asc, price_desc и updated_desc. При совпадении основного значения записи должны дополнительно упорядочиваться по id по возрастанию. Неизвестное значение сортировки должно возвращать 422.</w:t>
+        <w:t>Система должна упорядочивать результаты по названию или цене по возрастанию и убыванию, а также по времени изменения от новых к старым. При равных значениях порядок должен оставаться однозначным.</w:t>
       </w:r>
     </w:p>
     <w:p>
@@ -671,7 +703,7 @@
         <w:t xml:space="preserve">ФТ-13. </w:t>
       </w:r>
       <w:r>
-        <w:t>Система должна считать общее число записей по тем же условиям, что используются для выборки, и возвращать до 10 товаров с соответствующим смещением. HTML-ссылки страниц должны сохранять поиск, фильтры и сортировку. Отправка нового набора фильтров должна начинать просмотр с первой страницы.</w:t>
+        <w:t>Система должна выводить до 10 товаров на странице, показывать число результатов и текущую страницу. Переходы должны сохранять условия отбора и сортировки; новый поиск должен начинаться с первой страницы.</w:t>
       </w:r>
     </w:p>
     <w:p>
@@ -686,7 +718,7 @@
         <w:t xml:space="preserve">ФТ-14. </w:t>
       </w:r>
       <w:r>
-        <w:t>При ошибке данных или конфликте в форме создания или редактирования система должна возвращать эту форму с исходным вводом и объяснением. После успешного создания, изменения или удаления система должна показывать соответствующее уведомление. Результат сохранения формы должен открываться отдельным GET после перенаправления 303.</w:t>
+        <w:t>Система должна проверять данные до сохранения, сообщать об успешном действии либо причине отказа и сохранять введённые значения при ошибке формы. Повторный просмотр результата сохранения не должен заново выполнять то же изменение.</w:t>
       </w:r>
     </w:p>
     <w:p>
@@ -701,7 +733,7 @@
         <w:t xml:space="preserve">ФТ-15. </w:t>
       </w:r>
       <w:r>
-        <w:t>Система должна предоставлять десять операций JSON API для товаров и категорий и описывать их в OpenAPI. Для ошибочных запросов API должен возвращать JSON: 422 при неверном вводе, 404 при отсутствии объекта и 409 при конфликте уникальности или связи. Обращения к HTML и API должны вызывать общие операции каталога.</w:t>
+        <w:t>Система должна сохранять зафиксированные сведения между сеансами работы. Повторный запуск должен предоставлять доступ к ранее внесённым товарам и категориям без повторного ввода данных.</w:t>
       </w:r>
     </w:p>
     <w:p>
@@ -714,19 +746,19 @@
     </w:p>
     <w:p>
       <w:pPr>
+        <w:jc w:val="both"/>
+      </w:pPr>
+      <w:r>
+        <w:t>Атрибуты задаются на уровне предметной области. Названия полей хранения, технические ключи и способы представления значений должны определяться при проектировании.</w:t>
+      </w:r>
+    </w:p>
+    <w:p>
+      <w:pPr>
         <w:pStyle w:val="Heading2"/>
         <w:ind w:left="360"/>
       </w:pPr>
       <w:r>
         <w:t>Сущность «Категория»</w:t>
-      </w:r>
-    </w:p>
-    <w:p>
-      <w:pPr>
-        <w:jc w:val="both"/>
-      </w:pPr>
-      <w:r>
-        <w:t>Обязательность ниже относится к сохранённой записи. Системные поля заполняет приложение; пользователь вводит название и необязательное описание.</w:t>
       </w:r>
     </w:p>
     <w:tbl>
@@ -831,7 +863,7 @@
                 <w:b/>
                 <w:sz w:val="24"/>
               </w:rPr>
-              <w:t>id</w:t>
+              <w:t>Идентификатор категории</w:t>
             </w:r>
           </w:p>
         </w:tc>
@@ -852,7 +884,7 @@
                 <w:b w:val="0"/>
                 <w:sz w:val="24"/>
               </w:rPr>
-              <w:t>Целое; обязательный, системный</w:t>
+              <w:t>Идентификатор; обязательный, системный</w:t>
             </w:r>
           </w:p>
         </w:tc>
@@ -873,7 +905,7 @@
                 <w:b w:val="0"/>
                 <w:sz w:val="24"/>
               </w:rPr>
-              <w:t>Первичный ключ. Создаётся базой и используется в связях и адресах. Через API не редактируется.</w:t>
+              <w:t>Однозначно определяет категорию и сохраняется при её переименовании.</w:t>
             </w:r>
           </w:p>
         </w:tc>
@@ -899,7 +931,7 @@
                 <w:b/>
                 <w:sz w:val="24"/>
               </w:rPr>
-              <w:t>name</w:t>
+              <w:t>Название категории</w:t>
             </w:r>
           </w:p>
         </w:tc>
@@ -941,7 +973,7 @@
                 <w:b w:val="0"/>
                 <w:sz w:val="24"/>
               </w:rPr>
-              <w:t>Название категории: 1–100 символов после удаления крайних пробелов.</w:t>
+              <w:t>Обозначает группу товаров. Должно быть непустым и отличаться от названий других категорий.</w:t>
             </w:r>
           </w:p>
         </w:tc>
@@ -967,7 +999,7 @@
                 <w:b/>
                 <w:sz w:val="24"/>
               </w:rPr>
-              <w:t>name_normalized</w:t>
+              <w:t>Описание категории</w:t>
             </w:r>
           </w:p>
         </w:tc>
@@ -988,7 +1020,7 @@
                 <w:b w:val="0"/>
                 <w:sz w:val="24"/>
               </w:rPr>
-              <w:t>Текст; обязательный, служебный</w:t>
+              <w:t>Текст; необязательный</w:t>
             </w:r>
           </w:p>
         </w:tc>
@@ -1009,75 +1041,7 @@
                 <w:b w:val="0"/>
                 <w:sz w:val="24"/>
               </w:rPr>
-              <w:t>Нормализованное название для сравнения. Непустое и уникальное; обновляется при переименовании.</w:t>
-            </w:r>
-          </w:p>
-        </w:tc>
-      </w:tr>
-      <w:tr>
-        <w:trPr>
-          <w:cantSplit/>
-        </w:trPr>
-        <w:tc>
-          <w:tcPr>
-            <w:tcW w:type="dxa" w:w="2381"/>
-            <w:vAlign w:val="center"/>
-          </w:tcPr>
-          <w:p>
-            <w:pPr>
-              <w:keepNext w:val="0"/>
-              <w:spacing w:line="240" w:lineRule="auto" w:before="0" w:after="60"/>
-              <w:jc w:val="left"/>
-            </w:pPr>
-            <w:r>
-              <w:rPr>
-                <w:rFonts w:ascii="Times New Roman" w:hAnsi="Times New Roman"/>
-                <w:b/>
-                <w:sz w:val="24"/>
-              </w:rPr>
-              <w:t>description</w:t>
-            </w:r>
-          </w:p>
-        </w:tc>
-        <w:tc>
-          <w:tcPr>
-            <w:tcW w:type="dxa" w:w="1984"/>
-            <w:vAlign w:val="center"/>
-          </w:tcPr>
-          <w:p>
-            <w:pPr>
-              <w:keepNext w:val="0"/>
-              <w:spacing w:line="240" w:lineRule="auto" w:before="0" w:after="60"/>
-              <w:jc w:val="left"/>
-            </w:pPr>
-            <w:r>
-              <w:rPr>
-                <w:rFonts w:ascii="Times New Roman" w:hAnsi="Times New Roman"/>
-                <w:b w:val="0"/>
-                <w:sz w:val="24"/>
-              </w:rPr>
-              <w:t>Текст или NULL; необязательный</w:t>
-            </w:r>
-          </w:p>
-        </w:tc>
-        <w:tc>
-          <w:tcPr>
-            <w:tcW w:type="dxa" w:w="4661"/>
-            <w:vAlign w:val="center"/>
-          </w:tcPr>
-          <w:p>
-            <w:pPr>
-              <w:keepNext w:val="0"/>
-              <w:spacing w:line="240" w:lineRule="auto" w:before="0" w:after="60"/>
-              <w:jc w:val="left"/>
-            </w:pPr>
-            <w:r>
-              <w:rPr>
-                <w:rFonts w:ascii="Times New Roman" w:hAnsi="Times New Roman"/>
-                <w:b w:val="0"/>
-                <w:sz w:val="24"/>
-              </w:rPr>
-              <w:t>Описание категории, до 2000 символов. Пустой текст после удаления крайних пробелов сохраняется как NULL.</w:t>
+              <w:t>Поясняет, какие товары относятся к категории.</w:t>
             </w:r>
           </w:p>
         </w:tc>
@@ -1199,7 +1163,7 @@
                 <w:b/>
                 <w:sz w:val="24"/>
               </w:rPr>
-              <w:t>id</w:t>
+              <w:t>Идентификатор товара</w:t>
             </w:r>
           </w:p>
         </w:tc>
@@ -1220,7 +1184,7 @@
                 <w:b w:val="0"/>
                 <w:sz w:val="24"/>
               </w:rPr>
-              <w:t>Целое; обязательный, системный</w:t>
+              <w:t>Идентификатор; обязательный, системный</w:t>
             </w:r>
           </w:p>
         </w:tc>
@@ -1241,7 +1205,7 @@
                 <w:b w:val="0"/>
                 <w:sz w:val="24"/>
               </w:rPr>
-              <w:t>Первичный ключ. Назначается базой; при редактировании товара сохраняется.</w:t>
+              <w:t>Однозначно определяет товарную запись и сохраняется при её изменении.</w:t>
             </w:r>
           </w:p>
         </w:tc>
@@ -1267,7 +1231,7 @@
                 <w:b/>
                 <w:sz w:val="24"/>
               </w:rPr>
-              <w:t>name</w:t>
+              <w:t>Название товара</w:t>
             </w:r>
           </w:p>
         </w:tc>
@@ -1309,7 +1273,7 @@
                 <w:b w:val="0"/>
                 <w:sz w:val="24"/>
               </w:rPr>
-              <w:t>Название товара: 1–200 символов после удаления крайних пробелов. Совпадения названий разрешены.</w:t>
+              <w:t>Используется для распознавания товара и поиска. Совпадения названий допустимы.</w:t>
             </w:r>
           </w:p>
         </w:tc>
@@ -1335,75 +1299,7 @@
                 <w:b/>
                 <w:sz w:val="24"/>
               </w:rPr>
-              <w:t>name_normalized</w:t>
-            </w:r>
-          </w:p>
-        </w:tc>
-        <w:tc>
-          <w:tcPr>
-            <w:tcW w:type="dxa" w:w="1984"/>
-            <w:vAlign w:val="center"/>
-          </w:tcPr>
-          <w:p>
-            <w:pPr>
-              <w:keepNext w:val="0"/>
-              <w:spacing w:line="240" w:lineRule="auto" w:before="0" w:after="60"/>
-              <w:jc w:val="left"/>
-            </w:pPr>
-            <w:r>
-              <w:rPr>
-                <w:rFonts w:ascii="Times New Roman" w:hAnsi="Times New Roman"/>
-                <w:b w:val="0"/>
-                <w:sz w:val="24"/>
-              </w:rPr>
-              <w:t>Текст; обязательный, служебный</w:t>
-            </w:r>
-          </w:p>
-        </w:tc>
-        <w:tc>
-          <w:tcPr>
-            <w:tcW w:type="dxa" w:w="4661"/>
-            <w:vAlign w:val="center"/>
-          </w:tcPr>
-          <w:p>
-            <w:pPr>
-              <w:keepNext w:val="0"/>
-              <w:spacing w:line="240" w:lineRule="auto" w:before="0" w:after="60"/>
-              <w:jc w:val="left"/>
-            </w:pPr>
-            <w:r>
-              <w:rPr>
-                <w:rFonts w:ascii="Times New Roman" w:hAnsi="Times New Roman"/>
-                <w:b w:val="0"/>
-                <w:sz w:val="24"/>
-              </w:rPr>
-              <w:t>Нормализованное непустое название для поиска без учёта регистра.</w:t>
-            </w:r>
-          </w:p>
-        </w:tc>
-      </w:tr>
-      <w:tr>
-        <w:trPr>
-          <w:cantSplit/>
-        </w:trPr>
-        <w:tc>
-          <w:tcPr>
-            <w:tcW w:type="dxa" w:w="2381"/>
-            <w:vAlign w:val="center"/>
-          </w:tcPr>
-          <w:p>
-            <w:pPr>
-              <w:keepNext w:val="0"/>
-              <w:spacing w:line="240" w:lineRule="auto" w:before="0" w:after="60"/>
-              <w:jc w:val="left"/>
-            </w:pPr>
-            <w:r>
-              <w:rPr>
-                <w:rFonts w:ascii="Times New Roman" w:hAnsi="Times New Roman"/>
-                <w:b/>
-                <w:sz w:val="24"/>
-              </w:rPr>
-              <w:t>sku</w:t>
+              <w:t>Артикул</w:t>
             </w:r>
           </w:p>
         </w:tc>
@@ -1445,7 +1341,7 @@
                 <w:b w:val="0"/>
                 <w:sz w:val="24"/>
               </w:rPr>
-              <w:t>Уникальный артикул: 1–64 латинские буквы, цифры, дефисы или подчёркивания. Хранится в верхнем регистре.</w:t>
+              <w:t>Уникальное обозначение позиции ассортимента.</w:t>
             </w:r>
           </w:p>
         </w:tc>
@@ -1471,7 +1367,7 @@
                 <w:b/>
                 <w:sz w:val="24"/>
               </w:rPr>
-              <w:t>description</w:t>
+              <w:t>Категория товара</w:t>
             </w:r>
           </w:p>
         </w:tc>
@@ -1492,7 +1388,7 @@
                 <w:b w:val="0"/>
                 <w:sz w:val="24"/>
               </w:rPr>
-              <w:t>Текст или NULL; необязательный</w:t>
+              <w:t>Связь с категорией; обязательный</w:t>
             </w:r>
           </w:p>
         </w:tc>
@@ -1513,7 +1409,7 @@
                 <w:b w:val="0"/>
                 <w:sz w:val="24"/>
               </w:rPr>
-              <w:t>Описание товара, до 2000 символов. Пустое значение сохраняется как NULL.</w:t>
+              <w:t>Относит товар к одной существующей категории.</w:t>
             </w:r>
           </w:p>
         </w:tc>
@@ -1539,7 +1435,7 @@
                 <w:b/>
                 <w:sz w:val="24"/>
               </w:rPr>
-              <w:t>category_id</w:t>
+              <w:t>Цена</w:t>
             </w:r>
           </w:p>
         </w:tc>
@@ -1560,7 +1456,7 @@
                 <w:b w:val="0"/>
                 <w:sz w:val="24"/>
               </w:rPr>
-              <w:t>Целое; обязательный</w:t>
+              <w:t>Денежное значение; обязательный</w:t>
             </w:r>
           </w:p>
         </w:tc>
@@ -1581,7 +1477,7 @@
                 <w:b w:val="0"/>
                 <w:sz w:val="24"/>
               </w:rPr>
-              <w:t>Внешний ключ на categories.id. Должен указывать на существующую категорию.</w:t>
+              <w:t>Задаётся в рублях с точностью до копейки и не может быть отрицательной.</w:t>
             </w:r>
           </w:p>
         </w:tc>
@@ -1607,7 +1503,7 @@
                 <w:b/>
                 <w:sz w:val="24"/>
               </w:rPr>
-              <w:t>price_kopecks</w:t>
+              <w:t>Остаток</w:t>
             </w:r>
           </w:p>
         </w:tc>
@@ -1628,7 +1524,7 @@
                 <w:b w:val="0"/>
                 <w:sz w:val="24"/>
               </w:rPr>
-              <w:t>Целое; обязательный</w:t>
+              <w:t>Целое число; обязательный</w:t>
             </w:r>
           </w:p>
         </w:tc>
@@ -1649,7 +1545,7 @@
                 <w:b w:val="0"/>
                 <w:sz w:val="24"/>
               </w:rPr>
-              <w:t>Цена в копейках от 0 до 9223372036854775807. Внутреннее представление базы.</w:t>
+              <w:t>Количество доступных единиц товара, не меньшее нуля.</w:t>
             </w:r>
           </w:p>
         </w:tc>
@@ -1675,7 +1571,7 @@
                 <w:b/>
                 <w:sz w:val="24"/>
               </w:rPr>
-              <w:t>quantity</w:t>
+              <w:t>Описание товара</w:t>
             </w:r>
           </w:p>
         </w:tc>
@@ -1696,7 +1592,7 @@
                 <w:b w:val="0"/>
                 <w:sz w:val="24"/>
               </w:rPr>
-              <w:t>Целое; обязательный</w:t>
+              <w:t>Текст; необязательный</w:t>
             </w:r>
           </w:p>
         </w:tc>
@@ -1717,7 +1613,7 @@
                 <w:b w:val="0"/>
                 <w:sz w:val="24"/>
               </w:rPr>
-              <w:t>Текущий остаток от 0 до 9223372036854775807. В модели значение по умолчанию равно 0.</w:t>
+              <w:t>Содержит дополнительные характеристики позиции.</w:t>
             </w:r>
           </w:p>
         </w:tc>
@@ -1743,7 +1639,7 @@
                 <w:b/>
                 <w:sz w:val="24"/>
               </w:rPr>
-              <w:t>created_at</w:t>
+              <w:t>Дата создания</w:t>
             </w:r>
           </w:p>
         </w:tc>
@@ -1785,7 +1681,7 @@
                 <w:b w:val="0"/>
                 <w:sz w:val="24"/>
               </w:rPr>
-              <w:t>Время создания в UTC. Заполняется автоматически и сохраняется при редактировании.</w:t>
+              <w:t>Фиксирует первоначальное внесение товара. Вручную не редактируется.</w:t>
             </w:r>
           </w:p>
         </w:tc>
@@ -1811,7 +1707,7 @@
                 <w:b/>
                 <w:sz w:val="24"/>
               </w:rPr>
-              <w:t>updated_at</w:t>
+              <w:t>Дата изменения</w:t>
             </w:r>
           </w:p>
         </w:tc>
@@ -1853,7 +1749,7 @@
                 <w:b w:val="0"/>
                 <w:sz w:val="24"/>
               </w:rPr>
-              <w:t>Время последнего изменения в UTC. Обновляется моделью при изменении записи.</w:t>
+              <w:t>Фиксирует последнее изменение сведений. Вручную не редактируется.</w:t>
             </w:r>
           </w:p>
         </w:tc>
@@ -1863,39 +1759,6 @@
       <w:pPr>
         <w:spacing w:after="0"/>
       </w:pPr>
-    </w:p>
-    <w:p>
-      <w:pPr>
-        <w:pStyle w:val="Heading2"/>
-        <w:ind w:left="360"/>
-      </w:pPr>
-      <w:r>
-        <w:t>Представление данных в API</w:t>
-      </w:r>
-    </w:p>
-    <w:p>
-      <w:pPr>
-        <w:jc w:val="both"/>
-      </w:pPr>
-      <w:r>
-        <w:t>В запросе создания и полного изменения товара обязательны name, sku, category_id, price и quantity. Описание необязательно. Наличие значения по умолчанию quantity в модели не отменяет обязательность этого поля в JSON-запросе.</w:t>
-      </w:r>
-    </w:p>
-    <w:p>
-      <w:pPr>
-        <w:jc w:val="both"/>
-      </w:pPr>
-      <w:r>
-        <w:t>Цена передаётся полем price как строка рублей, например «49.90», и преобразуется сервером в price_kopecks. В ответе дополнительно возвращается category_name — название связанной категории. Это поле не хранится отдельным столбцом товара.</w:t>
-      </w:r>
-    </w:p>
-    <w:p>
-      <w:pPr>
-        <w:jc w:val="both"/>
-      </w:pPr>
-      <w:r>
-        <w:t>Поля id, name_normalized, price_kopecks, created_at и updated_at не принимаются как редактируемые поля. Время в JSON обозначается как UTC; SQLite хранит дату и время без встроенного часового пояса по соглашению приложения.</w:t>
-      </w:r>
     </w:p>
     <w:p>
       <w:pPr>
@@ -1917,7 +1780,7 @@
         <w:t xml:space="preserve">БП-1. </w:t>
       </w:r>
       <w:r>
-        <w:t>Каждый товар должен относиться к одной существующей категории. Категория может существовать без товаров. Переименование категории должно сохранять связи с товарами.</w:t>
+        <w:t>Один товар должен относиться ровно к одной категории. Категория может существовать без товаров.</w:t>
       </w:r>
     </w:p>
     <w:p>
@@ -1932,7 +1795,7 @@
         <w:t xml:space="preserve">БП-2. </w:t>
       </w:r>
       <w:r>
-        <w:t>Удаление категории с товарами запрещено. Сначала необходимо перенести связанные товары в другую категорию либо удалить их отдельными действиями.</w:t>
+        <w:t>Категория с товарами не должна удаляться. До её удаления товары необходимо перенести в другую категорию либо удалить отдельными действиями.</w:t>
       </w:r>
     </w:p>
     <w:p>
@@ -1947,7 +1810,7 @@
         <w:t xml:space="preserve">БП-3. </w:t>
       </w:r>
       <w:r>
-        <w:t>Артикул товара должен быть уникальным и содержать от 1 до 64 латинских букв, цифр, дефисов или подчёркиваний. Перед сохранением буквы приводятся к верхнему регистру.</w:t>
+        <w:t>Артикулы товаров должны быть уникальны без учёта регистра латинских букв. Изменение регистра не должно позволять создать дубликат.</w:t>
       </w:r>
     </w:p>
     <w:p>
@@ -1962,7 +1825,7 @@
         <w:t xml:space="preserve">БП-4. </w:t>
       </w:r>
       <w:r>
-        <w:t>Название категории должно быть уникальным после удаления крайних пробелов, Unicode-нормализации NFKC и приведения регистра через casefold. Названия товаров могут совпадать.</w:t>
+        <w:t>Имена категорий должны сравниваться без учёта регистра и пробелов по краям. Такие различия не должны создавать отдельную категорию.</w:t>
       </w:r>
     </w:p>
     <w:p>
@@ -1977,7 +1840,7 @@
         <w:t xml:space="preserve">БП-5. </w:t>
       </w:r>
       <w:r>
-        <w:t>Название категории должно содержать от 1 до 100 символов, название товара — от 1 до 200. Описание необязательно и не должно превышать 2000 символов. Крайние пробелы удаляются.</w:t>
+        <w:t>Название товара не должно использоваться как единственный признак уникальности: разные позиции могут иметь одинаковое название и разные артикулы.</w:t>
       </w:r>
     </w:p>
     <w:p>
@@ -1992,7 +1855,7 @@
         <w:t xml:space="preserve">БП-6. </w:t>
       </w:r>
       <w:r>
-        <w:t>Цена должна быть неотрицательной. При вводе допускаются точка или запятая и не более двух дробных знаков. Избыточная точность отклоняется без округления. Цена хранится целым числом копеек в пределах SQLite.</w:t>
+        <w:t>Цена должна задаваться в рублях. Нулевая цена допустима; отрицательная и неоговорённое округление введённой цены не допускаются.</w:t>
       </w:r>
     </w:p>
     <w:p>
@@ -2007,7 +1870,7 @@
         <w:t xml:space="preserve">БП-7. </w:t>
       </w:r>
       <w:r>
-        <w:t>Остаток должен быть неотрицательным целым числом в пределах SQLite. Нулевой остаток не удаляет товар из каталога; фильтр наличия включает только позиции с остатком больше нуля.</w:t>
+        <w:t>Остаток должен отражать целое число единиц товара. Нулевой остаток не удаляет запись из каталога, но исключает её из отбора по наличию.</w:t>
       </w:r>
     </w:p>
     <w:p>
@@ -2022,7 +1885,7 @@
         <w:t xml:space="preserve">БП-8. </w:t>
       </w:r>
       <w:r>
-        <w:t>Нижняя граница цены не должна превышать верхнюю. Граничные значения включаются в результат. При совместном отборе товар должен удовлетворять всем выбранным условиям.</w:t>
+        <w:t>Совместный отбор должен включать только товары, удовлетворяющие всем заданным условиям. Ценовые границы должны включать равные им значения.</w:t>
       </w:r>
     </w:p>
     <w:p>
@@ -2037,7 +1900,7 @@
         <w:t xml:space="preserve">БП-9. </w:t>
       </w:r>
       <w:r>
-        <w:t>При редактировании товара идентификатор и дата создания сохраняются, а дата изменения обновляется. Даты формируются программой в UTC.</w:t>
+        <w:t>Идентификатор и дата создания товара не должны меняться при редактировании. Дата изменения должна назначаться автоматически при изменении данных.</w:t>
       </w:r>
     </w:p>
     <w:p>
@@ -2052,7 +1915,7 @@
         <w:t xml:space="preserve">БП-10. </w:t>
       </w:r>
       <w:r>
-        <w:t>При отказе в сохранении из-за неверного ввода или конфликта уникальности прежние записи должны сохраняться. Неуспешная транзакция записи должна откатываться.</w:t>
+        <w:t>Ошибка ввода или нарушение правила уникальности не должны приводить к частичному сохранению операции.</w:t>
       </w:r>
     </w:p>
     <w:p>
@@ -2067,7 +1930,7 @@
         <w:t xml:space="preserve">БП-11. </w:t>
       </w:r>
       <w:r>
-        <w:t>Открытие страницы подтверждения не должно удалять запись. Удаление через веб-интерфейс выполняется отдельным POST-запросом после подтверждения.</w:t>
+        <w:t>Просмотр карточки или страницы подтверждения не должен удалять данные. Удаление допускается только после отдельного подтверждённого действия менеджера.</w:t>
       </w:r>
     </w:p>
     <w:p>
@@ -2082,7 +1945,7 @@
         <w:t xml:space="preserve">БП-12. </w:t>
       </w:r>
       <w:r>
-        <w:t>Повторная загрузка демонстрационных данных должна пропускать существующие артикулы без перезаписи товаров. Перед загрузкой в существующую базу создаётся резервная копия; новые записи добавляются одной транзакцией.</w:t>
+        <w:t>Переименование категории и перевод товара в другую категорию должны изменять существующие связи без создания копии товара.</w:t>
       </w:r>
     </w:p>
     <w:p>
@@ -2090,7 +1953,7 @@
         <w:pStyle w:val="Heading1"/>
       </w:pPr>
       <w:r>
-        <w:t>Ограничения данных и реализации</w:t>
+        <w:t>Ограничения данных и области применения</w:t>
       </w:r>
     </w:p>
     <w:tbl>
@@ -2237,7 +2100,7 @@
                 <w:b w:val="0"/>
                 <w:sz w:val="24"/>
               </w:rPr>
-              <w:t>Категория: 1–100 символов; товар: 1–200. Пустые строки и строки только из пробелов отклоняются.</w:t>
+              <w:t>Название категории: 1–100 символов; товара: 1–200 символов. Пустые строки и строки из одних пробелов недопустимы.</w:t>
             </w:r>
           </w:p>
         </w:tc>
@@ -2305,7 +2168,7 @@
                 <w:b w:val="0"/>
                 <w:sz w:val="24"/>
               </w:rPr>
-              <w:t>Не более 2000 символов; отсутствие описания допустимо.</w:t>
+              <w:t>Не более 2000 символов. Отсутствие описания допустимо.</w:t>
             </w:r>
           </w:p>
         </w:tc>
@@ -2373,7 +2236,7 @@
                 <w:b w:val="0"/>
                 <w:sz w:val="24"/>
               </w:rPr>
-              <w:t>Только латинские буквы A–Z, a–z, цифры 0–9, дефис и подчёркивание; длина 1–64. Уникальность проверяется после перевода букв в верхний регистр.</w:t>
+              <w:t>От 1 до 64 латинских букв, цифр, дефисов или подчёркиваний. Пробелы внутри артикула не допускаются.</w:t>
             </w:r>
           </w:p>
         </w:tc>
@@ -2420,7 +2283,7 @@
                 <w:b w:val="0"/>
                 <w:sz w:val="24"/>
               </w:rPr>
-              <w:t>Имя категории</w:t>
+              <w:t>Сравнение категорий</w:t>
             </w:r>
           </w:p>
         </w:tc>
@@ -2441,7 +2304,7 @@
                 <w:b w:val="0"/>
                 <w:sz w:val="24"/>
               </w:rPr>
-              <w:t>Уникальность по NFKC, удалению крайних пробелов и casefold. Исходное написание сохраняется для показа.</w:t>
+              <w:t>Названия, отличающиеся только регистром или пробелами по краям, должны считаться одинаковыми.</w:t>
             </w:r>
           </w:p>
         </w:tc>
@@ -2488,7 +2351,7 @@
                 <w:b w:val="0"/>
                 <w:sz w:val="24"/>
               </w:rPr>
-              <w:t>Цена и остаток в базе</w:t>
+              <w:t>Цена</w:t>
             </w:r>
           </w:p>
         </w:tc>
@@ -2509,7 +2372,7 @@
                 <w:b w:val="0"/>
                 <w:sz w:val="24"/>
               </w:rPr>
-              <w:t>Целые значения от 0 до 2^63 − 1 включительно. Логические, дробные и выходящие за диапазон значения отклоняются схемами и валидаторами приложения.</w:t>
+              <w:t>Неотрицательное денежное значение. При вводе допускаются точка или запятая и до двух дробных знаков; избыточная точность должна отклоняться.</w:t>
             </w:r>
           </w:p>
         </w:tc>
@@ -2556,7 +2419,7 @@
                 <w:b w:val="0"/>
                 <w:sz w:val="24"/>
               </w:rPr>
-              <w:t>Цена в запросе</w:t>
+              <w:t>Остаток</w:t>
             </w:r>
           </w:p>
         </w:tc>
@@ -2577,7 +2440,7 @@
                 <w:b w:val="0"/>
                 <w:sz w:val="24"/>
               </w:rPr>
-              <w:t>Строка длиной до 32 символов: цифры и необязательный десятичный разделитель с 1–2 дробными знаками. Максимум — 92233720368547758.07 рубля. Экспонента, NaN, бесконечность, отрицательные значения и скрытое округление не допускаются.</w:t>
+              <w:t>Неотрицательное целое число. Дробные и логические значения не должны приниматься как количество товара.</w:t>
             </w:r>
           </w:p>
         </w:tc>
@@ -2624,7 +2487,7 @@
                 <w:b w:val="0"/>
                 <w:sz w:val="24"/>
               </w:rPr>
-              <w:t>Идентификатор категории во вводе</w:t>
+              <w:t>Связь с категорией</w:t>
             </w:r>
           </w:p>
         </w:tc>
@@ -2645,7 +2508,7 @@
                 <w:b w:val="0"/>
                 <w:sz w:val="24"/>
               </w:rPr>
-              <w:t>Строгое целое JSON-число от 1 до 9223372036854775807. Допустимый по формату, но отсутствующий идентификатор даёт 404.</w:t>
+              <w:t>Выбранная категория должна существовать. Товар без категории сохранять нельзя.</w:t>
             </w:r>
           </w:p>
         </w:tc>
@@ -2692,7 +2555,7 @@
                 <w:b w:val="0"/>
                 <w:sz w:val="24"/>
               </w:rPr>
-              <w:t>Поиск и цена отбора</w:t>
+              <w:t>Диапазон цены</w:t>
             </w:r>
           </w:p>
         </w:tc>
@@ -2713,7 +2576,7 @@
                 <w:b w:val="0"/>
                 <w:sz w:val="24"/>
               </w:rPr>
-              <w:t>Строка поиска — до 200 символов. Каждая ценовая граница — до 32 символов, с правилами разбора цены; нижняя не превышает верхнюю.</w:t>
+              <w:t>Нижняя граница не должна превышать верхнюю. Обе границы необязательны и могут применяться независимо.</w:t>
             </w:r>
           </w:p>
         </w:tc>
@@ -2760,7 +2623,7 @@
                 <w:b w:val="0"/>
                 <w:sz w:val="24"/>
               </w:rPr>
-              <w:t>Пагинация</w:t>
+              <w:t>Поиск</w:t>
             </w:r>
           </w:p>
         </w:tc>
@@ -2781,7 +2644,7 @@
                 <w:b w:val="0"/>
                 <w:sz w:val="24"/>
               </w:rPr>
-              <w:t>Номер страницы от 1 до 922337203685477580. Размер страницы фиксирован: 10 товаров.</w:t>
+              <w:t>До 200 символов. Регистр русских букв не должен влиять на результат.</w:t>
             </w:r>
           </w:p>
         </w:tc>
@@ -2828,7 +2691,7 @@
                 <w:b w:val="0"/>
                 <w:sz w:val="24"/>
               </w:rPr>
-              <w:t>Сортировка</w:t>
+              <w:t>Страницы списка</w:t>
             </w:r>
           </w:p>
         </w:tc>
@@ -2849,7 +2712,7 @@
                 <w:b w:val="0"/>
                 <w:sz w:val="24"/>
               </w:rPr>
-              <w:t>Разрешены только name_asc, name_desc, price_asc, price_desc и updated_desc. При равенстве значений используется id.</w:t>
+              <w:t>Номер страницы — положительное целое число. На одной странице должно быть не более 10 товаров.</w:t>
             </w:r>
           </w:p>
         </w:tc>
@@ -2896,7 +2759,7 @@
                 <w:b w:val="0"/>
                 <w:sz w:val="24"/>
               </w:rPr>
-              <w:t>Связи и удаление</w:t>
+              <w:t>Сортировка</w:t>
             </w:r>
           </w:p>
         </w:tc>
@@ -2917,7 +2780,7 @@
                 <w:b w:val="0"/>
                 <w:sz w:val="24"/>
               </w:rPr>
-              <w:t>Один товар относится к одной категории. Внешний ключ RESTRICT запрещает удаление занятой категории; каскадное удаление её товаров не применяется.</w:t>
+              <w:t>Только название и цена в обоих направлениях либо время изменения от новых записей к старым. Произвольные команды сортировки не принимаются.</w:t>
             </w:r>
           </w:p>
         </w:tc>
@@ -2964,7 +2827,7 @@
                 <w:b w:val="0"/>
                 <w:sz w:val="24"/>
               </w:rPr>
-              <w:t>Состав запросов</w:t>
+              <w:t>Служебные данные</w:t>
             </w:r>
           </w:p>
         </w:tc>
@@ -2985,7 +2848,7 @@
                 <w:b w:val="0"/>
                 <w:sz w:val="24"/>
               </w:rPr>
-              <w:t>Лишние поля отклоняются. quantity и category_id в JSON принимаются строгими целыми числами; строки, логические и дробные значения не подменяют эти типы.</w:t>
+              <w:t>Идентификаторы и временные отметки должны формироваться системой; пользователь не должен менять их через формы ввода.</w:t>
             </w:r>
           </w:p>
         </w:tc>
@@ -3032,7 +2895,7 @@
                 <w:b w:val="0"/>
                 <w:sz w:val="24"/>
               </w:rPr>
-              <w:t>Изменение записи</w:t>
+              <w:t>Числовые пределы</w:t>
             </w:r>
           </w:p>
         </w:tc>
@@ -3053,7 +2916,7 @@
                 <w:b w:val="0"/>
                 <w:sz w:val="24"/>
               </w:rPr>
-              <w:t>PUT требует полный набор обязательных полей товара. Частичное обновление PATCH не реализовано.</w:t>
+              <w:t>Значения вне диапазона выбранного при проектировании типа должны отклоняться до сохранения с объяснением ошибки.</w:t>
             </w:r>
           </w:p>
         </w:tc>
@@ -3100,7 +2963,7 @@
                 <w:b w:val="0"/>
                 <w:sz w:val="24"/>
               </w:rPr>
-              <w:t>Объём модуля</w:t>
+              <w:t>Пользователи и доступ</w:t>
             </w:r>
           </w:p>
         </w:tc>
@@ -3121,7 +2984,7 @@
                 <w:b w:val="0"/>
                 <w:sz w:val="24"/>
               </w:rPr>
-              <w:t>Локальный каталог одного менеджера. Авторизации, ролей, заказов, оплаты, доставки, иерархии категорий и журнала складских операций нет.</w:t>
+              <w:t>Локальная работа одного менеджера. Публичный доступ, роли и многопользовательский режим не требуются.</w:t>
             </w:r>
           </w:p>
         </w:tc>
@@ -3168,7 +3031,7 @@
                 <w:b w:val="0"/>
                 <w:sz w:val="24"/>
               </w:rPr>
-              <w:t>Развитие схемы</w:t>
+              <w:t>Предметная область</w:t>
             </w:r>
           </w:p>
         </w:tc>
@@ -3189,7 +3052,7 @@
                 <w:b w:val="0"/>
                 <w:sz w:val="24"/>
               </w:rPr>
-              <w:t>Создание таблиц при запуске не изменяет существующую схему. Автоматические миграции не реализованы.</w:t>
+              <w:t>Ведение каталога и текущих остатков. Заказы, расчёты с покупателями, доставка и учёт движений запасов находятся вне границ модуля.</w:t>
             </w:r>
           </w:p>
         </w:tc>
@@ -3220,7 +3083,7 @@
         <w:t xml:space="preserve">НФТ-1. </w:t>
       </w:r>
       <w:r>
-        <w:t>Совместимость среды: приложение должно работать на Python 3.12 в предусмотренных проектом средах macOS и Linux. Зависимости должны устанавливаться в отдельное виртуальное окружение из закреплённых файлов проекта.</w:t>
+        <w:t>Совместимость: серверная часть должна запускаться в целевой среде разработки и демонстрации; обязательные программные компоненты и команды установки должны быть описаны в инструкции.</w:t>
       </w:r>
     </w:p>
     <w:p>
@@ -3235,7 +3098,7 @@
         <w:t xml:space="preserve">НФТ-2. </w:t>
       </w:r>
       <w:r>
-        <w:t>Сохранность данных: зафиксированные записи обычной SQLite-базы должны сохраняться после штатной остановки и повторного запуска сервера. Отклонённая запись не должна оставлять частично сохранённые изменения.</w:t>
+        <w:t>Надёжность хранения: зафиксированные записи должны сохраняться после штатной остановки и повторного запуска. Ошибка незавершённого изменения не должна нарушать ранее сохранённые данные.</w:t>
       </w:r>
     </w:p>
     <w:p>
@@ -3250,7 +3113,7 @@
         <w:t xml:space="preserve">НФТ-3. </w:t>
       </w:r>
       <w:r>
-        <w:t>Удобство использования: поля форм должны иметь видимые подписи, а ошибки — текстовое объяснение причины отказа. После ошибки корректно заполненные поля не должны очищаться.</w:t>
+        <w:t>Удобство: интерфейс, подписи полей и сообщения должны быть на русском языке. Обязательные поля должны быть обозначены, а отказ — сопровождаться понятным объяснением.</w:t>
       </w:r>
     </w:p>
     <w:p>
@@ -3265,7 +3128,7 @@
         <w:t xml:space="preserve">НФТ-4. </w:t>
       </w:r>
       <w:r>
-        <w:t>Адаптивность: страницы должны подстраиваться под узкий экран, а широкая таблица — прокручиваться в своём контейнере. Основные формы и операции каталога должны оставаться доступными без JavaScript.</w:t>
+        <w:t>Адаптивность: основные действия должны быть доступны на настольном и узком экране. Широкие таблицы не должны вынуждать прокручивать всю страницу по горизонтали. Основные формы должны работать без JavaScript.</w:t>
       </w:r>
     </w:p>
     <w:p>
@@ -3280,7 +3143,7 @@
         <w:t xml:space="preserve">НФТ-5. </w:t>
       </w:r>
       <w:r>
-        <w:t>Безопасность обработки ввода: сервер не должен полагаться только на проверку браузера. Пользовательский текст в HTML должен экранироваться, а значения запросов к базе — передаваться параметрами.</w:t>
+        <w:t>Безопасность ввода: данные пользователя не должны исполняться как разметка, сценарий или команда обращения к базе. Проверка в браузере не должна заменять проверку на стороне сервера.</w:t>
       </w:r>
     </w:p>
     <w:p>
@@ -3295,7 +3158,7 @@
         <w:t xml:space="preserve">НФТ-6. </w:t>
       </w:r>
       <w:r>
-        <w:t>Изолированность проверки: тесты базы, API, HTML и загрузчика должны использовать отдельные временные базы без изменения рабочего каталога. Команды установки, запуска и проверки должны быть приведены в README.</w:t>
+        <w:t>Воспроизводимость: вместе с модулем должны быть предоставлены исходный код, сведения о зависимостях и инструкции запуска и проверки.</w:t>
       </w:r>
     </w:p>
     <w:p>
@@ -3310,7 +3173,7 @@
         <w:t xml:space="preserve">НФТ-7. </w:t>
       </w:r>
       <w:r>
-        <w:t>Сопровождаемость: модели хранения, входные схемы, операции каталога и представления должны быть разделены по модулям. HTML и JSON API должны использовать общий слой операций без дублирования правил записи.</w:t>
+        <w:t>Объём каталога: система должна корректно хранить и выдавать постранично не менее 1000 товаров. Время отклика и предел одновременных обращений должны определяться отдельно при изменении области применения.</w:t>
       </w:r>
     </w:p>
     <w:p>
@@ -3325,7 +3188,7 @@
         <w:t xml:space="preserve">НФТ-8. </w:t>
       </w:r>
       <w:r>
-        <w:t>Доступность локального интерфейса: после установки зависимостей основные страницы каталога должны работать без загрузки стилей и скриптов из внешних CDN. Внешние файлы Swagger допускаются только для интерфейса документации API.</w:t>
+        <w:t>Изолированность проверки: испытания с созданием, изменением и удалением записей должны выполняться на тестовых данных отдельно от рабочего каталога.</w:t>
       </w:r>
     </w:p>
     <w:p>
@@ -3334,14 +3197,6 @@
       </w:pPr>
       <w:r>
         <w:t>Системные характеристики</w:t>
-      </w:r>
-    </w:p>
-    <w:p>
-      <w:pPr>
-        <w:jc w:val="both"/>
-      </w:pPr>
-      <w:r>
-        <w:t>Характеристики относятся к реализованной учебной версии. Они определяют состав среды и режим работы; измеренные показатели производительности не заявляются.</w:t>
       </w:r>
     </w:p>
     <w:tbl>
@@ -3420,7 +3275,7 @@
                 <w:b/>
                 <w:sz w:val="24"/>
               </w:rPr>
-              <w:t>Значение</w:t>
+              <w:t>Требуемое значение</w:t>
             </w:r>
           </w:p>
         </w:tc>
@@ -3467,7 +3322,7 @@
                 <w:b w:val="0"/>
                 <w:sz w:val="24"/>
               </w:rPr>
-              <w:t>Архитектура и режим</w:t>
+              <w:t>Тип системы</w:t>
             </w:r>
           </w:p>
         </w:tc>
@@ -3488,7 +3343,7 @@
                 <w:b w:val="0"/>
                 <w:sz w:val="24"/>
               </w:rPr>
-              <w:t>Веб-приложение с серверным формированием HTML и JSON API. Локальная работа одного менеджера с общей SQLite-базой.</w:t>
+              <w:t>Веб-модуль управления товарным каталогом с серверной обработкой и сохраняемой базой данных.</w:t>
             </w:r>
           </w:p>
         </w:tc>
@@ -3535,7 +3390,7 @@
                 <w:b w:val="0"/>
                 <w:sz w:val="24"/>
               </w:rPr>
-              <w:t>Операционные системы</w:t>
+              <w:t>Пользователь</w:t>
             </w:r>
           </w:p>
         </w:tc>
@@ -3556,7 +3411,7 @@
                 <w:b w:val="0"/>
                 <w:sz w:val="24"/>
               </w:rPr>
-              <w:t>macOS для локальной разработки и демонстрации; Linux для среды разработки и автоматических проверок. Проверка Windows не выполнялась.</w:t>
+              <w:t>Один менеджер каталога, выполняющий операции локально.</w:t>
             </w:r>
           </w:p>
         </w:tc>
@@ -3603,7 +3458,7 @@
                 <w:b w:val="0"/>
                 <w:sz w:val="24"/>
               </w:rPr>
-              <w:t>Исполняющая среда</w:t>
+              <w:t>Целевая платформа</w:t>
             </w:r>
           </w:p>
         </w:tc>
@@ -3624,7 +3479,7 @@
                 <w:b w:val="0"/>
                 <w:sz w:val="24"/>
               </w:rPr>
-              <w:t>Python 3.12.x, отдельное виртуальное окружение .venv, установка пакетов из закреплённых файлов зависимостей.</w:t>
+              <w:t>Персональный компьютер с macOS для разработки и демонстрации. Допускается использование Linux для подготовки и проверки.</w:t>
             </w:r>
           </w:p>
         </w:tc>
@@ -3671,7 +3526,7 @@
                 <w:b w:val="0"/>
                 <w:sz w:val="24"/>
               </w:rPr>
-              <w:t>Серверные компоненты</w:t>
+              <w:t>Серверная среда</w:t>
             </w:r>
           </w:p>
         </w:tc>
@@ -3692,7 +3547,7 @@
                 <w:b w:val="0"/>
                 <w:sz w:val="24"/>
               </w:rPr>
-              <w:t>FastAPI 0.154.0, Uvicorn 0.54.0, SQLAlchemy 2.1.5, Pydantic 2.14.1 и Jinja2 3.1.6. Полный состав — requirements.txt.</w:t>
+              <w:t>Среда Python 3. Конкретная версия, фреймворк и библиотеки должны выбираться на этапе проектирования.</w:t>
             </w:r>
           </w:p>
         </w:tc>
@@ -3739,7 +3594,7 @@
                 <w:b w:val="0"/>
                 <w:sz w:val="24"/>
               </w:rPr>
-              <w:t>Хранение</w:t>
+              <w:t>СУБД</w:t>
             </w:r>
           </w:p>
         </w:tc>
@@ -3760,7 +3615,7 @@
                 <w:b w:val="0"/>
                 <w:sz w:val="24"/>
               </w:rPr>
-              <w:t>SQLite через драйвер sqlite3 среды Python. Рабочий файл — data/catalog.db относительно проекта. Отдельный сервер СУБД не требуется.</w:t>
+              <w:t>Реляционная база с поддержкой связей, ограничений целостности и транзакций. Конкретная СУБД должна выбираться при проектировании.</w:t>
             </w:r>
           </w:p>
         </w:tc>
@@ -3807,7 +3662,7 @@
                 <w:b w:val="0"/>
                 <w:sz w:val="24"/>
               </w:rPr>
-              <w:t>Сетевой доступ</w:t>
+              <w:t>Клиентская среда</w:t>
             </w:r>
           </w:p>
         </w:tc>
@@ -3828,7 +3683,7 @@
                 <w:b w:val="0"/>
                 <w:sz w:val="24"/>
               </w:rPr>
-              <w:t>Обычный локальный запуск: HTTP, адрес 127.0.0.1, порт 8000. При конфликте портов порт задаётся параметром Uvicorn. Публикация в интернете не настроена.</w:t>
+              <w:t>Веб-браузер с поддержкой HTML и CSS. Дополнительная установка клиентского приложения не должна требоваться.</w:t>
             </w:r>
           </w:p>
         </w:tc>
@@ -3875,7 +3730,7 @@
                 <w:b w:val="0"/>
                 <w:sz w:val="24"/>
               </w:rPr>
-              <w:t>Интерфейс пользователя</w:t>
+              <w:t>Язык и представление</w:t>
             </w:r>
           </w:p>
         </w:tc>
@@ -3896,7 +3751,7 @@
                 <w:b w:val="0"/>
                 <w:sz w:val="24"/>
               </w:rPr>
-              <w:t>Русский язык, кодировка UTF-8, браузерные HTML-формы, CSS и небольшой JavaScript для местного времени дат. Основные операции не зависят от JavaScript.</w:t>
+              <w:t>Русский язык интерфейса, поддержка кириллицы, цены в рублях и понятное отображение дат.</w:t>
             </w:r>
           </w:p>
         </w:tc>
@@ -3943,7 +3798,7 @@
                 <w:b w:val="0"/>
                 <w:sz w:val="24"/>
               </w:rPr>
-              <w:t>Программный интерфейс</w:t>
+              <w:t>Сетевой режим</w:t>
             </w:r>
           </w:p>
         </w:tc>
@@ -3964,7 +3819,7 @@
                 <w:b w:val="0"/>
                 <w:sz w:val="24"/>
               </w:rPr>
-              <w:t>JSON API с префиксом /api, схема /openapi.json и документация /docs. Цена передаётся строкой рублей, даты — с обозначением UTC.</w:t>
+              <w:t>Локальное HTTP-взаимодействие браузера и сервера. Адрес и порт должны задаваться в инструкции; внешняя публикация не требуется.</w:t>
             </w:r>
           </w:p>
         </w:tc>
@@ -4011,7 +3866,7 @@
                 <w:b w:val="0"/>
                 <w:sz w:val="24"/>
               </w:rPr>
-              <w:t>Интернет при работе</w:t>
+              <w:t>Хранение</w:t>
             </w:r>
           </w:p>
         </w:tc>
@@ -4032,7 +3887,7 @@
                 <w:b w:val="0"/>
                 <w:sz w:val="24"/>
               </w:rPr>
-              <w:t>Нужен для первоначальной загрузки пакетов. Страницы каталога используют локальные CSS и JavaScript; интерфейс Swagger загружает свои файлы из внешнего CDN.</w:t>
+              <w:t>Товары, категории и их связи должны сохраняться между запусками независимо от состояния страницы браузера.</w:t>
             </w:r>
           </w:p>
         </w:tc>
@@ -4079,7 +3934,7 @@
                 <w:b w:val="0"/>
                 <w:sz w:val="24"/>
               </w:rPr>
-              <w:t>Обработка данных</w:t>
+              <w:t>Обработка изменений</w:t>
             </w:r>
           </w:p>
         </w:tc>
@@ -4100,7 +3955,7 @@
                 <w:b w:val="0"/>
                 <w:sz w:val="24"/>
               </w:rPr>
-              <w:t>Сессия SQLAlchemy выдаётся на запрос. Запись фиксируется транзакцией; при ошибке целостности выполняется rollback. Для SQLite-соединений включаются внешние ключи.</w:t>
+              <w:t>Связанные изменения должны сохраняться целиком либо отменяться при ошибке без частичного результата.</w:t>
             </w:r>
           </w:p>
         </w:tc>
@@ -4147,7 +4002,7 @@
                 <w:b w:val="0"/>
                 <w:sz w:val="24"/>
               </w:rPr>
-              <w:t>Демонстрационный объём</w:t>
+              <w:t>Расчётный объём</w:t>
             </w:r>
           </w:p>
         </w:tc>
@@ -4168,7 +4023,7 @@
                 <w:b w:val="0"/>
                 <w:sz w:val="24"/>
               </w:rPr>
-              <w:t>Подготовлены 1200 товаров в 12 категориях; при выдаче по 10 товаров это 120 страниц. Это состав демонстрационного набора, а не предел ёмкости системы.</w:t>
+              <w:t>Для учебной эксплуатации должна предусматриваться работа с каталогом не менее 1000 товаров и постраничным выводом.</w:t>
             </w:r>
           </w:p>
         </w:tc>
@@ -4215,7 +4070,7 @@
                 <w:b w:val="0"/>
                 <w:sz w:val="24"/>
               </w:rPr>
-              <w:t>Инструменты проверки</w:t>
+              <w:t>Аппаратная среда</w:t>
             </w:r>
           </w:p>
         </w:tc>
@@ -4236,7 +4091,7 @@
                 <w:b w:val="0"/>
                 <w:sz w:val="24"/>
               </w:rPr>
-              <w:t>pytest и HTTP-клиент для базы, API, HTML и загрузчика. Playwright и Chromium используются отдельно для браузерных сценариев.</w:t>
+              <w:t>Компьютер должен обеспечивать запуск серверной среды и браузера и иметь место для зависимостей, базы и копий данных. Числовые минимумы должны уточняться при выборе средств разработки.</w:t>
             </w:r>
           </w:p>
         </w:tc>
@@ -4283,7 +4138,7 @@
                 <w:b w:val="0"/>
                 <w:sz w:val="24"/>
               </w:rPr>
-              <w:t>Резервирование</w:t>
+              <w:t>Зависимость от интернета</w:t>
             </w:r>
           </w:p>
         </w:tc>
@@ -4304,7 +4159,7 @@
                 <w:b w:val="0"/>
                 <w:sz w:val="24"/>
               </w:rPr>
-              <w:t>Загрузчик примеров создаёт SQLite backup перед изменением существующей базы. Автоматического фонового расписания резервных копий нет.</w:t>
+              <w:t>После установки обязательных компонентов основные операции локального каталога не должны требовать загрузки внешних ресурсов.</w:t>
             </w:r>
           </w:p>
         </w:tc>
@@ -4351,7 +4206,7 @@
                 <w:b w:val="0"/>
                 <w:sz w:val="24"/>
               </w:rPr>
-              <w:t>Аппаратные ресурсы и нагрузка</w:t>
+              <w:t>Поставка</w:t>
             </w:r>
           </w:p>
         </w:tc>
@@ -4372,7 +4227,1062 @@
                 <w:b w:val="0"/>
                 <w:sz w:val="24"/>
               </w:rPr>
-              <w:t>Нужен компьютер, способный запускать Python 3.12 и браузер, с местом для окружения, базы и резервных копий. Числовые минимумы процессора, ОЗУ и диска, максимальная нагрузка и время отклика измерениями не определены.</w:t>
+              <w:t>Исходники модуля, инструкции установки и запуска, описание зависимостей и программа приёмочных проверок.</w:t>
+            </w:r>
+          </w:p>
+        </w:tc>
+      </w:tr>
+    </w:tbl>
+    <w:p>
+      <w:pPr>
+        <w:spacing w:after="0"/>
+      </w:pPr>
+    </w:p>
+    <w:p>
+      <w:pPr>
+        <w:pStyle w:val="Heading1"/>
+      </w:pPr>
+      <w:r>
+        <w:t>Порядок приёмки</w:t>
+      </w:r>
+    </w:p>
+    <w:p>
+      <w:pPr>
+        <w:jc w:val="both"/>
+      </w:pPr>
+      <w:r>
+        <w:t>Приёмка должна проводиться после разработки по сценариям ниже. Для каждого сценария должны фиксироваться условия, фактический результат и итог. При отклонении требование не должно объявляться выполненным без пояснения или исправления.</w:t>
+      </w:r>
+    </w:p>
+    <w:tbl>
+      <w:tblPr>
+        <w:tblStyle w:val="TableGrid"/>
+        <w:tblW w:type="auto" w:w="0"/>
+        <w:tblLayout w:type="fixed"/>
+        <w:tblLook w:firstColumn="1" w:firstRow="1" w:lastColumn="0" w:lastRow="0" w:noHBand="0" w:noVBand="1" w:val="04A0"/>
+      </w:tblPr>
+      <w:tblGrid>
+        <w:gridCol w:w="1134"/>
+        <w:gridCol w:w="2268"/>
+        <w:gridCol w:w="5624"/>
+      </w:tblGrid>
+      <w:tr>
+        <w:trPr>
+          <w:cantSplit/>
+          <w:tblHeader/>
+        </w:trPr>
+        <w:tc>
+          <w:tcPr>
+            <w:tcW w:type="dxa" w:w="1134"/>
+            <w:vAlign w:val="center"/>
+          </w:tcPr>
+          <w:p>
+            <w:pPr>
+              <w:keepNext/>
+              <w:spacing w:line="240" w:lineRule="auto" w:before="0" w:after="60"/>
+              <w:jc w:val="left"/>
+            </w:pPr>
+            <w:r>
+              <w:rPr>
+                <w:rFonts w:ascii="Times New Roman" w:hAnsi="Times New Roman"/>
+                <w:b/>
+                <w:sz w:val="24"/>
+              </w:rPr>
+              <w:t>Код</w:t>
+            </w:r>
+          </w:p>
+        </w:tc>
+        <w:tc>
+          <w:tcPr>
+            <w:tcW w:type="dxa" w:w="2268"/>
+            <w:vAlign w:val="center"/>
+          </w:tcPr>
+          <w:p>
+            <w:pPr>
+              <w:keepNext/>
+              <w:spacing w:line="240" w:lineRule="auto" w:before="0" w:after="60"/>
+              <w:jc w:val="left"/>
+            </w:pPr>
+            <w:r>
+              <w:rPr>
+                <w:rFonts w:ascii="Times New Roman" w:hAnsi="Times New Roman"/>
+                <w:b/>
+                <w:sz w:val="24"/>
+              </w:rPr>
+              <w:t>Сценарий</w:t>
+            </w:r>
+          </w:p>
+        </w:tc>
+        <w:tc>
+          <w:tcPr>
+            <w:tcW w:type="dxa" w:w="5624"/>
+            <w:vAlign w:val="center"/>
+          </w:tcPr>
+          <w:p>
+            <w:pPr>
+              <w:keepNext/>
+              <w:spacing w:line="240" w:lineRule="auto" w:before="0" w:after="60"/>
+              <w:jc w:val="left"/>
+            </w:pPr>
+            <w:r>
+              <w:rPr>
+                <w:rFonts w:ascii="Times New Roman" w:hAnsi="Times New Roman"/>
+                <w:b/>
+                <w:sz w:val="24"/>
+              </w:rPr>
+              <w:t>Ожидаемый результат</w:t>
+            </w:r>
+          </w:p>
+        </w:tc>
+      </w:tr>
+      <w:tr>
+        <w:trPr>
+          <w:cantSplit/>
+        </w:trPr>
+        <w:tc>
+          <w:tcPr>
+            <w:tcW w:type="dxa" w:w="1134"/>
+            <w:vAlign w:val="center"/>
+          </w:tcPr>
+          <w:p>
+            <w:pPr>
+              <w:keepNext w:val="0"/>
+              <w:spacing w:line="240" w:lineRule="auto" w:before="0" w:after="60"/>
+              <w:jc w:val="left"/>
+            </w:pPr>
+            <w:r>
+              <w:rPr>
+                <w:rFonts w:ascii="Times New Roman" w:hAnsi="Times New Roman"/>
+                <w:b/>
+                <w:sz w:val="24"/>
+              </w:rPr>
+              <w:t>ПР-1</w:t>
+            </w:r>
+          </w:p>
+        </w:tc>
+        <w:tc>
+          <w:tcPr>
+            <w:tcW w:type="dxa" w:w="2268"/>
+            <w:vAlign w:val="center"/>
+          </w:tcPr>
+          <w:p>
+            <w:pPr>
+              <w:keepNext w:val="0"/>
+              <w:spacing w:line="240" w:lineRule="auto" w:before="0" w:after="60"/>
+              <w:jc w:val="left"/>
+            </w:pPr>
+            <w:r>
+              <w:rPr>
+                <w:rFonts w:ascii="Times New Roman" w:hAnsi="Times New Roman"/>
+                <w:b w:val="0"/>
+                <w:sz w:val="24"/>
+              </w:rPr>
+              <w:t>Первый запуск</w:t>
+            </w:r>
+          </w:p>
+        </w:tc>
+        <w:tc>
+          <w:tcPr>
+            <w:tcW w:type="dxa" w:w="5624"/>
+            <w:vAlign w:val="center"/>
+          </w:tcPr>
+          <w:p>
+            <w:pPr>
+              <w:keepNext w:val="0"/>
+              <w:spacing w:line="240" w:lineRule="auto" w:before="0" w:after="60"/>
+              <w:jc w:val="left"/>
+            </w:pPr>
+            <w:r>
+              <w:rPr>
+                <w:rFonts w:ascii="Times New Roman" w:hAnsi="Times New Roman"/>
+                <w:b w:val="0"/>
+                <w:sz w:val="24"/>
+              </w:rPr>
+              <w:t>Пустой каталог открывается без ошибки; доступны действия создания категории и товара.</w:t>
+            </w:r>
+          </w:p>
+        </w:tc>
+      </w:tr>
+      <w:tr>
+        <w:trPr>
+          <w:cantSplit/>
+        </w:trPr>
+        <w:tc>
+          <w:tcPr>
+            <w:tcW w:type="dxa" w:w="1134"/>
+            <w:vAlign w:val="center"/>
+          </w:tcPr>
+          <w:p>
+            <w:pPr>
+              <w:keepNext w:val="0"/>
+              <w:spacing w:line="240" w:lineRule="auto" w:before="0" w:after="60"/>
+              <w:jc w:val="left"/>
+            </w:pPr>
+            <w:r>
+              <w:rPr>
+                <w:rFonts w:ascii="Times New Roman" w:hAnsi="Times New Roman"/>
+                <w:b/>
+                <w:sz w:val="24"/>
+              </w:rPr>
+              <w:t>ПР-2</w:t>
+            </w:r>
+          </w:p>
+        </w:tc>
+        <w:tc>
+          <w:tcPr>
+            <w:tcW w:type="dxa" w:w="2268"/>
+            <w:vAlign w:val="center"/>
+          </w:tcPr>
+          <w:p>
+            <w:pPr>
+              <w:keepNext w:val="0"/>
+              <w:spacing w:line="240" w:lineRule="auto" w:before="0" w:after="60"/>
+              <w:jc w:val="left"/>
+            </w:pPr>
+            <w:r>
+              <w:rPr>
+                <w:rFonts w:ascii="Times New Roman" w:hAnsi="Times New Roman"/>
+                <w:b w:val="0"/>
+                <w:sz w:val="24"/>
+              </w:rPr>
+              <w:t>Категории</w:t>
+            </w:r>
+          </w:p>
+        </w:tc>
+        <w:tc>
+          <w:tcPr>
+            <w:tcW w:type="dxa" w:w="5624"/>
+            <w:vAlign w:val="center"/>
+          </w:tcPr>
+          <w:p>
+            <w:pPr>
+              <w:keepNext w:val="0"/>
+              <w:spacing w:line="240" w:lineRule="auto" w:before="0" w:after="60"/>
+              <w:jc w:val="left"/>
+            </w:pPr>
+            <w:r>
+              <w:rPr>
+                <w:rFonts w:ascii="Times New Roman" w:hAnsi="Times New Roman"/>
+                <w:b w:val="0"/>
+                <w:sz w:val="24"/>
+              </w:rPr>
+              <w:t>Допустимая категория создаётся и переименовывается; дубликат имени отклоняется.</w:t>
+            </w:r>
+          </w:p>
+        </w:tc>
+      </w:tr>
+      <w:tr>
+        <w:trPr>
+          <w:cantSplit/>
+        </w:trPr>
+        <w:tc>
+          <w:tcPr>
+            <w:tcW w:type="dxa" w:w="1134"/>
+            <w:vAlign w:val="center"/>
+          </w:tcPr>
+          <w:p>
+            <w:pPr>
+              <w:keepNext w:val="0"/>
+              <w:spacing w:line="240" w:lineRule="auto" w:before="0" w:after="60"/>
+              <w:jc w:val="left"/>
+            </w:pPr>
+            <w:r>
+              <w:rPr>
+                <w:rFonts w:ascii="Times New Roman" w:hAnsi="Times New Roman"/>
+                <w:b/>
+                <w:sz w:val="24"/>
+              </w:rPr>
+              <w:t>ПР-3</w:t>
+            </w:r>
+          </w:p>
+        </w:tc>
+        <w:tc>
+          <w:tcPr>
+            <w:tcW w:type="dxa" w:w="2268"/>
+            <w:vAlign w:val="center"/>
+          </w:tcPr>
+          <w:p>
+            <w:pPr>
+              <w:keepNext w:val="0"/>
+              <w:spacing w:line="240" w:lineRule="auto" w:before="0" w:after="60"/>
+              <w:jc w:val="left"/>
+            </w:pPr>
+            <w:r>
+              <w:rPr>
+                <w:rFonts w:ascii="Times New Roman" w:hAnsi="Times New Roman"/>
+                <w:b w:val="0"/>
+                <w:sz w:val="24"/>
+              </w:rPr>
+              <w:t>Добавление товара</w:t>
+            </w:r>
+          </w:p>
+        </w:tc>
+        <w:tc>
+          <w:tcPr>
+            <w:tcW w:type="dxa" w:w="5624"/>
+            <w:vAlign w:val="center"/>
+          </w:tcPr>
+          <w:p>
+            <w:pPr>
+              <w:keepNext w:val="0"/>
+              <w:spacing w:line="240" w:lineRule="auto" w:before="0" w:after="60"/>
+              <w:jc w:val="left"/>
+            </w:pPr>
+            <w:r>
+              <w:rPr>
+                <w:rFonts w:ascii="Times New Roman" w:hAnsi="Times New Roman"/>
+                <w:b w:val="0"/>
+                <w:sz w:val="24"/>
+              </w:rPr>
+              <w:t>После ввода названия, артикула, категории, цены и остатка запись появляется в списке и карточке.</w:t>
+            </w:r>
+          </w:p>
+        </w:tc>
+      </w:tr>
+      <w:tr>
+        <w:trPr>
+          <w:cantSplit/>
+        </w:trPr>
+        <w:tc>
+          <w:tcPr>
+            <w:tcW w:type="dxa" w:w="1134"/>
+            <w:vAlign w:val="center"/>
+          </w:tcPr>
+          <w:p>
+            <w:pPr>
+              <w:keepNext w:val="0"/>
+              <w:spacing w:line="240" w:lineRule="auto" w:before="0" w:after="60"/>
+              <w:jc w:val="left"/>
+            </w:pPr>
+            <w:r>
+              <w:rPr>
+                <w:rFonts w:ascii="Times New Roman" w:hAnsi="Times New Roman"/>
+                <w:b/>
+                <w:sz w:val="24"/>
+              </w:rPr>
+              <w:t>ПР-4</w:t>
+            </w:r>
+          </w:p>
+        </w:tc>
+        <w:tc>
+          <w:tcPr>
+            <w:tcW w:type="dxa" w:w="2268"/>
+            <w:vAlign w:val="center"/>
+          </w:tcPr>
+          <w:p>
+            <w:pPr>
+              <w:keepNext w:val="0"/>
+              <w:spacing w:line="240" w:lineRule="auto" w:before="0" w:after="60"/>
+              <w:jc w:val="left"/>
+            </w:pPr>
+            <w:r>
+              <w:rPr>
+                <w:rFonts w:ascii="Times New Roman" w:hAnsi="Times New Roman"/>
+                <w:b w:val="0"/>
+                <w:sz w:val="24"/>
+              </w:rPr>
+              <w:t>Изменение товара</w:t>
+            </w:r>
+          </w:p>
+        </w:tc>
+        <w:tc>
+          <w:tcPr>
+            <w:tcW w:type="dxa" w:w="5624"/>
+            <w:vAlign w:val="center"/>
+          </w:tcPr>
+          <w:p>
+            <w:pPr>
+              <w:keepNext w:val="0"/>
+              <w:spacing w:line="240" w:lineRule="auto" w:before="0" w:after="60"/>
+              <w:jc w:val="left"/>
+            </w:pPr>
+            <w:r>
+              <w:rPr>
+                <w:rFonts w:ascii="Times New Roman" w:hAnsi="Times New Roman"/>
+                <w:b w:val="0"/>
+                <w:sz w:val="24"/>
+              </w:rPr>
+              <w:t>Новые значения сохраняются, идентификатор и дата создания не меняются.</w:t>
+            </w:r>
+          </w:p>
+        </w:tc>
+      </w:tr>
+      <w:tr>
+        <w:trPr>
+          <w:cantSplit/>
+        </w:trPr>
+        <w:tc>
+          <w:tcPr>
+            <w:tcW w:type="dxa" w:w="1134"/>
+            <w:vAlign w:val="center"/>
+          </w:tcPr>
+          <w:p>
+            <w:pPr>
+              <w:keepNext w:val="0"/>
+              <w:spacing w:line="240" w:lineRule="auto" w:before="0" w:after="60"/>
+              <w:jc w:val="left"/>
+            </w:pPr>
+            <w:r>
+              <w:rPr>
+                <w:rFonts w:ascii="Times New Roman" w:hAnsi="Times New Roman"/>
+                <w:b/>
+                <w:sz w:val="24"/>
+              </w:rPr>
+              <w:t>ПР-5</w:t>
+            </w:r>
+          </w:p>
+        </w:tc>
+        <w:tc>
+          <w:tcPr>
+            <w:tcW w:type="dxa" w:w="2268"/>
+            <w:vAlign w:val="center"/>
+          </w:tcPr>
+          <w:p>
+            <w:pPr>
+              <w:keepNext w:val="0"/>
+              <w:spacing w:line="240" w:lineRule="auto" w:before="0" w:after="60"/>
+              <w:jc w:val="left"/>
+            </w:pPr>
+            <w:r>
+              <w:rPr>
+                <w:rFonts w:ascii="Times New Roman" w:hAnsi="Times New Roman"/>
+                <w:b w:val="0"/>
+                <w:sz w:val="24"/>
+              </w:rPr>
+              <w:t>Ошибочный ввод</w:t>
+            </w:r>
+          </w:p>
+        </w:tc>
+        <w:tc>
+          <w:tcPr>
+            <w:tcW w:type="dxa" w:w="5624"/>
+            <w:vAlign w:val="center"/>
+          </w:tcPr>
+          <w:p>
+            <w:pPr>
+              <w:keepNext w:val="0"/>
+              <w:spacing w:line="240" w:lineRule="auto" w:before="0" w:after="60"/>
+              <w:jc w:val="left"/>
+            </w:pPr>
+            <w:r>
+              <w:rPr>
+                <w:rFonts w:ascii="Times New Roman" w:hAnsi="Times New Roman"/>
+                <w:b w:val="0"/>
+                <w:sz w:val="24"/>
+              </w:rPr>
+              <w:t>Пустое название, неверная цена, дробный остаток и повторный артикул отклоняются; ввод и прежние записи сохраняются.</w:t>
+            </w:r>
+          </w:p>
+        </w:tc>
+      </w:tr>
+      <w:tr>
+        <w:trPr>
+          <w:cantSplit/>
+        </w:trPr>
+        <w:tc>
+          <w:tcPr>
+            <w:tcW w:type="dxa" w:w="1134"/>
+            <w:vAlign w:val="center"/>
+          </w:tcPr>
+          <w:p>
+            <w:pPr>
+              <w:keepNext w:val="0"/>
+              <w:spacing w:line="240" w:lineRule="auto" w:before="0" w:after="60"/>
+              <w:jc w:val="left"/>
+            </w:pPr>
+            <w:r>
+              <w:rPr>
+                <w:rFonts w:ascii="Times New Roman" w:hAnsi="Times New Roman"/>
+                <w:b/>
+                <w:sz w:val="24"/>
+              </w:rPr>
+              <w:t>ПР-6</w:t>
+            </w:r>
+          </w:p>
+        </w:tc>
+        <w:tc>
+          <w:tcPr>
+            <w:tcW w:type="dxa" w:w="2268"/>
+            <w:vAlign w:val="center"/>
+          </w:tcPr>
+          <w:p>
+            <w:pPr>
+              <w:keepNext w:val="0"/>
+              <w:spacing w:line="240" w:lineRule="auto" w:before="0" w:after="60"/>
+              <w:jc w:val="left"/>
+            </w:pPr>
+            <w:r>
+              <w:rPr>
+                <w:rFonts w:ascii="Times New Roman" w:hAnsi="Times New Roman"/>
+                <w:b w:val="0"/>
+                <w:sz w:val="24"/>
+              </w:rPr>
+              <w:t>Защита категории</w:t>
+            </w:r>
+          </w:p>
+        </w:tc>
+        <w:tc>
+          <w:tcPr>
+            <w:tcW w:type="dxa" w:w="5624"/>
+            <w:vAlign w:val="center"/>
+          </w:tcPr>
+          <w:p>
+            <w:pPr>
+              <w:keepNext w:val="0"/>
+              <w:spacing w:line="240" w:lineRule="auto" w:before="0" w:after="60"/>
+              <w:jc w:val="left"/>
+            </w:pPr>
+            <w:r>
+              <w:rPr>
+                <w:rFonts w:ascii="Times New Roman" w:hAnsi="Times New Roman"/>
+                <w:b w:val="0"/>
+                <w:sz w:val="24"/>
+              </w:rPr>
+              <w:t>Категория с товарами не удаляется; причина отказа объясняется.</w:t>
+            </w:r>
+          </w:p>
+        </w:tc>
+      </w:tr>
+      <w:tr>
+        <w:trPr>
+          <w:cantSplit/>
+        </w:trPr>
+        <w:tc>
+          <w:tcPr>
+            <w:tcW w:type="dxa" w:w="1134"/>
+            <w:vAlign w:val="center"/>
+          </w:tcPr>
+          <w:p>
+            <w:pPr>
+              <w:keepNext w:val="0"/>
+              <w:spacing w:line="240" w:lineRule="auto" w:before="0" w:after="60"/>
+              <w:jc w:val="left"/>
+            </w:pPr>
+            <w:r>
+              <w:rPr>
+                <w:rFonts w:ascii="Times New Roman" w:hAnsi="Times New Roman"/>
+                <w:b/>
+                <w:sz w:val="24"/>
+              </w:rPr>
+              <w:t>ПР-7</w:t>
+            </w:r>
+          </w:p>
+        </w:tc>
+        <w:tc>
+          <w:tcPr>
+            <w:tcW w:type="dxa" w:w="2268"/>
+            <w:vAlign w:val="center"/>
+          </w:tcPr>
+          <w:p>
+            <w:pPr>
+              <w:keepNext w:val="0"/>
+              <w:spacing w:line="240" w:lineRule="auto" w:before="0" w:after="60"/>
+              <w:jc w:val="left"/>
+            </w:pPr>
+            <w:r>
+              <w:rPr>
+                <w:rFonts w:ascii="Times New Roman" w:hAnsi="Times New Roman"/>
+                <w:b w:val="0"/>
+                <w:sz w:val="24"/>
+              </w:rPr>
+              <w:t>Поиск</w:t>
+            </w:r>
+          </w:p>
+        </w:tc>
+        <w:tc>
+          <w:tcPr>
+            <w:tcW w:type="dxa" w:w="5624"/>
+            <w:vAlign w:val="center"/>
+          </w:tcPr>
+          <w:p>
+            <w:pPr>
+              <w:keepNext w:val="0"/>
+              <w:spacing w:line="240" w:lineRule="auto" w:before="0" w:after="60"/>
+              <w:jc w:val="left"/>
+            </w:pPr>
+            <w:r>
+              <w:rPr>
+                <w:rFonts w:ascii="Times New Roman" w:hAnsi="Times New Roman"/>
+                <w:b w:val="0"/>
+                <w:sz w:val="24"/>
+              </w:rPr>
+              <w:t>Фрагмент русского названия находится независимо от регистра; специальные символы ищутся буквально.</w:t>
+            </w:r>
+          </w:p>
+        </w:tc>
+      </w:tr>
+      <w:tr>
+        <w:trPr>
+          <w:cantSplit/>
+        </w:trPr>
+        <w:tc>
+          <w:tcPr>
+            <w:tcW w:type="dxa" w:w="1134"/>
+            <w:vAlign w:val="center"/>
+          </w:tcPr>
+          <w:p>
+            <w:pPr>
+              <w:keepNext w:val="0"/>
+              <w:spacing w:line="240" w:lineRule="auto" w:before="0" w:after="60"/>
+              <w:jc w:val="left"/>
+            </w:pPr>
+            <w:r>
+              <w:rPr>
+                <w:rFonts w:ascii="Times New Roman" w:hAnsi="Times New Roman"/>
+                <w:b/>
+                <w:sz w:val="24"/>
+              </w:rPr>
+              <w:t>ПР-8</w:t>
+            </w:r>
+          </w:p>
+        </w:tc>
+        <w:tc>
+          <w:tcPr>
+            <w:tcW w:type="dxa" w:w="2268"/>
+            <w:vAlign w:val="center"/>
+          </w:tcPr>
+          <w:p>
+            <w:pPr>
+              <w:keepNext w:val="0"/>
+              <w:spacing w:line="240" w:lineRule="auto" w:before="0" w:after="60"/>
+              <w:jc w:val="left"/>
+            </w:pPr>
+            <w:r>
+              <w:rPr>
+                <w:rFonts w:ascii="Times New Roman" w:hAnsi="Times New Roman"/>
+                <w:b w:val="0"/>
+                <w:sz w:val="24"/>
+              </w:rPr>
+              <w:t>Совместный отбор</w:t>
+            </w:r>
+          </w:p>
+        </w:tc>
+        <w:tc>
+          <w:tcPr>
+            <w:tcW w:type="dxa" w:w="5624"/>
+            <w:vAlign w:val="center"/>
+          </w:tcPr>
+          <w:p>
+            <w:pPr>
+              <w:keepNext w:val="0"/>
+              <w:spacing w:line="240" w:lineRule="auto" w:before="0" w:after="60"/>
+              <w:jc w:val="left"/>
+            </w:pPr>
+            <w:r>
+              <w:rPr>
+                <w:rFonts w:ascii="Times New Roman" w:hAnsi="Times New Roman"/>
+                <w:b w:val="0"/>
+                <w:sz w:val="24"/>
+              </w:rPr>
+              <w:t>Категория, цена и наличие применяются одновременно; равные ценовым границам значения включаются.</w:t>
+            </w:r>
+          </w:p>
+        </w:tc>
+      </w:tr>
+      <w:tr>
+        <w:trPr>
+          <w:cantSplit/>
+        </w:trPr>
+        <w:tc>
+          <w:tcPr>
+            <w:tcW w:type="dxa" w:w="1134"/>
+            <w:vAlign w:val="center"/>
+          </w:tcPr>
+          <w:p>
+            <w:pPr>
+              <w:keepNext w:val="0"/>
+              <w:spacing w:line="240" w:lineRule="auto" w:before="0" w:after="60"/>
+              <w:jc w:val="left"/>
+            </w:pPr>
+            <w:r>
+              <w:rPr>
+                <w:rFonts w:ascii="Times New Roman" w:hAnsi="Times New Roman"/>
+                <w:b/>
+                <w:sz w:val="24"/>
+              </w:rPr>
+              <w:t>ПР-9</w:t>
+            </w:r>
+          </w:p>
+        </w:tc>
+        <w:tc>
+          <w:tcPr>
+            <w:tcW w:type="dxa" w:w="2268"/>
+            <w:vAlign w:val="center"/>
+          </w:tcPr>
+          <w:p>
+            <w:pPr>
+              <w:keepNext w:val="0"/>
+              <w:spacing w:line="240" w:lineRule="auto" w:before="0" w:after="60"/>
+              <w:jc w:val="left"/>
+            </w:pPr>
+            <w:r>
+              <w:rPr>
+                <w:rFonts w:ascii="Times New Roman" w:hAnsi="Times New Roman"/>
+                <w:b w:val="0"/>
+                <w:sz w:val="24"/>
+              </w:rPr>
+              <w:t>Сортировка и страницы</w:t>
+            </w:r>
+          </w:p>
+        </w:tc>
+        <w:tc>
+          <w:tcPr>
+            <w:tcW w:type="dxa" w:w="5624"/>
+            <w:vAlign w:val="center"/>
+          </w:tcPr>
+          <w:p>
+            <w:pPr>
+              <w:keepNext w:val="0"/>
+              <w:spacing w:line="240" w:lineRule="auto" w:before="0" w:after="60"/>
+              <w:jc w:val="left"/>
+            </w:pPr>
+            <w:r>
+              <w:rPr>
+                <w:rFonts w:ascii="Times New Roman" w:hAnsi="Times New Roman"/>
+                <w:b w:val="0"/>
+                <w:sz w:val="24"/>
+              </w:rPr>
+              <w:t>Порядок соответствует выбору, равные значения не создают неоднозначность; при переходе сохраняются условия.</w:t>
+            </w:r>
+          </w:p>
+        </w:tc>
+      </w:tr>
+      <w:tr>
+        <w:trPr>
+          <w:cantSplit/>
+        </w:trPr>
+        <w:tc>
+          <w:tcPr>
+            <w:tcW w:type="dxa" w:w="1134"/>
+            <w:vAlign w:val="center"/>
+          </w:tcPr>
+          <w:p>
+            <w:pPr>
+              <w:keepNext w:val="0"/>
+              <w:spacing w:line="240" w:lineRule="auto" w:before="0" w:after="60"/>
+              <w:jc w:val="left"/>
+            </w:pPr>
+            <w:r>
+              <w:rPr>
+                <w:rFonts w:ascii="Times New Roman" w:hAnsi="Times New Roman"/>
+                <w:b/>
+                <w:sz w:val="24"/>
+              </w:rPr>
+              <w:t>ПР-10</w:t>
+            </w:r>
+          </w:p>
+        </w:tc>
+        <w:tc>
+          <w:tcPr>
+            <w:tcW w:type="dxa" w:w="2268"/>
+            <w:vAlign w:val="center"/>
+          </w:tcPr>
+          <w:p>
+            <w:pPr>
+              <w:keepNext w:val="0"/>
+              <w:spacing w:line="240" w:lineRule="auto" w:before="0" w:after="60"/>
+              <w:jc w:val="left"/>
+            </w:pPr>
+            <w:r>
+              <w:rPr>
+                <w:rFonts w:ascii="Times New Roman" w:hAnsi="Times New Roman"/>
+                <w:b w:val="0"/>
+                <w:sz w:val="24"/>
+              </w:rPr>
+              <w:t>Удаление</w:t>
+            </w:r>
+          </w:p>
+        </w:tc>
+        <w:tc>
+          <w:tcPr>
+            <w:tcW w:type="dxa" w:w="5624"/>
+            <w:vAlign w:val="center"/>
+          </w:tcPr>
+          <w:p>
+            <w:pPr>
+              <w:keepNext w:val="0"/>
+              <w:spacing w:line="240" w:lineRule="auto" w:before="0" w:after="60"/>
+              <w:jc w:val="left"/>
+            </w:pPr>
+            <w:r>
+              <w:rPr>
+                <w:rFonts w:ascii="Times New Roman" w:hAnsi="Times New Roman"/>
+                <w:b w:val="0"/>
+                <w:sz w:val="24"/>
+              </w:rPr>
+              <w:t>Отмена не изменяет каталог; подтверждение удаляет только выбранную запись.</w:t>
+            </w:r>
+          </w:p>
+        </w:tc>
+      </w:tr>
+      <w:tr>
+        <w:trPr>
+          <w:cantSplit/>
+        </w:trPr>
+        <w:tc>
+          <w:tcPr>
+            <w:tcW w:type="dxa" w:w="1134"/>
+            <w:vAlign w:val="center"/>
+          </w:tcPr>
+          <w:p>
+            <w:pPr>
+              <w:keepNext w:val="0"/>
+              <w:spacing w:line="240" w:lineRule="auto" w:before="0" w:after="60"/>
+              <w:jc w:val="left"/>
+            </w:pPr>
+            <w:r>
+              <w:rPr>
+                <w:rFonts w:ascii="Times New Roman" w:hAnsi="Times New Roman"/>
+                <w:b/>
+                <w:sz w:val="24"/>
+              </w:rPr>
+              <w:t>ПР-11</w:t>
+            </w:r>
+          </w:p>
+        </w:tc>
+        <w:tc>
+          <w:tcPr>
+            <w:tcW w:type="dxa" w:w="2268"/>
+            <w:vAlign w:val="center"/>
+          </w:tcPr>
+          <w:p>
+            <w:pPr>
+              <w:keepNext w:val="0"/>
+              <w:spacing w:line="240" w:lineRule="auto" w:before="0" w:after="60"/>
+              <w:jc w:val="left"/>
+            </w:pPr>
+            <w:r>
+              <w:rPr>
+                <w:rFonts w:ascii="Times New Roman" w:hAnsi="Times New Roman"/>
+                <w:b w:val="0"/>
+                <w:sz w:val="24"/>
+              </w:rPr>
+              <w:t>Повторный запуск</w:t>
+            </w:r>
+          </w:p>
+        </w:tc>
+        <w:tc>
+          <w:tcPr>
+            <w:tcW w:type="dxa" w:w="5624"/>
+            <w:vAlign w:val="center"/>
+          </w:tcPr>
+          <w:p>
+            <w:pPr>
+              <w:keepNext w:val="0"/>
+              <w:spacing w:line="240" w:lineRule="auto" w:before="0" w:after="60"/>
+              <w:jc w:val="left"/>
+            </w:pPr>
+            <w:r>
+              <w:rPr>
+                <w:rFonts w:ascii="Times New Roman" w:hAnsi="Times New Roman"/>
+                <w:b w:val="0"/>
+                <w:sz w:val="24"/>
+              </w:rPr>
+              <w:t>Сохранённые товары, категории и изменения остаются доступными.</w:t>
+            </w:r>
+          </w:p>
+        </w:tc>
+      </w:tr>
+      <w:tr>
+        <w:trPr>
+          <w:cantSplit/>
+        </w:trPr>
+        <w:tc>
+          <w:tcPr>
+            <w:tcW w:type="dxa" w:w="1134"/>
+            <w:vAlign w:val="center"/>
+          </w:tcPr>
+          <w:p>
+            <w:pPr>
+              <w:keepNext w:val="0"/>
+              <w:spacing w:line="240" w:lineRule="auto" w:before="0" w:after="60"/>
+              <w:jc w:val="left"/>
+            </w:pPr>
+            <w:r>
+              <w:rPr>
+                <w:rFonts w:ascii="Times New Roman" w:hAnsi="Times New Roman"/>
+                <w:b/>
+                <w:sz w:val="24"/>
+              </w:rPr>
+              <w:t>ПР-12</w:t>
+            </w:r>
+          </w:p>
+        </w:tc>
+        <w:tc>
+          <w:tcPr>
+            <w:tcW w:type="dxa" w:w="2268"/>
+            <w:vAlign w:val="center"/>
+          </w:tcPr>
+          <w:p>
+            <w:pPr>
+              <w:keepNext w:val="0"/>
+              <w:spacing w:line="240" w:lineRule="auto" w:before="0" w:after="60"/>
+              <w:jc w:val="left"/>
+            </w:pPr>
+            <w:r>
+              <w:rPr>
+                <w:rFonts w:ascii="Times New Roman" w:hAnsi="Times New Roman"/>
+                <w:b w:val="0"/>
+                <w:sz w:val="24"/>
+              </w:rPr>
+              <w:t>Объём каталога</w:t>
+            </w:r>
+          </w:p>
+        </w:tc>
+        <w:tc>
+          <w:tcPr>
+            <w:tcW w:type="dxa" w:w="5624"/>
+            <w:vAlign w:val="center"/>
+          </w:tcPr>
+          <w:p>
+            <w:pPr>
+              <w:keepNext w:val="0"/>
+              <w:spacing w:line="240" w:lineRule="auto" w:before="0" w:after="60"/>
+              <w:jc w:val="left"/>
+            </w:pPr>
+            <w:r>
+              <w:rPr>
+                <w:rFonts w:ascii="Times New Roman" w:hAnsi="Times New Roman"/>
+                <w:b w:val="0"/>
+                <w:sz w:val="24"/>
+              </w:rPr>
+              <w:t>На тестовом наборе не менее 1000 товаров проверяются число результатов, страницы и отбор.</w:t>
+            </w:r>
+          </w:p>
+        </w:tc>
+      </w:tr>
+      <w:tr>
+        <w:trPr>
+          <w:cantSplit/>
+        </w:trPr>
+        <w:tc>
+          <w:tcPr>
+            <w:tcW w:type="dxa" w:w="1134"/>
+            <w:vAlign w:val="center"/>
+          </w:tcPr>
+          <w:p>
+            <w:pPr>
+              <w:keepNext w:val="0"/>
+              <w:spacing w:line="240" w:lineRule="auto" w:before="0" w:after="60"/>
+              <w:jc w:val="left"/>
+            </w:pPr>
+            <w:r>
+              <w:rPr>
+                <w:rFonts w:ascii="Times New Roman" w:hAnsi="Times New Roman"/>
+                <w:b/>
+                <w:sz w:val="24"/>
+              </w:rPr>
+              <w:t>ПР-13</w:t>
+            </w:r>
+          </w:p>
+        </w:tc>
+        <w:tc>
+          <w:tcPr>
+            <w:tcW w:type="dxa" w:w="2268"/>
+            <w:vAlign w:val="center"/>
+          </w:tcPr>
+          <w:p>
+            <w:pPr>
+              <w:keepNext w:val="0"/>
+              <w:spacing w:line="240" w:lineRule="auto" w:before="0" w:after="60"/>
+              <w:jc w:val="left"/>
+            </w:pPr>
+            <w:r>
+              <w:rPr>
+                <w:rFonts w:ascii="Times New Roman" w:hAnsi="Times New Roman"/>
+                <w:b w:val="0"/>
+                <w:sz w:val="24"/>
+              </w:rPr>
+              <w:t>Браузерный интерфейс</w:t>
+            </w:r>
+          </w:p>
+        </w:tc>
+        <w:tc>
+          <w:tcPr>
+            <w:tcW w:type="dxa" w:w="5624"/>
+            <w:vAlign w:val="center"/>
+          </w:tcPr>
+          <w:p>
+            <w:pPr>
+              <w:keepNext w:val="0"/>
+              <w:spacing w:line="240" w:lineRule="auto" w:before="0" w:after="60"/>
+              <w:jc w:val="left"/>
+            </w:pPr>
+            <w:r>
+              <w:rPr>
+                <w:rFonts w:ascii="Times New Roman" w:hAnsi="Times New Roman"/>
+                <w:b w:val="0"/>
+                <w:sz w:val="24"/>
+              </w:rPr>
+              <w:t>Проверяются настольный и узкий экран, подписи, сообщения и основные формы без JavaScript.</w:t>
+            </w:r>
+          </w:p>
+        </w:tc>
+      </w:tr>
+      <w:tr>
+        <w:trPr>
+          <w:cantSplit/>
+        </w:trPr>
+        <w:tc>
+          <w:tcPr>
+            <w:tcW w:type="dxa" w:w="1134"/>
+            <w:vAlign w:val="center"/>
+          </w:tcPr>
+          <w:p>
+            <w:pPr>
+              <w:keepNext w:val="0"/>
+              <w:spacing w:line="240" w:lineRule="auto" w:before="0" w:after="60"/>
+              <w:jc w:val="left"/>
+            </w:pPr>
+            <w:r>
+              <w:rPr>
+                <w:rFonts w:ascii="Times New Roman" w:hAnsi="Times New Roman"/>
+                <w:b/>
+                <w:sz w:val="24"/>
+              </w:rPr>
+              <w:t>ПР-14</w:t>
+            </w:r>
+          </w:p>
+        </w:tc>
+        <w:tc>
+          <w:tcPr>
+            <w:tcW w:type="dxa" w:w="2268"/>
+            <w:vAlign w:val="center"/>
+          </w:tcPr>
+          <w:p>
+            <w:pPr>
+              <w:keepNext w:val="0"/>
+              <w:spacing w:line="240" w:lineRule="auto" w:before="0" w:after="60"/>
+              <w:jc w:val="left"/>
+            </w:pPr>
+            <w:r>
+              <w:rPr>
+                <w:rFonts w:ascii="Times New Roman" w:hAnsi="Times New Roman"/>
+                <w:b w:val="0"/>
+                <w:sz w:val="24"/>
+              </w:rPr>
+              <w:t>Полнота поставки</w:t>
+            </w:r>
+          </w:p>
+        </w:tc>
+        <w:tc>
+          <w:tcPr>
+            <w:tcW w:type="dxa" w:w="5624"/>
+            <w:vAlign w:val="center"/>
+          </w:tcPr>
+          <w:p>
+            <w:pPr>
+              <w:keepNext w:val="0"/>
+              <w:spacing w:line="240" w:lineRule="auto" w:before="0" w:after="60"/>
+              <w:jc w:val="left"/>
+            </w:pPr>
+            <w:r>
+              <w:rPr>
+                <w:rFonts w:ascii="Times New Roman" w:hAnsi="Times New Roman"/>
+                <w:b w:val="0"/>
+                <w:sz w:val="24"/>
+              </w:rPr>
+              <w:t>По инструкции можно установить зависимости, запустить модуль и выполнить проверки на тестовых данных.</w:t>
             </w:r>
           </w:p>
         </w:tc>

</xml_diff>